<commit_message>
Update both user guides for the rebrand and new features
Refreshed all screenshots (new tree logo, Irish Weekend Balingen
branding, new indent/link toolbar buttons, Zusatztext fields,
Impressum/Datenschutz section) and rewrote the affected sections and
use cases in both the admin guide and the registration-page guide.

Co-Authored-By: Claude Sonnet 5 <noreply@anthropic.com>
</commit_message>
<xml_diff>
--- a/docs/Anleitung-Admin.docx
+++ b/docs/Anleitung-Admin.docx
@@ -13,7 +13,7 @@
           <w:bCs/>
           <w:color w:val="7E2F28"/>
         </w:rPr>
-        <w:t>Anleitung: Admintool Set Dance Balingen</w:t>
+        <w:t>Anleitung: Admintool Irish Weekend Balingen</w:t>
       </w:r>
     </w:p>
     <w:p>
@@ -24,13 +24,13 @@
         <w:rPr>
           <w:color w:val="6B5C52"/>
         </w:rPr>
-        <w:t>Diese Anleitung beschreibt den Admin-Bereich der Webseite (admin.html): den Zugriff über zwei unterschiedliche Passwörter, den reinen Anzeige-Modus sowie den Bearbeiten-Modus mit allen Möglichkeiten zum Ändern der Inhalte, des Logos, der Optionen und der A</w:t>
+        <w:t>Diese Anleitung beschreibt den Admin-Bereich der Webseite (admin.html): den Zugriff über zwei unterschiedliche Passwörter, den reinen Anzeige-Modus sowie den Bearbeiten-Modus mit allen Möglichkeiten zum Ändern der Inhalte, des Logos, der Optionen, der Zusa</w:t>
       </w:r>
       <w:r>
         <w:rPr>
           <w:color w:val="6B5C52"/>
         </w:rPr>
-        <w:t>nmeldungen.</w:t>
+        <w:t>tztexte, der rechtlichen Seiten (Impressum/Datenschutz) und der Anmeldungen.</w:t>
       </w:r>
     </w:p>
     <w:p>
@@ -51,7 +51,7 @@
     <w:sdt>
       <w:sdtPr>
         <w:alias w:val="Inhaltsverzeichnis"/>
-        <w:id w:val="-920871566"/>
+        <w:id w:val="-1696838726"/>
       </w:sdtPr>
       <w:sdtEndPr/>
       <w:sdtContent>
@@ -75,7 +75,7 @@
           <w:r>
             <w:fldChar w:fldCharType="separate"/>
           </w:r>
-          <w:hyperlink w:anchor="_Toc240284009" w:history="1">
+          <w:hyperlink w:anchor="_Toc240357585" w:history="1">
             <w:r>
               <w:rPr>
                 <w:rStyle w:val="Hyperlink"/>
@@ -101,7 +101,7 @@
               <w:rPr>
                 <w:noProof/>
               </w:rPr>
-              <w:instrText xml:space="preserve"> PAGEREF _Toc240284009 \h </w:instrText>
+              <w:instrText xml:space="preserve"> PAGEREF _Toc240357585 \h </w:instrText>
             </w:r>
             <w:r>
               <w:rPr>
@@ -139,7 +139,7 @@
               <w:noProof/>
             </w:rPr>
           </w:pPr>
-          <w:hyperlink w:anchor="_Toc240284010" w:history="1">
+          <w:hyperlink w:anchor="_Toc240357586" w:history="1">
             <w:r>
               <w:rPr>
                 <w:rStyle w:val="Hyperlink"/>
@@ -165,7 +165,7 @@
               <w:rPr>
                 <w:noProof/>
               </w:rPr>
-              <w:instrText xml:space="preserve"> PAGEREF _Toc240284010 \h </w:instrText>
+              <w:instrText xml:space="preserve"> PAGEREF _Toc240357586 \h </w:instrText>
             </w:r>
             <w:r>
               <w:rPr>
@@ -203,7 +203,7 @@
               <w:noProof/>
             </w:rPr>
           </w:pPr>
-          <w:hyperlink w:anchor="_Toc240284011" w:history="1">
+          <w:hyperlink w:anchor="_Toc240357587" w:history="1">
             <w:r>
               <w:rPr>
                 <w:rStyle w:val="Hyperlink"/>
@@ -229,7 +229,7 @@
               <w:rPr>
                 <w:noProof/>
               </w:rPr>
-              <w:instrText xml:space="preserve"> PAGEREF _Toc240284011 \h </w:instrText>
+              <w:instrText xml:space="preserve"> PAGEREF _Toc240357587 \h </w:instrText>
             </w:r>
             <w:r>
               <w:rPr>
@@ -267,7 +267,7 @@
               <w:noProof/>
             </w:rPr>
           </w:pPr>
-          <w:hyperlink w:anchor="_Toc240284012" w:history="1">
+          <w:hyperlink w:anchor="_Toc240357588" w:history="1">
             <w:r>
               <w:rPr>
                 <w:rStyle w:val="Hyperlink"/>
@@ -293,7 +293,7 @@
               <w:rPr>
                 <w:noProof/>
               </w:rPr>
-              <w:instrText xml:space="preserve"> PAGEREF _Toc240284012 \h </w:instrText>
+              <w:instrText xml:space="preserve"> PAGEREF _Toc240357588 \h </w:instrText>
             </w:r>
             <w:r>
               <w:rPr>
@@ -331,7 +331,7 @@
               <w:noProof/>
             </w:rPr>
           </w:pPr>
-          <w:hyperlink w:anchor="_Toc240284013" w:history="1">
+          <w:hyperlink w:anchor="_Toc240357589" w:history="1">
             <w:r>
               <w:rPr>
                 <w:rStyle w:val="Hyperlink"/>
@@ -357,7 +357,7 @@
               <w:rPr>
                 <w:noProof/>
               </w:rPr>
-              <w:instrText xml:space="preserve"> PAGEREF _Toc240284013 \h </w:instrText>
+              <w:instrText xml:space="preserve"> PAGEREF _Toc240357589 \h </w:instrText>
             </w:r>
             <w:r>
               <w:rPr>
@@ -395,7 +395,7 @@
               <w:noProof/>
             </w:rPr>
           </w:pPr>
-          <w:hyperlink w:anchor="_Toc240284014" w:history="1">
+          <w:hyperlink w:anchor="_Toc240357590" w:history="1">
             <w:r>
               <w:rPr>
                 <w:rStyle w:val="Hyperlink"/>
@@ -421,7 +421,7 @@
               <w:rPr>
                 <w:noProof/>
               </w:rPr>
-              <w:instrText xml:space="preserve"> PAGEREF _Toc240284014 \h </w:instrText>
+              <w:instrText xml:space="preserve"> PAGEREF _Toc240357590 \h </w:instrText>
             </w:r>
             <w:r>
               <w:rPr>
@@ -459,7 +459,7 @@
               <w:noProof/>
             </w:rPr>
           </w:pPr>
-          <w:hyperlink w:anchor="_Toc240284015" w:history="1">
+          <w:hyperlink w:anchor="_Toc240357591" w:history="1">
             <w:r>
               <w:rPr>
                 <w:rStyle w:val="Hyperlink"/>
@@ -467,7 +467,7 @@
                 <w:bCs/>
                 <w:noProof/>
               </w:rPr>
-              <w:t>5. Bearbeiten-Modus: Kontaktdaten, Konfiguration und Optionen</w:t>
+              <w:t>5. Die Formatierungsleiste im Detail</w:t>
             </w:r>
             <w:r>
               <w:rPr>
@@ -485,7 +485,7 @@
               <w:rPr>
                 <w:noProof/>
               </w:rPr>
-              <w:instrText xml:space="preserve"> PAGEREF _Toc240284015 \h </w:instrText>
+              <w:instrText xml:space="preserve"> PAGEREF _Toc240357591 \h </w:instrText>
             </w:r>
             <w:r>
               <w:rPr>
@@ -523,7 +523,7 @@
               <w:noProof/>
             </w:rPr>
           </w:pPr>
-          <w:hyperlink w:anchor="_Toc240284016" w:history="1">
+          <w:hyperlink w:anchor="_Toc240357592" w:history="1">
             <w:r>
               <w:rPr>
                 <w:rStyle w:val="Hyperlink"/>
@@ -531,7 +531,7 @@
                 <w:bCs/>
                 <w:noProof/>
               </w:rPr>
-              <w:t>6. Bearbeiten-Modus: Speichern und Passwörter ändern</w:t>
+              <w:t>6. Bearbeiten-Modus: Kontaktdaten, Konfiguration und Optionen</w:t>
             </w:r>
             <w:r>
               <w:rPr>
@@ -549,7 +549,7 @@
               <w:rPr>
                 <w:noProof/>
               </w:rPr>
-              <w:instrText xml:space="preserve"> PAGEREF _Toc240284016 \h </w:instrText>
+              <w:instrText xml:space="preserve"> PAGEREF _Toc240357592 \h </w:instrText>
             </w:r>
             <w:r>
               <w:rPr>
@@ -587,7 +587,7 @@
               <w:noProof/>
             </w:rPr>
           </w:pPr>
-          <w:hyperlink w:anchor="_Toc240284017" w:history="1">
+          <w:hyperlink w:anchor="_Toc240357593" w:history="1">
             <w:r>
               <w:rPr>
                 <w:rStyle w:val="Hyperlink"/>
@@ -595,7 +595,7 @@
                 <w:bCs/>
                 <w:noProof/>
               </w:rPr>
-              <w:t>7. Bearbeiten-Modus: Anmeldungen verwalten</w:t>
+              <w:t>7. Bearbeiten-Modus: Zusatztexte und Rechtliches</w:t>
             </w:r>
             <w:r>
               <w:rPr>
@@ -613,7 +613,7 @@
               <w:rPr>
                 <w:noProof/>
               </w:rPr>
-              <w:instrText xml:space="preserve"> PAGEREF _Toc240284017 \h </w:instrText>
+              <w:instrText xml:space="preserve"> PAGEREF _Toc240357593 \h </w:instrText>
             </w:r>
             <w:r>
               <w:rPr>
@@ -651,7 +651,7 @@
               <w:noProof/>
             </w:rPr>
           </w:pPr>
-          <w:hyperlink w:anchor="_Toc240284018" w:history="1">
+          <w:hyperlink w:anchor="_Toc240357594" w:history="1">
             <w:r>
               <w:rPr>
                 <w:rStyle w:val="Hyperlink"/>
@@ -659,7 +659,7 @@
                 <w:bCs/>
                 <w:noProof/>
               </w:rPr>
-              <w:t>8. Use Cases Schritt für Schritt</w:t>
+              <w:t>8. Bearbeiten-Modus: Datenschutz speichern und Passwörter ändern</w:t>
             </w:r>
             <w:r>
               <w:rPr>
@@ -677,7 +677,7 @@
               <w:rPr>
                 <w:noProof/>
               </w:rPr>
-              <w:instrText xml:space="preserve"> PAGEREF _Toc240284018 \h </w:instrText>
+              <w:instrText xml:space="preserve"> PAGEREF _Toc240357594 \h </w:instrText>
             </w:r>
             <w:r>
               <w:rPr>
@@ -695,6 +695,134 @@
                 <w:noProof/>
               </w:rPr>
               <w:t>9</w:t>
+            </w:r>
+            <w:r>
+              <w:rPr>
+                <w:noProof/>
+              </w:rPr>
+              <w:fldChar w:fldCharType="end"/>
+            </w:r>
+          </w:hyperlink>
+        </w:p>
+        <w:p>
+          <w:pPr>
+            <w:pStyle w:val="Verzeichnis1"/>
+            <w:tabs>
+              <w:tab w:val="right" w:leader="dot" w:pos="9016"/>
+            </w:tabs>
+            <w:rPr>
+              <w:rFonts w:asciiTheme="minorHAnsi" w:eastAsiaTheme="minorEastAsia" w:hAnsiTheme="minorHAnsi" w:cstheme="minorBidi"/>
+              <w:noProof/>
+            </w:rPr>
+          </w:pPr>
+          <w:hyperlink w:anchor="_Toc240357595" w:history="1">
+            <w:r>
+              <w:rPr>
+                <w:rStyle w:val="Hyperlink"/>
+                <w:b/>
+                <w:bCs/>
+                <w:noProof/>
+              </w:rPr>
+              <w:t>9. Bearbeiten-Modus: Anmeldungen verwalten</w:t>
+            </w:r>
+            <w:r>
+              <w:rPr>
+                <w:noProof/>
+              </w:rPr>
+              <w:tab/>
+            </w:r>
+            <w:r>
+              <w:rPr>
+                <w:noProof/>
+              </w:rPr>
+              <w:fldChar w:fldCharType="begin"/>
+            </w:r>
+            <w:r>
+              <w:rPr>
+                <w:noProof/>
+              </w:rPr>
+              <w:instrText xml:space="preserve"> PAGEREF _Toc240357595 \h </w:instrText>
+            </w:r>
+            <w:r>
+              <w:rPr>
+                <w:noProof/>
+              </w:rPr>
+            </w:r>
+            <w:r>
+              <w:rPr>
+                <w:noProof/>
+              </w:rPr>
+              <w:fldChar w:fldCharType="separate"/>
+            </w:r>
+            <w:r>
+              <w:rPr>
+                <w:noProof/>
+              </w:rPr>
+              <w:t>10</w:t>
+            </w:r>
+            <w:r>
+              <w:rPr>
+                <w:noProof/>
+              </w:rPr>
+              <w:fldChar w:fldCharType="end"/>
+            </w:r>
+          </w:hyperlink>
+        </w:p>
+        <w:p>
+          <w:pPr>
+            <w:pStyle w:val="Verzeichnis1"/>
+            <w:tabs>
+              <w:tab w:val="right" w:leader="dot" w:pos="9016"/>
+            </w:tabs>
+            <w:rPr>
+              <w:rFonts w:asciiTheme="minorHAnsi" w:eastAsiaTheme="minorEastAsia" w:hAnsiTheme="minorHAnsi" w:cstheme="minorBidi"/>
+              <w:noProof/>
+            </w:rPr>
+          </w:pPr>
+          <w:hyperlink w:anchor="_Toc240357596" w:history="1">
+            <w:r>
+              <w:rPr>
+                <w:rStyle w:val="Hyperlink"/>
+                <w:b/>
+                <w:bCs/>
+                <w:noProof/>
+              </w:rPr>
+              <w:t>10. Use Cases Schritt für Schritt</w:t>
+            </w:r>
+            <w:r>
+              <w:rPr>
+                <w:noProof/>
+              </w:rPr>
+              <w:tab/>
+            </w:r>
+            <w:r>
+              <w:rPr>
+                <w:noProof/>
+              </w:rPr>
+              <w:fldChar w:fldCharType="begin"/>
+            </w:r>
+            <w:r>
+              <w:rPr>
+                <w:noProof/>
+              </w:rPr>
+              <w:instrText xml:space="preserve"> PAGEREF _Toc240357596 \h </w:instrText>
+            </w:r>
+            <w:r>
+              <w:rPr>
+                <w:noProof/>
+              </w:rPr>
+            </w:r>
+            <w:r>
+              <w:rPr>
+                <w:noProof/>
+              </w:rPr>
+              <w:fldChar w:fldCharType="separate"/>
+            </w:r>
+            <w:r>
+              <w:rPr>
+                <w:noProof/>
+              </w:rPr>
+              <w:t>10</w:t>
             </w:r>
             <w:r>
               <w:rPr>
@@ -715,7 +843,7 @@
               <w:noProof/>
             </w:rPr>
           </w:pPr>
-          <w:hyperlink w:anchor="_Toc240284019" w:history="1">
+          <w:hyperlink w:anchor="_Toc240357597" w:history="1">
             <w:r>
               <w:rPr>
                 <w:rStyle w:val="Hyperlink"/>
@@ -723,7 +851,7 @@
                 <w:bCs/>
                 <w:noProof/>
               </w:rPr>
-              <w:t>8.1 Use Case: Nur Anmeldungen und Inhalte ansehen</w:t>
+              <w:t>10.1 Use Case: Nur Anmeldungen und Inhalte ansehen</w:t>
             </w:r>
             <w:r>
               <w:rPr>
@@ -741,7 +869,7 @@
               <w:rPr>
                 <w:noProof/>
               </w:rPr>
-              <w:instrText xml:space="preserve"> PAGEREF _Toc240284019 \h </w:instrText>
+              <w:instrText xml:space="preserve"> PAGEREF _Toc240357597 \h </w:instrText>
             </w:r>
             <w:r>
               <w:rPr>
@@ -758,7 +886,7 @@
               <w:rPr>
                 <w:noProof/>
               </w:rPr>
-              <w:t>9</w:t>
+              <w:t>10</w:t>
             </w:r>
             <w:r>
               <w:rPr>
@@ -779,7 +907,7 @@
               <w:noProof/>
             </w:rPr>
           </w:pPr>
-          <w:hyperlink w:anchor="_Toc240284020" w:history="1">
+          <w:hyperlink w:anchor="_Toc240357598" w:history="1">
             <w:r>
               <w:rPr>
                 <w:rStyle w:val="Hyperlink"/>
@@ -787,7 +915,7 @@
                 <w:bCs/>
                 <w:noProof/>
               </w:rPr>
-              <w:t>8.2 Use Case: Inhaltstext ändern</w:t>
+              <w:t>10.2 Use Case: Inhaltstext ändern und verschachtelte Liste einrücken</w:t>
             </w:r>
             <w:r>
               <w:rPr>
@@ -805,7 +933,7 @@
               <w:rPr>
                 <w:noProof/>
               </w:rPr>
-              <w:instrText xml:space="preserve"> PAGEREF _Toc240284020 \h </w:instrText>
+              <w:instrText xml:space="preserve"> PAGEREF _Toc240357598 \h </w:instrText>
             </w:r>
             <w:r>
               <w:rPr>
@@ -822,7 +950,7 @@
               <w:rPr>
                 <w:noProof/>
               </w:rPr>
-              <w:t>9</w:t>
+              <w:t>11</w:t>
             </w:r>
             <w:r>
               <w:rPr>
@@ -843,7 +971,7 @@
               <w:noProof/>
             </w:rPr>
           </w:pPr>
-          <w:hyperlink w:anchor="_Toc240284021" w:history="1">
+          <w:hyperlink w:anchor="_Toc240357599" w:history="1">
             <w:r>
               <w:rPr>
                 <w:rStyle w:val="Hyperlink"/>
@@ -851,7 +979,7 @@
                 <w:bCs/>
                 <w:noProof/>
               </w:rPr>
-              <w:t>8.3 Use Case: Logo austauschen</w:t>
+              <w:t>10.3 Use Case: Link oder Google-Maps-Adresse einfügen</w:t>
             </w:r>
             <w:r>
               <w:rPr>
@@ -869,7 +997,7 @@
               <w:rPr>
                 <w:noProof/>
               </w:rPr>
-              <w:instrText xml:space="preserve"> PAGEREF _Toc240284021 \h </w:instrText>
+              <w:instrText xml:space="preserve"> PAGEREF _Toc240357599 \h </w:instrText>
             </w:r>
             <w:r>
               <w:rPr>
@@ -886,7 +1014,7 @@
               <w:rPr>
                 <w:noProof/>
               </w:rPr>
-              <w:t>9</w:t>
+              <w:t>11</w:t>
             </w:r>
             <w:r>
               <w:rPr>
@@ -907,7 +1035,7 @@
               <w:noProof/>
             </w:rPr>
           </w:pPr>
-          <w:hyperlink w:anchor="_Toc240284022" w:history="1">
+          <w:hyperlink w:anchor="_Toc240357600" w:history="1">
             <w:r>
               <w:rPr>
                 <w:rStyle w:val="Hyperlink"/>
@@ -915,7 +1043,7 @@
                 <w:bCs/>
                 <w:noProof/>
               </w:rPr>
-              <w:t>8.4 Use Case: Neue Option (Programmpunkt) hinzufügen</w:t>
+              <w:t>10.4 Use Case: Logo austauschen</w:t>
             </w:r>
             <w:r>
               <w:rPr>
@@ -933,7 +1061,7 @@
               <w:rPr>
                 <w:noProof/>
               </w:rPr>
-              <w:instrText xml:space="preserve"> PAGEREF _Toc240284022 \h </w:instrText>
+              <w:instrText xml:space="preserve"> PAGEREF _Toc240357600 \h </w:instrText>
             </w:r>
             <w:r>
               <w:rPr>
@@ -950,7 +1078,7 @@
               <w:rPr>
                 <w:noProof/>
               </w:rPr>
-              <w:t>9</w:t>
+              <w:t>11</w:t>
             </w:r>
             <w:r>
               <w:rPr>
@@ -971,7 +1099,7 @@
               <w:noProof/>
             </w:rPr>
           </w:pPr>
-          <w:hyperlink w:anchor="_Toc240284023" w:history="1">
+          <w:hyperlink w:anchor="_Toc240357601" w:history="1">
             <w:r>
               <w:rPr>
                 <w:rStyle w:val="Hyperlink"/>
@@ -979,7 +1107,7 @@
                 <w:bCs/>
                 <w:noProof/>
               </w:rPr>
-              <w:t>8.5 Use Case: Passwörter ändern</w:t>
+              <w:t>10.5 Use Case: Neue Option (Programmpunkt) hinzufügen</w:t>
             </w:r>
             <w:r>
               <w:rPr>
@@ -997,7 +1125,7 @@
               <w:rPr>
                 <w:noProof/>
               </w:rPr>
-              <w:instrText xml:space="preserve"> PAGEREF _Toc240284023 \h </w:instrText>
+              <w:instrText xml:space="preserve"> PAGEREF _Toc240357601 \h </w:instrText>
             </w:r>
             <w:r>
               <w:rPr>
@@ -1014,7 +1142,7 @@
               <w:rPr>
                 <w:noProof/>
               </w:rPr>
-              <w:t>9</w:t>
+              <w:t>11</w:t>
             </w:r>
             <w:r>
               <w:rPr>
@@ -1035,7 +1163,7 @@
               <w:noProof/>
             </w:rPr>
           </w:pPr>
-          <w:hyperlink w:anchor="_Toc240284024" w:history="1">
+          <w:hyperlink w:anchor="_Toc240357602" w:history="1">
             <w:r>
               <w:rPr>
                 <w:rStyle w:val="Hyperlink"/>
@@ -1043,7 +1171,7 @@
                 <w:bCs/>
                 <w:noProof/>
               </w:rPr>
-              <w:t>8.6 Use Case: Eine Anmeldung bearbeiten oder löschen</w:t>
+              <w:t>10.6 Use Case: Impressum oder Datenschutz aktualisieren</w:t>
             </w:r>
             <w:r>
               <w:rPr>
@@ -1061,7 +1189,7 @@
               <w:rPr>
                 <w:noProof/>
               </w:rPr>
-              <w:instrText xml:space="preserve"> PAGEREF _Toc240284024 \h </w:instrText>
+              <w:instrText xml:space="preserve"> PAGEREF _Toc240357602 \h </w:instrText>
             </w:r>
             <w:r>
               <w:rPr>
@@ -1078,7 +1206,135 @@
               <w:rPr>
                 <w:noProof/>
               </w:rPr>
-              <w:t>10</w:t>
+              <w:t>12</w:t>
+            </w:r>
+            <w:r>
+              <w:rPr>
+                <w:noProof/>
+              </w:rPr>
+              <w:fldChar w:fldCharType="end"/>
+            </w:r>
+          </w:hyperlink>
+        </w:p>
+        <w:p>
+          <w:pPr>
+            <w:pStyle w:val="Verzeichnis2"/>
+            <w:tabs>
+              <w:tab w:val="right" w:leader="dot" w:pos="9016"/>
+            </w:tabs>
+            <w:rPr>
+              <w:rFonts w:asciiTheme="minorHAnsi" w:eastAsiaTheme="minorEastAsia" w:hAnsiTheme="minorHAnsi" w:cstheme="minorBidi"/>
+              <w:noProof/>
+            </w:rPr>
+          </w:pPr>
+          <w:hyperlink w:anchor="_Toc240357603" w:history="1">
+            <w:r>
+              <w:rPr>
+                <w:rStyle w:val="Hyperlink"/>
+                <w:b/>
+                <w:bCs/>
+                <w:noProof/>
+              </w:rPr>
+              <w:t>10.7 Use Case: Passwörter ändern</w:t>
+            </w:r>
+            <w:r>
+              <w:rPr>
+                <w:noProof/>
+              </w:rPr>
+              <w:tab/>
+            </w:r>
+            <w:r>
+              <w:rPr>
+                <w:noProof/>
+              </w:rPr>
+              <w:fldChar w:fldCharType="begin"/>
+            </w:r>
+            <w:r>
+              <w:rPr>
+                <w:noProof/>
+              </w:rPr>
+              <w:instrText xml:space="preserve"> PAGEREF _Toc240357603 \h </w:instrText>
+            </w:r>
+            <w:r>
+              <w:rPr>
+                <w:noProof/>
+              </w:rPr>
+            </w:r>
+            <w:r>
+              <w:rPr>
+                <w:noProof/>
+              </w:rPr>
+              <w:fldChar w:fldCharType="separate"/>
+            </w:r>
+            <w:r>
+              <w:rPr>
+                <w:noProof/>
+              </w:rPr>
+              <w:t>12</w:t>
+            </w:r>
+            <w:r>
+              <w:rPr>
+                <w:noProof/>
+              </w:rPr>
+              <w:fldChar w:fldCharType="end"/>
+            </w:r>
+          </w:hyperlink>
+        </w:p>
+        <w:p>
+          <w:pPr>
+            <w:pStyle w:val="Verzeichnis2"/>
+            <w:tabs>
+              <w:tab w:val="right" w:leader="dot" w:pos="9016"/>
+            </w:tabs>
+            <w:rPr>
+              <w:rFonts w:asciiTheme="minorHAnsi" w:eastAsiaTheme="minorEastAsia" w:hAnsiTheme="minorHAnsi" w:cstheme="minorBidi"/>
+              <w:noProof/>
+            </w:rPr>
+          </w:pPr>
+          <w:hyperlink w:anchor="_Toc240357604" w:history="1">
+            <w:r>
+              <w:rPr>
+                <w:rStyle w:val="Hyperlink"/>
+                <w:b/>
+                <w:bCs/>
+                <w:noProof/>
+              </w:rPr>
+              <w:t>10.8 Use Case: Eine Anmeldung bearbeiten oder löschen</w:t>
+            </w:r>
+            <w:r>
+              <w:rPr>
+                <w:noProof/>
+              </w:rPr>
+              <w:tab/>
+            </w:r>
+            <w:r>
+              <w:rPr>
+                <w:noProof/>
+              </w:rPr>
+              <w:fldChar w:fldCharType="begin"/>
+            </w:r>
+            <w:r>
+              <w:rPr>
+                <w:noProof/>
+              </w:rPr>
+              <w:instrText xml:space="preserve"> PAGEREF _Toc240357604 \h </w:instrText>
+            </w:r>
+            <w:r>
+              <w:rPr>
+                <w:noProof/>
+              </w:rPr>
+            </w:r>
+            <w:r>
+              <w:rPr>
+                <w:noProof/>
+              </w:rPr>
+              <w:fldChar w:fldCharType="separate"/>
+            </w:r>
+            <w:r>
+              <w:rPr>
+                <w:noProof/>
+              </w:rPr>
+              <w:t>12</w:t>
             </w:r>
             <w:r>
               <w:rPr>
@@ -1099,7 +1355,7 @@
               <w:noProof/>
             </w:rPr>
           </w:pPr>
-          <w:hyperlink w:anchor="_Toc240284025" w:history="1">
+          <w:hyperlink w:anchor="_Toc240357605" w:history="1">
             <w:r>
               <w:rPr>
                 <w:rStyle w:val="Hyperlink"/>
@@ -1107,7 +1363,7 @@
                 <w:bCs/>
                 <w:noProof/>
               </w:rPr>
-              <w:t>9. Kurz zusammengefasst</w:t>
+              <w:t>11. Kurz zusammengefasst</w:t>
             </w:r>
             <w:r>
               <w:rPr>
@@ -1125,7 +1381,7 @@
               <w:rPr>
                 <w:noProof/>
               </w:rPr>
-              <w:instrText xml:space="preserve"> PAGEREF _Toc240284025 \h </w:instrText>
+              <w:instrText xml:space="preserve"> PAGEREF _Toc240357605 \h </w:instrText>
             </w:r>
             <w:r>
               <w:rPr>
@@ -1142,7 +1398,7 @@
               <w:rPr>
                 <w:noProof/>
               </w:rPr>
-              <w:t>10</w:t>
+              <w:t>12</w:t>
             </w:r>
             <w:r>
               <w:rPr>
@@ -1171,7 +1427,7 @@
         <w:keepLines/>
         <w:spacing w:before="300" w:after="150"/>
       </w:pPr>
-      <w:bookmarkStart w:id="0" w:name="_Toc240284009"/>
+      <w:bookmarkStart w:id="0" w:name="_Toc240357585"/>
       <w:r>
         <w:rPr>
           <w:b/>
@@ -1189,7 +1445,10 @@
         <w:spacing w:after="160"/>
       </w:pPr>
       <w:r>
-        <w:t>Der Admin-Bereich ist über die Adresse admin.html erreichbar und durch ein Passwort geschützt. Es gibt zwei unterschiedliche Passwörter mit unterschiedlichen Rechten:</w:t>
+        <w:t>Der Admin-Bereich ist über die Adresse admin.html erreichbar und durch ein Passwort geschützt. Es gibt</w:t>
+      </w:r>
+      <w:r>
+        <w:t xml:space="preserve"> zwei unterschiedliche Passwörter mit unterschiedlichen Rechten:</w:t>
       </w:r>
     </w:p>
     <w:p>
@@ -1219,10 +1478,10 @@
         <w:t xml:space="preserve">•  Bearbeiten-Passwort: </w:t>
       </w:r>
       <w:r>
-        <w:t xml:space="preserve">Zeigt zusätzlich alle Bearbeitungsmöglichkeiten: Inhalte, Logo und Optionen </w:t>
-      </w:r>
-      <w:r>
-        <w:t>ändern und speichern, Anmeldungen bearbeiten oder löschen, sowie beide Passwörter ändern.</w:t>
+        <w:t>Zeigt zusät</w:t>
+      </w:r>
+      <w:r>
+        <w:t>zlich alle Bearbeitungsmöglichkeiten: Inhalte, Logo, Optionen, Zusatztexte und rechtliche Seiten ändern und speichern, Anmeldungen bearbeiten oder löschen, sowie beide Passwörter ändern.</w:t>
       </w:r>
     </w:p>
     <w:p>
@@ -1230,7 +1489,10 @@
         <w:spacing w:after="160"/>
       </w:pPr>
       <w:r>
-        <w:t>Beide Passwörter können jederzeit im Bearbeiten-Modus geändert werden (siehe Abschnitt 6).</w:t>
+        <w:t>Beide Passwörter können jederzeit im Bearbeiten-Modus geändert werden</w:t>
+      </w:r>
+      <w:r>
+        <w:t xml:space="preserve"> (siehe Abschnitt 6).</w:t>
       </w:r>
     </w:p>
     <w:p>
@@ -1240,7 +1502,7 @@
         <w:keepLines/>
         <w:spacing w:before="300" w:after="150"/>
       </w:pPr>
-      <w:bookmarkStart w:id="1" w:name="_Toc240284010"/>
+      <w:bookmarkStart w:id="1" w:name="_Toc240357586"/>
       <w:r>
         <w:rPr>
           <w:b/>
@@ -1257,10 +1519,7 @@
         <w:spacing w:after="160"/>
       </w:pPr>
       <w:r>
-        <w:t xml:space="preserve">Beim Aufruf von admin.html erscheint zunächst </w:t>
-      </w:r>
-      <w:r>
-        <w:t>der Sperrbildschirm mit der Passwortabfrage.</w:t>
+        <w:t>Beim Aufruf von admin.html erscheint zunächst der Sperrbildschirm mit der Passwortabfrage.</w:t>
       </w:r>
     </w:p>
     <w:p>
@@ -1273,7 +1532,7 @@
           <w:noProof/>
         </w:rPr>
         <w:drawing>
-          <wp:inline distT="0" distB="0" distL="0" distR="0" wp14:anchorId="19E281EA" wp14:editId="219EA981">
+          <wp:inline distT="0" distB="0" distL="0" distR="0" wp14:anchorId="28571CDC" wp14:editId="30FADE71">
             <wp:extent cx="4381500" cy="3981450"/>
             <wp:effectExtent l="0" t="0" r="0" b="0"/>
             <wp:docPr id="1" name="Grafik 1"/>
@@ -1564,7 +1823,7 @@
         <w:keepLines/>
         <w:spacing w:before="300" w:after="150"/>
       </w:pPr>
-      <w:bookmarkStart w:id="2" w:name="_Toc240284011"/>
+      <w:bookmarkStart w:id="2" w:name="_Toc240357587"/>
       <w:r>
         <w:rPr>
           <w:b/>
@@ -1595,7 +1854,7 @@
         <w:keepLines/>
         <w:spacing w:before="240" w:after="120"/>
       </w:pPr>
-      <w:bookmarkStart w:id="3" w:name="_Toc240284012"/>
+      <w:bookmarkStart w:id="3" w:name="_Toc240357588"/>
       <w:r>
         <w:rPr>
           <w:b/>
@@ -1616,7 +1875,7 @@
           <w:noProof/>
         </w:rPr>
         <w:drawing>
-          <wp:inline distT="0" distB="0" distL="0" distR="0" wp14:anchorId="5ED975E1" wp14:editId="578C2588">
+          <wp:inline distT="0" distB="0" distL="0" distR="0" wp14:anchorId="23346992" wp14:editId="2CC2DBAF">
             <wp:extent cx="4381500" cy="3981450"/>
             <wp:effectExtent l="0" t="0" r="0" b="0"/>
             <wp:docPr id="2" name="Grafik 2"/>
@@ -2123,7 +2382,7 @@
         <w:keepLines/>
         <w:spacing w:before="240" w:after="120"/>
       </w:pPr>
-      <w:bookmarkStart w:id="4" w:name="_Toc240284013"/>
+      <w:bookmarkStart w:id="4" w:name="_Toc240357589"/>
       <w:r>
         <w:rPr>
           <w:b/>
@@ -2157,7 +2416,7 @@
           <w:noProof/>
         </w:rPr>
         <w:drawing>
-          <wp:inline distT="0" distB="0" distL="0" distR="0" wp14:anchorId="3688C8B8" wp14:editId="38890D6A">
+          <wp:inline distT="0" distB="0" distL="0" distR="0" wp14:anchorId="4A7293A7" wp14:editId="289747A9">
             <wp:extent cx="4381500" cy="3981450"/>
             <wp:effectExtent l="0" t="0" r="0" b="0"/>
             <wp:docPr id="3" name="Grafik 3"/>
@@ -2600,7 +2859,7 @@
         <w:keepLines/>
         <w:spacing w:before="300" w:after="150"/>
       </w:pPr>
-      <w:bookmarkStart w:id="5" w:name="_Toc240284014"/>
+      <w:bookmarkStart w:id="5" w:name="_Toc240357590"/>
       <w:r>
         <w:rPr>
           <w:b/>
@@ -2631,7 +2890,7 @@
           <w:noProof/>
         </w:rPr>
         <w:drawing>
-          <wp:inline distT="0" distB="0" distL="0" distR="0" wp14:anchorId="7CD47BCA" wp14:editId="7E9DDDE1">
+          <wp:inline distT="0" distB="0" distL="0" distR="0" wp14:anchorId="4EA4D7A4" wp14:editId="24F17FBA">
             <wp:extent cx="4381500" cy="3981450"/>
             <wp:effectExtent l="0" t="0" r="0" b="0"/>
             <wp:docPr id="4" name="Grafik 4"/>
@@ -2840,7 +3099,7 @@
               <w:t>Zeigt das aktuell aktive Logo. Es erscheint oben im Heade</w:t>
             </w:r>
             <w:r>
-              <w:t>r neben „Set Dance Balingen“, als Browser-Tab-Icon (Favicon) und als Vorschaubild, wenn der Link geteilt wird.</w:t>
+              <w:t>r neben „Irish Weekend Balingen“, als Browser-Tab-Icon (Favicon) und als Vorschaubild, wenn der Link geteilt wird.</w:t>
             </w:r>
           </w:p>
         </w:tc>
@@ -3059,7 +3318,7 @@
           </w:tcPr>
           <w:p>
             <w:r>
-              <w:t>Haupttitel auf der Startseite (z. B. „Set Dance in Balingen“).</w:t>
+              <w:t>Haupttitel auf der Startseite (z. B. „Irish Weekend - 9.-11. April 2027 Balingen“).</w:t>
             </w:r>
           </w:p>
         </w:tc>
@@ -3203,10 +3462,7 @@
           </w:tcPr>
           <w:p>
             <w:r>
-              <w:t>Rich-Text-Editor für Info-Text 1 und Info-Text 2 mit Werkzeugleiste für Fett, Kursiv, Unterstrichen, Durchgestrichen, Textfarbe, nummerierte und Aufzählungsliste sowie „Formatierung lösche</w:t>
-            </w:r>
-            <w:r>
-              <w:t>n“. Die Formatierung wird beim Speichern serverseitig auf diese erlaubten Möglichkeiten geprüft – andere HTML-Inhalte (z. B. Skripte) werden automatisch entfernt.</w:t>
+              <w:t>Rich-Text-Editor für Info-Text 1 und Info-Text 2 (siehe Abschnitt 5 für die vollständige Werkzeugleiste).</w:t>
             </w:r>
           </w:p>
         </w:tc>
@@ -3219,7 +3475,7 @@
         <w:keepLines/>
         <w:spacing w:before="300" w:after="150"/>
       </w:pPr>
-      <w:bookmarkStart w:id="6" w:name="_Toc240284015"/>
+      <w:bookmarkStart w:id="6" w:name="_Toc240357591"/>
       <w:r>
         <w:rPr>
           <w:b/>
@@ -3227,7 +3483,7 @@
           <w:color w:val="7E2F28"/>
         </w:rPr>
         <w:lastRenderedPageBreak/>
-        <w:t>5. Bearbeiten-Modus: Kontaktdaten, Konfiguration und Optionen</w:t>
+        <w:t>5. Die Formatierungsleiste im Detail</w:t>
       </w:r>
       <w:bookmarkEnd w:id="6"/>
     </w:p>
@@ -3237,10 +3493,10 @@
         <w:spacing w:after="160"/>
       </w:pPr>
       <w:r>
-        <w:t>Weiter unten folgen die techni</w:t>
-      </w:r>
-      <w:r>
-        <w:t>schen Einstellungen und die Liste der buchbaren Optionen mit Preisen.</w:t>
+        <w:t>Alle Rich-Text-Felder (Info-Texte, Zusatztexte, Impressum, Datenschutz) teilen sich dieselbe Werkzeugleiste. Sei</w:t>
+      </w:r>
+      <w:r>
+        <w:t>t Kurzem stehen zusätzlich Einrückung und Links zur Verfügung.</w:t>
       </w:r>
     </w:p>
     <w:p>
@@ -3253,7 +3509,7 @@
           <w:noProof/>
         </w:rPr>
         <w:drawing>
-          <wp:inline distT="0" distB="0" distL="0" distR="0" wp14:anchorId="0955F75A" wp14:editId="41FEFFDA">
+          <wp:inline distT="0" distB="0" distL="0" distR="0" wp14:anchorId="5FBDD18B" wp14:editId="101CAC92">
             <wp:extent cx="4381500" cy="3981450"/>
             <wp:effectExtent l="0" t="0" r="0" b="0"/>
             <wp:docPr id="5" name="Grafik 5"/>
@@ -3443,7 +3699,7 @@
                 <w:b/>
                 <w:bCs/>
               </w:rPr>
-              <w:t>Ziel-E-Mail-Adresse</w:t>
+              <w:t>Formatierungsleiste</w:t>
             </w:r>
           </w:p>
         </w:tc>
@@ -3459,7 +3715,7 @@
           </w:tcPr>
           <w:p>
             <w:r>
-              <w:t>An diese Adresse richten sich die vorausgefüllten Anmeldemails auf der öffentlichen Anmeldeseite.</w:t>
+              <w:t>Von links nach rechts: Fett, Kursiv, Unterstrichen, Durchgestrichen, Textfarbe, nummerierte Liste, Aufzählungsliste, Einrückung verringern, Einrückung erhöhen, Link einfügen, „Formatierung löschen“.</w:t>
             </w:r>
           </w:p>
         </w:tc>
@@ -3515,7 +3771,7 @@
                 <w:b/>
                 <w:bCs/>
               </w:rPr>
-              <w:t>Cloudflare-Worker-URL</w:t>
+              <w:t>Editor-Inhalt</w:t>
             </w:r>
           </w:p>
         </w:tc>
@@ -3531,7 +3787,7 @@
           </w:tcPr>
           <w:p>
             <w:r>
-              <w:t>Adresse des Servers (Worker), über den Anmeldungen und Admin-Aktionen laufen. Nur ändern, wenn sich die Server-Adresse tatsächlich geändert hat.</w:t>
+              <w:t>Der eigentliche Text. Verschachtelte Listen (z. B. Tagesüberschriften mit eingerückten Programmpunkten darunter) werden über die beiden Einrückungs-Buttons erstellt – Cursor in die gewünschte Zeile setzen und auf „Einrückung erhöhen“ klicken.</w:t>
             </w:r>
           </w:p>
         </w:tc>
@@ -3548,145 +3804,66 @@
         </w:trPr>
         <w:tc>
           <w:tcPr>
-            <w:tcW w:w="700" w:type="dxa"/>
-            <w:shd w:val="clear" w:color="auto" w:fill="A3423A"/>
-            <w:tcMar>
-              <w:top w:w="80" w:type="dxa"/>
-              <w:left w:w="100" w:type="dxa"/>
-              <w:bottom w:w="80" w:type="dxa"/>
-              <w:right w:w="100" w:type="dxa"/>
+            <w:tcW w:w="9300" w:type="dxa"/>
+            <w:gridSpan w:val="3"/>
+            <w:shd w:val="clear" w:color="auto" w:fill="F3E7D8"/>
+            <w:tcMar>
+              <w:top w:w="160" w:type="dxa"/>
+              <w:left w:w="200" w:type="dxa"/>
+              <w:bottom w:w="160" w:type="dxa"/>
+              <w:right w:w="200" w:type="dxa"/>
             </w:tcMar>
           </w:tcPr>
           <w:p>
             <w:pPr>
-              <w:jc w:val="center"/>
+              <w:spacing w:after="160"/>
             </w:pPr>
             <w:r>
               <w:rPr>
-                <w:b/>
-                <w:bCs/>
-                <w:color w:val="FFFFFF"/>
-              </w:rPr>
-              <w:t>3</w:t>
-            </w:r>
-          </w:p>
-        </w:tc>
-        <w:tc>
-          <w:tcPr>
-            <w:tcW w:w="2600" w:type="dxa"/>
-            <w:tcMar>
-              <w:top w:w="80" w:type="dxa"/>
-              <w:left w:w="100" w:type="dxa"/>
-              <w:bottom w:w="80" w:type="dxa"/>
-              <w:right w:w="100" w:type="dxa"/>
-            </w:tcMar>
-          </w:tcPr>
-          <w:p>
-            <w:r>
-              <w:rPr>
-                <w:b/>
-                <w:bCs/>
-              </w:rPr>
-              <w:t>Maximale Besucherzahl</w:t>
-            </w:r>
-          </w:p>
-        </w:tc>
-        <w:tc>
-          <w:tcPr>
-            <w:tcW w:w="6000" w:type="dxa"/>
-            <w:tcMar>
-              <w:top w:w="80" w:type="dxa"/>
-              <w:left w:w="100" w:type="dxa"/>
-              <w:bottom w:w="80" w:type="dxa"/>
-              <w:right w:w="100" w:type="dxa"/>
-            </w:tcMar>
-          </w:tcPr>
-          <w:p>
-            <w:r>
-              <w:t xml:space="preserve">Begrenzt die Gesamtzahl der Plätze. Wert 0 bedeutet: keine Begrenzung. Ist die Grenze </w:t>
-            </w:r>
-            <w:r>
-              <w:t>erreicht, erscheint auf der Anmeldeseite automatisch der Warteliste-Hinweis.</w:t>
-            </w:r>
-          </w:p>
-        </w:tc>
-      </w:tr>
-      <w:tr>
-        <w:tblPrEx>
-          <w:tblCellMar>
-            <w:top w:w="0" w:type="dxa"/>
-            <w:bottom w:w="0" w:type="dxa"/>
-          </w:tblCellMar>
-        </w:tblPrEx>
-        <w:trPr>
-          <w:cantSplit/>
-        </w:trPr>
-        <w:tc>
-          <w:tcPr>
-            <w:tcW w:w="700" w:type="dxa"/>
-            <w:shd w:val="clear" w:color="auto" w:fill="A3423A"/>
-            <w:tcMar>
-              <w:top w:w="80" w:type="dxa"/>
-              <w:left w:w="100" w:type="dxa"/>
-              <w:bottom w:w="80" w:type="dxa"/>
-              <w:right w:w="100" w:type="dxa"/>
-            </w:tcMar>
-          </w:tcPr>
-          <w:p>
-            <w:pPr>
-              <w:jc w:val="center"/>
-            </w:pPr>
-            <w:r>
-              <w:rPr>
-                <w:b/>
-                <w:bCs/>
-                <w:color w:val="FFFFFF"/>
-              </w:rPr>
-              <w:t>4</w:t>
-            </w:r>
-          </w:p>
-        </w:tc>
-        <w:tc>
-          <w:tcPr>
-            <w:tcW w:w="2600" w:type="dxa"/>
-            <w:tcMar>
-              <w:top w:w="80" w:type="dxa"/>
-              <w:left w:w="100" w:type="dxa"/>
-              <w:bottom w:w="80" w:type="dxa"/>
-              <w:right w:w="100" w:type="dxa"/>
-            </w:tcMar>
-          </w:tcPr>
-          <w:p>
-            <w:r>
-              <w:rPr>
-                <w:b/>
-                <w:bCs/>
-              </w:rPr>
-              <w:t>Optionen-Liste</w:t>
-            </w:r>
-          </w:p>
-        </w:tc>
-        <w:tc>
-          <w:tcPr>
-            <w:tcW w:w="6000" w:type="dxa"/>
-            <w:tcMar>
-              <w:top w:w="80" w:type="dxa"/>
-              <w:left w:w="100" w:type="dxa"/>
-              <w:bottom w:w="80" w:type="dxa"/>
-              <w:right w:w="100" w:type="dxa"/>
-            </w:tcMar>
-          </w:tcPr>
-          <w:p>
-            <w:r>
-              <w:t>Alle buchbaren Programmpunkte mit Bezeichnung und Preis (in €), sowie ein „Entfernen“-Button je Zeile. Über „+ Option hinzufügen“ (siehe Abschnitt 6) lassen sich</w:t>
-            </w:r>
-            <w:r>
-              <w:t xml:space="preserve"> weitere Zeilen ergänzen.</w:t>
+                <w:i/>
+                <w:iCs/>
+              </w:rPr>
+              <w:t>Link einfüge</w:t>
+            </w:r>
+            <w:r>
+              <w:rPr>
+                <w:i/>
+                <w:iCs/>
+              </w:rPr>
+              <w:t>n: Text markieren, auf das Kettensymbol klicken und die Adresse eintragen – erlaubt sind normale Internetadressen (https://…) sowie mailto:-Adressen für einen Klick-zum-Mailen-Link (z. B. mailto:info@example.de). Andere Link-Ziele werden beim Speichern aut</w:t>
+            </w:r>
+            <w:r>
+              <w:rPr>
+                <w:i/>
+                <w:iCs/>
+              </w:rPr>
+              <w:t>omatisch entfernt, aus Sicherheitsgründen.</w:t>
+            </w:r>
+          </w:p>
+          <w:p>
+            <w:r>
+              <w:rPr>
+                <w:i/>
+                <w:iCs/>
+              </w:rPr>
+              <w:t xml:space="preserve">Sicherheit: Alle Rich-Text-Inhalte werden beim Speichern serverseitig auf diese erlaubten Formatierungen geprüft – andere HTML-Inhalte (z. B. Skripte) werden automatisch entfernt, auch wenn sie über Umwege in den </w:t>
+            </w:r>
+            <w:r>
+              <w:rPr>
+                <w:i/>
+                <w:iCs/>
+              </w:rPr>
+              <w:t>Editor gelangen sollten.</w:t>
             </w:r>
           </w:p>
         </w:tc>
       </w:tr>
     </w:tbl>
+    <w:p>
+      <w:r>
+        <w:br w:type="page"/>
+      </w:r>
+    </w:p>
     <w:p>
       <w:pPr>
         <w:pStyle w:val="berschrift1"/>
@@ -3694,7 +3871,7 @@
         <w:keepLines/>
         <w:spacing w:before="300" w:after="150"/>
       </w:pPr>
-      <w:bookmarkStart w:id="7" w:name="_Toc240284016"/>
+      <w:bookmarkStart w:id="7" w:name="_Toc240357592"/>
       <w:r>
         <w:rPr>
           <w:b/>
@@ -3702,7 +3879,7 @@
           <w:color w:val="7E2F28"/>
         </w:rPr>
         <w:lastRenderedPageBreak/>
-        <w:t>6. Bearbeiten-Modus: Speichern und Passwörter ändern</w:t>
+        <w:t>6. Bearbeiten-Modus: Kontaktdaten, Konfiguration und Optionen</w:t>
       </w:r>
       <w:bookmarkEnd w:id="7"/>
     </w:p>
@@ -3712,7 +3889,7 @@
         <w:spacing w:after="160"/>
       </w:pPr>
       <w:r>
-        <w:t>Am Ende des Formulars befinden sich der Speichern-Button für alle Inhalte sowie ein eigener Bereich zum Ändern der beiden Passwörter.</w:t>
+        <w:t>Weiter unten folgen die technischen Einstellungen und die Liste der buchbaren Optionen mit Preisen.</w:t>
       </w:r>
     </w:p>
     <w:p>
@@ -3725,7 +3902,7 @@
           <w:noProof/>
         </w:rPr>
         <w:drawing>
-          <wp:inline distT="0" distB="0" distL="0" distR="0" wp14:anchorId="6EAA24F6" wp14:editId="1058D83F">
+          <wp:inline distT="0" distB="0" distL="0" distR="0" wp14:anchorId="3715262C" wp14:editId="41662440">
             <wp:extent cx="4381500" cy="3981450"/>
             <wp:effectExtent l="0" t="0" r="0" b="0"/>
             <wp:docPr id="6" name="Grafik 6"/>
@@ -3915,7 +4092,7 @@
                 <w:b/>
                 <w:bCs/>
               </w:rPr>
-              <w:t>+ Option hinzufügen</w:t>
+              <w:t>Maximale Besucherzahl</w:t>
             </w:r>
           </w:p>
         </w:tc>
@@ -3931,10 +4108,7 @@
           </w:tcPr>
           <w:p>
             <w:r>
-              <w:t>Fügt eine neue, leere Zeile in der Optionen-Liste hinzu (siehe Abschnitt 5,</w:t>
-            </w:r>
-            <w:r>
-              <w:t xml:space="preserve"> Punkt 4). Leere Bezeichnungen werden beim Speichern automatisch ignoriert.</w:t>
+              <w:t>Begrenzt die Gesamtzahl der Plätze (Feld direkt darüber: Ziel-E-Mail-Adresse und Cloudflare-Worker-URL, im Bild abgeschnitten). Wert 0 bedeutet: keine Begrenzung. Ist die Grenze erreicht, erscheint auf der Anmeldeseite automatisch der Warteliste-Hinweis.</w:t>
             </w:r>
           </w:p>
         </w:tc>
@@ -3990,7 +4164,7 @@
                 <w:b/>
                 <w:bCs/>
               </w:rPr>
-              <w:t>Speichern</w:t>
+              <w:t>Optionen-Liste</w:t>
             </w:r>
           </w:p>
         </w:tc>
@@ -4006,7 +4180,7 @@
           </w:tcPr>
           <w:p>
             <w:r>
-              <w:t>Speichert Überschrift, Subtext, beide Info-Texte, Ziel-E-Mail-Adresse, Worker-URL, maximale Besucherzahl und alle Optionen dauerhaft – die Änderungen sind danach sofort live auf der Webseite sichtbar.</w:t>
+              <w:t>Alle buchbaren Programmpunkte mit Bezeichnung und Preis (in €), sowie ein „Entfernen“-Button je Zeile.</w:t>
             </w:r>
           </w:p>
         </w:tc>
@@ -4062,7 +4236,7 @@
                 <w:b/>
                 <w:bCs/>
               </w:rPr>
-              <w:t>Neues Anzeige-Passwort</w:t>
+              <w:t>+ Option hinzufügen</w:t>
             </w:r>
           </w:p>
         </w:tc>
@@ -4078,10 +4252,10 @@
           </w:tcPr>
           <w:p>
             <w:r>
-              <w:t>Optional. Leer lassen, um das</w:t>
-            </w:r>
-            <w:r>
-              <w:t xml:space="preserve"> bisherige Anzeige-Passwort unverändert zu lassen.</w:t>
+              <w:t>Fügt eine neue, leere Zeile in der Optionen-Liste hinzu. Leere Bezeichnungen werden beim Speichern automatisch i</w:t>
+            </w:r>
+            <w:r>
+              <w:t>gnoriert.</w:t>
             </w:r>
           </w:p>
         </w:tc>
@@ -4137,7 +4311,7 @@
                 <w:b/>
                 <w:bCs/>
               </w:rPr>
-              <w:t>Neues Bearbeiten-Passwort</w:t>
+              <w:t>Zusatztext-Editoren</w:t>
             </w:r>
           </w:p>
         </w:tc>
@@ -4153,155 +4327,12 @@
           </w:tcPr>
           <w:p>
             <w:r>
-              <w:t>Optional. Leer lassen, um das bisherige Bearbeiten-Passwort unverändert zu lassen.</w:t>
-            </w:r>
-          </w:p>
-        </w:tc>
-      </w:tr>
-      <w:tr>
-        <w:tblPrEx>
-          <w:tblCellMar>
-            <w:top w:w="0" w:type="dxa"/>
-            <w:bottom w:w="0" w:type="dxa"/>
-          </w:tblCellMar>
-        </w:tblPrEx>
-        <w:trPr>
-          <w:cantSplit/>
-        </w:trPr>
-        <w:tc>
-          <w:tcPr>
-            <w:tcW w:w="700" w:type="dxa"/>
-            <w:shd w:val="clear" w:color="auto" w:fill="A3423A"/>
-            <w:tcMar>
-              <w:top w:w="80" w:type="dxa"/>
-              <w:left w:w="100" w:type="dxa"/>
-              <w:bottom w:w="80" w:type="dxa"/>
-              <w:right w:w="100" w:type="dxa"/>
-            </w:tcMar>
-          </w:tcPr>
-          <w:p>
-            <w:pPr>
-              <w:jc w:val="center"/>
-            </w:pPr>
-            <w:r>
-              <w:rPr>
-                <w:b/>
-                <w:bCs/>
-                <w:color w:val="FFFFFF"/>
-              </w:rPr>
-              <w:t>5</w:t>
-            </w:r>
-          </w:p>
-        </w:tc>
-        <w:tc>
-          <w:tcPr>
-            <w:tcW w:w="2600" w:type="dxa"/>
-            <w:tcMar>
-              <w:top w:w="80" w:type="dxa"/>
-              <w:left w:w="100" w:type="dxa"/>
-              <w:bottom w:w="80" w:type="dxa"/>
-              <w:right w:w="100" w:type="dxa"/>
-            </w:tcMar>
-          </w:tcPr>
-          <w:p>
-            <w:r>
-              <w:rPr>
-                <w:b/>
-                <w:bCs/>
-              </w:rPr>
-              <w:t>Passwörter speichern</w:t>
-            </w:r>
-          </w:p>
-        </w:tc>
-        <w:tc>
-          <w:tcPr>
-            <w:tcW w:w="6000" w:type="dxa"/>
-            <w:tcMar>
-              <w:top w:w="80" w:type="dxa"/>
-              <w:left w:w="100" w:type="dxa"/>
-              <w:bottom w:w="80" w:type="dxa"/>
-              <w:right w:w="100" w:type="dxa"/>
-            </w:tcMar>
-          </w:tcPr>
-          <w:p>
-            <w:r>
-              <w:t>Speichert die neuen Passwörter. Dafür ist im Hintergrund das aktuell eingegebene Bearbeiten-Passwort nötig (das beim Entsperren verwendete) – aus Sicherheitsgründen lässt sich diese Aktion nicht ohne gültiges aktuelles Passwort durchführen.</w:t>
+              <w:t>Beginn der beiden freien Zusatztext-Felder (siehe Abschnitt 7).</w:t>
             </w:r>
           </w:p>
         </w:tc>
       </w:tr>
     </w:tbl>
-    <w:p>
-      <w:r>
-        <w:br w:type="page"/>
-      </w:r>
-    </w:p>
-    <w:tbl>
-      <w:tblPr>
-        <w:tblW w:w="9300" w:type="dxa"/>
-        <w:tblBorders>
-          <w:top w:val="single" w:sz="4" w:space="0" w:color="auto"/>
-          <w:left w:val="single" w:sz="4" w:space="0" w:color="auto"/>
-          <w:bottom w:val="single" w:sz="4" w:space="0" w:color="auto"/>
-          <w:right w:val="single" w:sz="4" w:space="0" w:color="auto"/>
-          <w:insideH w:val="single" w:sz="4" w:space="0" w:color="auto"/>
-          <w:insideV w:val="single" w:sz="4" w:space="0" w:color="auto"/>
-        </w:tblBorders>
-        <w:tblCellMar>
-          <w:left w:w="10" w:type="dxa"/>
-          <w:right w:w="10" w:type="dxa"/>
-        </w:tblCellMar>
-        <w:tblLook w:val="04A0" w:firstRow="1" w:lastRow="0" w:firstColumn="1" w:lastColumn="0" w:noHBand="0" w:noVBand="1"/>
-      </w:tblPr>
-      <w:tblGrid>
-        <w:gridCol w:w="9300"/>
-      </w:tblGrid>
-      <w:tr>
-        <w:tblPrEx>
-          <w:tblCellMar>
-            <w:top w:w="0" w:type="dxa"/>
-            <w:bottom w:w="0" w:type="dxa"/>
-          </w:tblCellMar>
-        </w:tblPrEx>
-        <w:trPr>
-          <w:cantSplit/>
-        </w:trPr>
-        <w:tc>
-          <w:tcPr>
-            <w:tcW w:w="9300" w:type="dxa"/>
-            <w:shd w:val="clear" w:color="auto" w:fill="F3E7D8"/>
-            <w:tcMar>
-              <w:top w:w="160" w:type="dxa"/>
-              <w:left w:w="200" w:type="dxa"/>
-              <w:bottom w:w="160" w:type="dxa"/>
-              <w:right w:w="200" w:type="dxa"/>
-            </w:tcMar>
-          </w:tcPr>
-          <w:p>
-            <w:r>
-              <w:rPr>
-                <w:i/>
-                <w:iCs/>
-              </w:rPr>
-              <w:lastRenderedPageBreak/>
-              <w:t>Wichtig: Wir</w:t>
-            </w:r>
-            <w:r>
-              <w:rPr>
-                <w:i/>
-                <w:iCs/>
-              </w:rPr>
-              <w:t>d das Bearbeiten-Passwort geändert, muss ab dem nächsten Öffnen des Admin-Bereichs das neue Passwort verwendet werden. Es lohnt sich, ein neues Passwort vor dem Schließen der Seite an einem sicheren Ort zu notieren.</w:t>
-            </w:r>
-          </w:p>
-        </w:tc>
-      </w:tr>
-    </w:tbl>
-    <w:p>
-      <w:pPr>
-        <w:spacing w:after="160"/>
-      </w:pPr>
-    </w:p>
     <w:p>
       <w:pPr>
         <w:pStyle w:val="berschrift1"/>
@@ -4309,14 +4340,15 @@
         <w:keepLines/>
         <w:spacing w:before="300" w:after="150"/>
       </w:pPr>
-      <w:bookmarkStart w:id="8" w:name="_Toc240284017"/>
+      <w:bookmarkStart w:id="8" w:name="_Toc240357593"/>
       <w:r>
         <w:rPr>
           <w:b/>
           <w:bCs/>
           <w:color w:val="7E2F28"/>
         </w:rPr>
-        <w:t>7. Bearbeiten-Modus: Anmeldungen verwalten</w:t>
+        <w:lastRenderedPageBreak/>
+        <w:t>7. Bearbeiten-Modus: Zusatztexte und Rechtliches</w:t>
       </w:r>
       <w:bookmarkEnd w:id="8"/>
     </w:p>
@@ -4326,7 +4358,7 @@
         <w:spacing w:after="160"/>
       </w:pPr>
       <w:r>
-        <w:t>Im Bearbeiten-Modus lassen sich einzelne Anmeldungen direkt in der Tabelle ändern oder löschen.</w:t>
+        <w:t>Nach den Optionen folgen zwei frei nutzbare Textfelder sowie die Inhalte für Impressum und Datenschutz.</w:t>
       </w:r>
     </w:p>
     <w:p>
@@ -4339,7 +4371,7 @@
           <w:noProof/>
         </w:rPr>
         <w:drawing>
-          <wp:inline distT="0" distB="0" distL="0" distR="0" wp14:anchorId="3B6CAB80" wp14:editId="52FC1355">
+          <wp:inline distT="0" distB="0" distL="0" distR="0" wp14:anchorId="068982EC" wp14:editId="647038C7">
             <wp:extent cx="4381500" cy="3981450"/>
             <wp:effectExtent l="0" t="0" r="0" b="0"/>
             <wp:docPr id="7" name="Grafik 7"/>
@@ -4529,7 +4561,7 @@
                 <w:b/>
                 <w:bCs/>
               </w:rPr>
-              <w:t>Status-Auswahl</w:t>
+              <w:t>Zusatztext 2</w:t>
             </w:r>
           </w:p>
         </w:tc>
@@ -4545,7 +4577,7 @@
           </w:tcPr>
           <w:p>
             <w:r>
-              <w:t>Umschalten zwischen „Bestätigt“ und „Warteliste“ für die jeweilige Anmeldung.</w:t>
+              <w:t>Wie Zusatztext 1 ein frei nutzbares Rich-Text-Feld, das auf der Anmeldeseite direkt nach der Optionsliste erscheint. Eignet sich z. B. für Anfahrtshinweise, einen Google-Maps-Link oder zusätzliche Kontaktangaben.</w:t>
             </w:r>
           </w:p>
         </w:tc>
@@ -4601,7 +4633,7 @@
                 <w:b/>
                 <w:bCs/>
               </w:rPr>
-              <w:t>Editierbare Felder</w:t>
+              <w:t>„Rechtliches“</w:t>
             </w:r>
           </w:p>
         </w:tc>
@@ -4617,10 +4649,7 @@
           </w:tcPr>
           <w:p>
             <w:r>
-              <w:t>Name, E-Mail, Besucherzahl, Optionen und Gesamtpreis lassen sich direkt in der Tabelle anpassen. Nach Änderungen in einer Zeile muss dort auf „Speichern“ geklickt werden, damit sie übernommen werden (Buttons rechts in jeder Zeile, im Bild durch den Tabelle</w:t>
-            </w:r>
-            <w:r>
-              <w:t>nausschnitt nicht mehr sichtbar). Ein „Löschen“-Button entfernt die Anmeldung unwiderruflich – vorher erscheint eine Sicherheitsabfrage.</w:t>
+              <w:t>Ab hier folgen die Inhalte für zwei eigenständige Unterseiten: Impressum und Datenschutz.</w:t>
             </w:r>
           </w:p>
         </w:tc>
@@ -4676,7 +4705,7 @@
                 <w:b/>
                 <w:bCs/>
               </w:rPr>
-              <w:t>CSV herunterladen</w:t>
+              <w:t>Impressum-Editor</w:t>
             </w:r>
           </w:p>
         </w:tc>
@@ -4692,15 +4721,33 @@
           </w:tcPr>
           <w:p>
             <w:r>
-              <w:t>Lädt die aktuell geladene Liste als CSV-Datei herunter, z. B. zur Weiterverarbeitung in einer Tabe</w:t>
-            </w:r>
-            <w:r>
-              <w:t>llenkalkulation.</w:t>
+              <w:t>Inhalt der Seite impressum.html. Wird im Footer jeder Seite verlinkt.</w:t>
             </w:r>
           </w:p>
         </w:tc>
       </w:tr>
     </w:tbl>
+    <w:p>
+      <w:pPr>
+        <w:spacing w:after="160"/>
+      </w:pPr>
+      <w:r>
+        <w:rPr>
+          <w:i/>
+          <w:iCs/>
+          <w:color w:val="6B5C52"/>
+        </w:rPr>
+        <w:t>Zusatztext 1 (im Bild nicht zu sehen, direkt oberhalb von Zusatztext 2) fun</w:t>
+      </w:r>
+      <w:r>
+        <w:rPr>
+          <w:i/>
+          <w:iCs/>
+          <w:color w:val="6B5C52"/>
+        </w:rPr>
+        <w:t>ktioniert genauso wie Zusatztext 2 und erscheint davor auf der Anmeldeseite – beide zusammen ergeben den frei gestaltbaren Bereich direkt nach der Optionsliste.</w:t>
+      </w:r>
+    </w:p>
     <w:p>
       <w:pPr>
         <w:pStyle w:val="berschrift1"/>
@@ -4708,7 +4755,7 @@
         <w:keepLines/>
         <w:spacing w:before="300" w:after="150"/>
       </w:pPr>
-      <w:bookmarkStart w:id="9" w:name="_Toc240284018"/>
+      <w:bookmarkStart w:id="9" w:name="_Toc240357594"/>
       <w:r>
         <w:rPr>
           <w:b/>
@@ -4716,321 +4763,350 @@
           <w:color w:val="7E2F28"/>
         </w:rPr>
         <w:lastRenderedPageBreak/>
-        <w:t>8. Use Cases Schritt für Schritt</w:t>
+        <w:t>8. Bearbeiten-Modus: Datenschutz speichern und Passwörter ändern</w:t>
       </w:r>
       <w:bookmarkEnd w:id="9"/>
     </w:p>
     <w:p>
       <w:pPr>
-        <w:pStyle w:val="berschrift2"/>
+        <w:keepNext/>
+        <w:spacing w:after="160"/>
+      </w:pPr>
+      <w:r>
+        <w:t>Am Ende des Formulars folgen d</w:t>
+      </w:r>
+      <w:r>
+        <w:t>er Datenschutz-Editor, der Speichern-Button für alle Inhalte sowie ein eigener Bereich zum Ändern der beiden Passwörter.</w:t>
+      </w:r>
+    </w:p>
+    <w:p>
+      <w:pPr>
+        <w:spacing w:after="60"/>
+        <w:jc w:val="center"/>
+      </w:pPr>
+      <w:r>
+        <w:rPr>
+          <w:noProof/>
+        </w:rPr>
+        <w:drawing>
+          <wp:inline distT="0" distB="0" distL="0" distR="0" wp14:anchorId="403F081A" wp14:editId="4D26B72B">
+            <wp:extent cx="4381500" cy="3981450"/>
+            <wp:effectExtent l="0" t="0" r="0" b="0"/>
+            <wp:docPr id="8" name="Grafik 8"/>
+            <wp:cNvGraphicFramePr>
+              <a:graphicFrameLocks xmlns:a="http://schemas.openxmlformats.org/drawingml/2006/main" noChangeAspect="1"/>
+            </wp:cNvGraphicFramePr>
+            <a:graphic xmlns:a="http://schemas.openxmlformats.org/drawingml/2006/main">
+              <a:graphicData uri="http://schemas.openxmlformats.org/drawingml/2006/picture">
+                <pic:pic xmlns:pic="http://schemas.openxmlformats.org/drawingml/2006/picture">
+                  <pic:nvPicPr>
+                    <pic:cNvPr id="0" name=""/>
+                    <pic:cNvPicPr>
+                      <a:picLocks noChangeAspect="1" noChangeArrowheads="1"/>
+                    </pic:cNvPicPr>
+                  </pic:nvPicPr>
+                  <pic:blipFill>
+                    <a:blip r:embed="rId12"/>
+                    <a:srcRect/>
+                    <a:stretch>
+                      <a:fillRect/>
+                    </a:stretch>
+                  </pic:blipFill>
+                  <pic:spPr bwMode="auto">
+                    <a:xfrm>
+                      <a:off x="0" y="0"/>
+                      <a:ext cx="4381500" cy="3981450"/>
+                    </a:xfrm>
+                    <a:prstGeom prst="rect">
+                      <a:avLst/>
+                    </a:prstGeom>
+                  </pic:spPr>
+                </pic:pic>
+              </a:graphicData>
+            </a:graphic>
+          </wp:inline>
+        </w:drawing>
+      </w:r>
+    </w:p>
+    <w:tbl>
+      <w:tblPr>
+        <w:tblW w:w="9300" w:type="dxa"/>
+        <w:tblBorders>
+          <w:top w:val="single" w:sz="4" w:space="0" w:color="auto"/>
+          <w:left w:val="single" w:sz="4" w:space="0" w:color="auto"/>
+          <w:bottom w:val="single" w:sz="4" w:space="0" w:color="auto"/>
+          <w:right w:val="single" w:sz="4" w:space="0" w:color="auto"/>
+          <w:insideH w:val="single" w:sz="4" w:space="0" w:color="auto"/>
+          <w:insideV w:val="single" w:sz="4" w:space="0" w:color="auto"/>
+        </w:tblBorders>
+        <w:tblCellMar>
+          <w:left w:w="10" w:type="dxa"/>
+          <w:right w:w="10" w:type="dxa"/>
+        </w:tblCellMar>
+        <w:tblLook w:val="04A0" w:firstRow="1" w:lastRow="0" w:firstColumn="1" w:lastColumn="0" w:noHBand="0" w:noVBand="1"/>
+      </w:tblPr>
+      <w:tblGrid>
+        <w:gridCol w:w="700"/>
+        <w:gridCol w:w="2600"/>
+        <w:gridCol w:w="6000"/>
+      </w:tblGrid>
+      <w:tr>
+        <w:tblPrEx>
+          <w:tblCellMar>
+            <w:top w:w="0" w:type="dxa"/>
+            <w:bottom w:w="0" w:type="dxa"/>
+          </w:tblCellMar>
+        </w:tblPrEx>
+        <w:trPr>
+          <w:cantSplit/>
+          <w:tblHeader/>
+        </w:trPr>
+        <w:tc>
+          <w:tcPr>
+            <w:tcW w:w="700" w:type="dxa"/>
+            <w:shd w:val="clear" w:color="auto" w:fill="F3E7D8"/>
+            <w:tcMar>
+              <w:top w:w="80" w:type="dxa"/>
+              <w:left w:w="100" w:type="dxa"/>
+              <w:bottom w:w="80" w:type="dxa"/>
+              <w:right w:w="100" w:type="dxa"/>
+            </w:tcMar>
+          </w:tcPr>
+          <w:p>
+            <w:r>
+              <w:rPr>
+                <w:b/>
+                <w:bCs/>
+                <w:color w:val="7E2F28"/>
+              </w:rPr>
+              <w:t>Nr.</w:t>
+            </w:r>
+          </w:p>
+        </w:tc>
+        <w:tc>
+          <w:tcPr>
+            <w:tcW w:w="2600" w:type="dxa"/>
+            <w:shd w:val="clear" w:color="auto" w:fill="F3E7D8"/>
+            <w:tcMar>
+              <w:top w:w="80" w:type="dxa"/>
+              <w:left w:w="100" w:type="dxa"/>
+              <w:bottom w:w="80" w:type="dxa"/>
+              <w:right w:w="100" w:type="dxa"/>
+            </w:tcMar>
+          </w:tcPr>
+          <w:p>
+            <w:r>
+              <w:rPr>
+                <w:b/>
+                <w:bCs/>
+                <w:color w:val="7E2F28"/>
+              </w:rPr>
+              <w:t>Element</w:t>
+            </w:r>
+          </w:p>
+        </w:tc>
+        <w:tc>
+          <w:tcPr>
+            <w:tcW w:w="6000" w:type="dxa"/>
+            <w:shd w:val="clear" w:color="auto" w:fill="F3E7D8"/>
+            <w:tcMar>
+              <w:top w:w="80" w:type="dxa"/>
+              <w:left w:w="100" w:type="dxa"/>
+              <w:bottom w:w="80" w:type="dxa"/>
+              <w:right w:w="100" w:type="dxa"/>
+            </w:tcMar>
+          </w:tcPr>
+          <w:p>
+            <w:r>
+              <w:rPr>
+                <w:b/>
+                <w:bCs/>
+                <w:color w:val="7E2F28"/>
+              </w:rPr>
+              <w:t>Bedeutung</w:t>
+            </w:r>
+          </w:p>
+        </w:tc>
+      </w:tr>
+      <w:tr>
+        <w:tblPrEx>
+          <w:tblCellMar>
+            <w:top w:w="0" w:type="dxa"/>
+            <w:bottom w:w="0" w:type="dxa"/>
+          </w:tblCellMar>
+        </w:tblPrEx>
+        <w:trPr>
+          <w:cantSplit/>
+        </w:trPr>
+        <w:tc>
+          <w:tcPr>
+            <w:tcW w:w="700" w:type="dxa"/>
+            <w:shd w:val="clear" w:color="auto" w:fill="A3423A"/>
+            <w:tcMar>
+              <w:top w:w="80" w:type="dxa"/>
+              <w:left w:w="100" w:type="dxa"/>
+              <w:bottom w:w="80" w:type="dxa"/>
+              <w:right w:w="100" w:type="dxa"/>
+            </w:tcMar>
+          </w:tcPr>
+          <w:p>
+            <w:pPr>
+              <w:jc w:val="center"/>
+            </w:pPr>
+            <w:r>
+              <w:rPr>
+                <w:b/>
+                <w:bCs/>
+                <w:color w:val="FFFFFF"/>
+              </w:rPr>
+              <w:t>1</w:t>
+            </w:r>
+          </w:p>
+        </w:tc>
+        <w:tc>
+          <w:tcPr>
+            <w:tcW w:w="2600" w:type="dxa"/>
+            <w:tcMar>
+              <w:top w:w="80" w:type="dxa"/>
+              <w:left w:w="100" w:type="dxa"/>
+              <w:bottom w:w="80" w:type="dxa"/>
+              <w:right w:w="100" w:type="dxa"/>
+            </w:tcMar>
+          </w:tcPr>
+          <w:p>
+            <w:r>
+              <w:rPr>
+                <w:b/>
+                <w:bCs/>
+              </w:rPr>
+              <w:t>Datenschutz-Editor</w:t>
+            </w:r>
+          </w:p>
+        </w:tc>
+        <w:tc>
+          <w:tcPr>
+            <w:tcW w:w="6000" w:type="dxa"/>
+            <w:tcMar>
+              <w:top w:w="80" w:type="dxa"/>
+              <w:left w:w="100" w:type="dxa"/>
+              <w:bottom w:w="80" w:type="dxa"/>
+              <w:right w:w="100" w:type="dxa"/>
+            </w:tcMar>
+          </w:tcPr>
+          <w:p>
+            <w:r>
+              <w:t>Inhalt der Seite datenschutz.html. Wird im Footer jeder Seite verlinkt.</w:t>
+            </w:r>
+          </w:p>
+        </w:tc>
+      </w:tr>
+      <w:tr>
+        <w:tblPrEx>
+          <w:tblCellMar>
+            <w:top w:w="0" w:type="dxa"/>
+            <w:bottom w:w="0" w:type="dxa"/>
+          </w:tblCellMar>
+        </w:tblPrEx>
+        <w:trPr>
+          <w:cantSplit/>
+        </w:trPr>
+        <w:tc>
+          <w:tcPr>
+            <w:tcW w:w="700" w:type="dxa"/>
+            <w:shd w:val="clear" w:color="auto" w:fill="A3423A"/>
+            <w:tcMar>
+              <w:top w:w="80" w:type="dxa"/>
+              <w:left w:w="100" w:type="dxa"/>
+              <w:bottom w:w="80" w:type="dxa"/>
+              <w:right w:w="100" w:type="dxa"/>
+            </w:tcMar>
+          </w:tcPr>
+          <w:p>
+            <w:pPr>
+              <w:jc w:val="center"/>
+            </w:pPr>
+            <w:r>
+              <w:rPr>
+                <w:b/>
+                <w:bCs/>
+                <w:color w:val="FFFFFF"/>
+              </w:rPr>
+              <w:t>2</w:t>
+            </w:r>
+          </w:p>
+        </w:tc>
+        <w:tc>
+          <w:tcPr>
+            <w:tcW w:w="2600" w:type="dxa"/>
+            <w:tcMar>
+              <w:top w:w="80" w:type="dxa"/>
+              <w:left w:w="100" w:type="dxa"/>
+              <w:bottom w:w="80" w:type="dxa"/>
+              <w:right w:w="100" w:type="dxa"/>
+            </w:tcMar>
+          </w:tcPr>
+          <w:p>
+            <w:r>
+              <w:rPr>
+                <w:b/>
+                <w:bCs/>
+              </w:rPr>
+              <w:t>Speichern</w:t>
+            </w:r>
+          </w:p>
+        </w:tc>
+        <w:tc>
+          <w:tcPr>
+            <w:tcW w:w="6000" w:type="dxa"/>
+            <w:tcMar>
+              <w:top w:w="80" w:type="dxa"/>
+              <w:left w:w="100" w:type="dxa"/>
+              <w:bottom w:w="80" w:type="dxa"/>
+              <w:right w:w="100" w:type="dxa"/>
+            </w:tcMar>
+          </w:tcPr>
+          <w:p>
+            <w:r>
+              <w:t>Speichert Überschrift, Subtext, beide Info-Texte, beide Zusatztexte, Impressum, Datenschutz, Ziel-E-Mail-Adresse, Worker-URL, maximale Besucherzahl und alle Optionen dauerhaft – die Änderungen sind danach sofort live auf der Webseite sichtbar.</w:t>
+            </w:r>
+          </w:p>
+        </w:tc>
+      </w:tr>
+    </w:tbl>
+    <w:p>
+      <w:pPr>
+        <w:spacing w:after="160"/>
+      </w:pPr>
+      <w:r>
+        <w:rPr>
+          <w:i/>
+          <w:iCs/>
+          <w:color w:val="6B5C52"/>
+        </w:rPr>
+        <w:t>Wichtig: Im</w:t>
+      </w:r>
+      <w:r>
+        <w:rPr>
+          <w:i/>
+          <w:iCs/>
+          <w:color w:val="6B5C52"/>
+        </w:rPr>
+        <w:t>pressum und Datenschutz enthalten nach der Ersteinrichtung Platzhaltertext (deutlich mit „[Platzhalter]“ bzw. einem Hinweissatz markiert). Bitte vor der offiziellen Bewerbung der Seite durch echte Angaben ersetzen.</w:t>
+      </w:r>
+    </w:p>
+    <w:p>
+      <w:r>
+        <w:br w:type="page"/>
+      </w:r>
+    </w:p>
+    <w:p>
+      <w:pPr>
+        <w:pStyle w:val="berschrift1"/>
         <w:keepNext/>
         <w:keepLines/>
-        <w:spacing w:before="240" w:after="120"/>
-      </w:pPr>
-      <w:bookmarkStart w:id="10" w:name="_Toc240284019"/>
-      <w:r>
-        <w:rPr>
-          <w:b/>
-          <w:bCs/>
-          <w:color w:val="7E2F28"/>
-        </w:rPr>
-        <w:t>8.1 Use Case: Nur Anmeldungen und Inhalte ansehen</w:t>
-      </w:r>
-      <w:bookmarkEnd w:id="10"/>
-    </w:p>
-    <w:p>
-      <w:pPr>
-        <w:keepNext/>
-        <w:spacing w:after="160"/>
-      </w:pPr>
-      <w:r>
-        <w:t>Ziel: Sich einen Überblick verschaffen, ohne versehentlich etwas zu verändern.</w:t>
-      </w:r>
-    </w:p>
-    <w:p>
-      <w:pPr>
-        <w:spacing w:after="80"/>
-      </w:pPr>
-      <w:r>
-        <w:t>1.  admin.html öffnen.</w:t>
-      </w:r>
-    </w:p>
-    <w:p>
-      <w:pPr>
-        <w:spacing w:after="80"/>
-      </w:pPr>
-      <w:r>
-        <w:t xml:space="preserve">2.  </w:t>
-      </w:r>
-      <w:r>
-        <w:t>Das Anzeige-Passwort eingeben und auf „Entsperren“ klicken.</w:t>
-      </w:r>
-    </w:p>
-    <w:p>
-      <w:pPr>
-        <w:spacing w:after="80"/>
-      </w:pPr>
-      <w:r>
-        <w:t>3.  Inhalte, Logo und Anmeldungen ansehen – alle Felder sind deaktiviert, es kann nichts versehentlich verändert werden.</w:t>
-      </w:r>
-    </w:p>
-    <w:p>
-      <w:pPr>
-        <w:spacing w:after="200"/>
-      </w:pPr>
-      <w:r>
-        <w:t>4.  Optional: Über „CSV herunterladen“ die aktuelle Anmeldungsliste sichern</w:t>
-      </w:r>
-      <w:r>
-        <w:t>.</w:t>
-      </w:r>
-    </w:p>
-    <w:p>
-      <w:pPr>
-        <w:pStyle w:val="berschrift2"/>
-        <w:keepNext/>
-        <w:keepLines/>
-        <w:spacing w:before="240" w:after="120"/>
-      </w:pPr>
-      <w:bookmarkStart w:id="11" w:name="_Toc240284020"/>
-      <w:r>
-        <w:rPr>
-          <w:b/>
-          <w:bCs/>
-          <w:color w:val="7E2F28"/>
-        </w:rPr>
-        <w:t>8.2 Use Case: Inhaltstext ändern</w:t>
-      </w:r>
-      <w:bookmarkEnd w:id="11"/>
-    </w:p>
-    <w:p>
-      <w:pPr>
-        <w:keepNext/>
-        <w:spacing w:after="160"/>
-      </w:pPr>
-      <w:r>
-        <w:t>Ziel: Zum Beispiel den Info-Text mit dem voraussichtlichen Termin aktualisieren.</w:t>
-      </w:r>
-    </w:p>
-    <w:p>
-      <w:pPr>
-        <w:spacing w:after="80"/>
-      </w:pPr>
-      <w:r>
-        <w:t>1.  admin.html öffnen und das Bearbeiten-Passwort eingeben.</w:t>
-      </w:r>
-    </w:p>
-    <w:p>
-      <w:pPr>
-        <w:spacing w:after="80"/>
-      </w:pPr>
-      <w:r>
-        <w:t>2.  Im gewünschten Info-Text-Feld den Text anpassen – dabei die Werkzeugleiste f</w:t>
-      </w:r>
-      <w:r>
-        <w:t>ür Fett, Kursiv, Farbe, Listen usw. nutzen.</w:t>
-      </w:r>
-    </w:p>
-    <w:p>
-      <w:pPr>
-        <w:spacing w:after="80"/>
-      </w:pPr>
-      <w:r>
-        <w:t>3.  Ganz unten im Formular auf „Speichern“ klicken.</w:t>
-      </w:r>
-    </w:p>
-    <w:p>
-      <w:pPr>
-        <w:spacing w:after="200"/>
-      </w:pPr>
-      <w:r>
-        <w:t>4.  Die Bestätigung „Gespeichert – die Änderungen sind live“ abwarten. Die neue Formatierung erscheint direkt auf der öffentlichen Seite.</w:t>
-      </w:r>
-    </w:p>
-    <w:p>
-      <w:pPr>
-        <w:pStyle w:val="berschrift2"/>
-        <w:keepNext/>
-        <w:keepLines/>
-        <w:spacing w:before="240" w:after="120"/>
-      </w:pPr>
-      <w:bookmarkStart w:id="12" w:name="_Toc240284021"/>
-      <w:r>
-        <w:rPr>
-          <w:b/>
-          <w:bCs/>
-          <w:color w:val="7E2F28"/>
-        </w:rPr>
-        <w:t>8.3 Use Case: Logo aus</w:t>
-      </w:r>
-      <w:r>
-        <w:rPr>
-          <w:b/>
-          <w:bCs/>
-          <w:color w:val="7E2F28"/>
-        </w:rPr>
-        <w:t>tauschen</w:t>
-      </w:r>
-      <w:bookmarkEnd w:id="12"/>
-    </w:p>
-    <w:p>
-      <w:pPr>
-        <w:keepNext/>
-        <w:spacing w:after="160"/>
-      </w:pPr>
-      <w:r>
-        <w:t>Ziel: Ein neues Bild als Logo, Favicon und Vorschaubild festlegen.</w:t>
-      </w:r>
-    </w:p>
-    <w:p>
-      <w:pPr>
-        <w:spacing w:after="80"/>
-      </w:pPr>
-      <w:r>
-        <w:t>1.  Im Bearbeiten-Modus im Bereich „Logo / Icon“ auf „Datei auswählen“ klicken.</w:t>
-      </w:r>
-    </w:p>
-    <w:p>
-      <w:pPr>
-        <w:spacing w:after="80"/>
-      </w:pPr>
-      <w:r>
-        <w:t xml:space="preserve">2.  Eine PNG-Datei wählen (möglichst quadratisch, max. 2 MB). Die Vorschau aktualisiert sich sofort </w:t>
-      </w:r>
-      <w:r>
-        <w:t>– dies ist aber noch nicht gespeichert.</w:t>
-      </w:r>
-    </w:p>
-    <w:p>
-      <w:pPr>
-        <w:spacing w:after="200"/>
-      </w:pPr>
-      <w:r>
-        <w:t>3.  Auf „Logo hochladen“ klicken. Erst danach ist das neue Bild live sichtbar – im Header, als Favicon und als Vorschaubild beim Teilen des Links.</w:t>
-      </w:r>
-    </w:p>
-    <w:p>
-      <w:pPr>
-        <w:pStyle w:val="berschrift2"/>
-        <w:keepNext/>
-        <w:keepLines/>
-        <w:spacing w:before="240" w:after="120"/>
-      </w:pPr>
-      <w:bookmarkStart w:id="13" w:name="_Toc240284022"/>
-      <w:r>
-        <w:rPr>
-          <w:b/>
-          <w:bCs/>
-          <w:color w:val="7E2F28"/>
-        </w:rPr>
-        <w:t>8.4 Use Case: Neue Option (Programmpunkt) hinzufügen</w:t>
-      </w:r>
-      <w:bookmarkEnd w:id="13"/>
-    </w:p>
-    <w:p>
-      <w:pPr>
-        <w:keepNext/>
-        <w:spacing w:after="160"/>
-      </w:pPr>
-      <w:r>
-        <w:t>Ziel: Einen zusä</w:t>
-      </w:r>
-      <w:r>
-        <w:t>tzlichen buchbaren Programmpunkt mit Preis anlegen.</w:t>
-      </w:r>
-    </w:p>
-    <w:p>
-      <w:pPr>
-        <w:spacing w:after="80"/>
-      </w:pPr>
-      <w:r>
-        <w:t>1.  Im Bearbeiten-Modus zum Bereich „Optionen“ scrollen und auf „+ Option hinzufügen“ klicken.</w:t>
-      </w:r>
-    </w:p>
-    <w:p>
-      <w:pPr>
-        <w:spacing w:after="80"/>
-      </w:pPr>
-      <w:r>
-        <w:t>2.  In der neuen, leeren Zeile Bezeichnung und Preis eintragen.</w:t>
-      </w:r>
-    </w:p>
-    <w:p>
-      <w:pPr>
-        <w:spacing w:after="200"/>
-      </w:pPr>
-      <w:r>
-        <w:t xml:space="preserve">3.  Auf „Speichern“ klicken. Die neue Option </w:t>
-      </w:r>
-      <w:r>
-        <w:t>erscheint danach auf der Anmeldeseite zur Auswahl.</w:t>
-      </w:r>
-    </w:p>
-    <w:p>
-      <w:pPr>
-        <w:pStyle w:val="berschrift2"/>
-        <w:keepNext/>
-        <w:keepLines/>
-        <w:spacing w:before="240" w:after="120"/>
-      </w:pPr>
-      <w:bookmarkStart w:id="14" w:name="_Toc240284023"/>
-      <w:r>
-        <w:rPr>
-          <w:b/>
-          <w:bCs/>
-          <w:color w:val="7E2F28"/>
-        </w:rPr>
-        <w:t>8.5 Use Case: Passwörter ändern</w:t>
-      </w:r>
-      <w:bookmarkEnd w:id="14"/>
-    </w:p>
-    <w:p>
-      <w:pPr>
-        <w:keepNext/>
-        <w:spacing w:after="160"/>
-      </w:pPr>
-      <w:r>
-        <w:t>Ziel: Aus Sicherheitsgründen regelmäßig neue Passwörter vergeben.</w:t>
-      </w:r>
-    </w:p>
-    <w:p>
-      <w:pPr>
-        <w:spacing w:after="80"/>
-      </w:pPr>
-      <w:r>
-        <w:t xml:space="preserve">1.  </w:t>
-      </w:r>
-      <w:r>
-        <w:t>Im Bearbeiten-Modus zum Bereich „Passwörter ändern“ scrollen.</w:t>
-      </w:r>
-    </w:p>
-    <w:p>
-      <w:pPr>
-        <w:spacing w:after="80"/>
-      </w:pPr>
-      <w:r>
-        <w:t>2.  Nur das gewünschte neue Passwort eintragen (Anzeige-, Bearbeiten- oder beide) – nicht benötigte Felder leer lassen.</w:t>
-      </w:r>
-    </w:p>
-    <w:p>
-      <w:pPr>
-        <w:spacing w:after="200"/>
-      </w:pPr>
-      <w:r>
-        <w:t xml:space="preserve">3.  Auf „Passwörter speichern“ klicken und die Bestätigung abwarten. Neue </w:t>
-      </w:r>
-      <w:r>
-        <w:t>Passwörter an einem sicheren Ort notieren, bevor der Admin-Bereich verlassen wird.</w:t>
-      </w:r>
-    </w:p>
-    <w:p>
-      <w:pPr>
-        <w:pStyle w:val="berschrift2"/>
-        <w:keepNext/>
-        <w:keepLines/>
-        <w:spacing w:before="240" w:after="120"/>
-      </w:pPr>
-      <w:bookmarkStart w:id="15" w:name="_Toc240284024"/>
+        <w:spacing w:before="300" w:after="150"/>
+      </w:pPr>
+      <w:bookmarkStart w:id="10" w:name="_Toc240357595"/>
       <w:r>
         <w:rPr>
           <w:b/>
@@ -5038,66 +5114,974 @@
           <w:color w:val="7E2F28"/>
         </w:rPr>
         <w:lastRenderedPageBreak/>
-        <w:t>8.6 Use Case: Eine Anmeldung bearbeiten oder löschen</w:t>
-      </w:r>
-      <w:bookmarkEnd w:id="15"/>
-    </w:p>
-    <w:p>
-      <w:pPr>
-        <w:keepNext/>
-        <w:spacing w:after="160"/>
-      </w:pPr>
-      <w:r>
-        <w:t>Ziel: Z. B. eine Anmeldung von der Warteliste auf „Bestätigt“ setzen oder eine fehlerhafte Anmeldung entfernen.</w:t>
-      </w:r>
-    </w:p>
-    <w:p>
-      <w:pPr>
-        <w:spacing w:after="80"/>
-      </w:pPr>
-      <w:r>
-        <w:t xml:space="preserve">1.  </w:t>
-      </w:r>
-      <w:r>
-        <w:t>Im Bearbeiten-Modus zum Bereich „Anmeldungen“ scrollen und die passende Zeile suchen.</w:t>
-      </w:r>
-    </w:p>
-    <w:p>
-      <w:pPr>
-        <w:spacing w:after="80"/>
-      </w:pPr>
-      <w:r>
-        <w:t>2.  Zum Ändern: Status, Name, E-Mail, Besucherzahl, Optionen oder Gesamtpreis direkt in der Zeile anpassen und in dieser Zeile auf „Speichern“ klicken.</w:t>
-      </w:r>
-    </w:p>
-    <w:p>
-      <w:pPr>
-        <w:spacing w:after="200"/>
-      </w:pPr>
-      <w:r>
-        <w:t>3.  Zum Löschen: I</w:t>
-      </w:r>
-      <w:r>
-        <w:t>n derselben Zeile auf „Löschen“ klicken und die Sicherheitsabfrage bestätigen. Dieser Schritt kann nicht rückgängig gemacht werden.</w:t>
-      </w:r>
-    </w:p>
-    <w:p>
-      <w:pPr>
-        <w:pStyle w:val="berschrift1"/>
-        <w:keepNext/>
-        <w:keepLines/>
-        <w:spacing w:before="300" w:after="150"/>
-      </w:pPr>
-      <w:bookmarkStart w:id="16" w:name="_Toc240284025"/>
+        <w:t>9. Bearbeiten-Modus: Anmeldungen verwal</w:t>
+      </w:r>
       <w:r>
         <w:rPr>
           <w:b/>
           <w:bCs/>
           <w:color w:val="7E2F28"/>
         </w:rPr>
-        <w:t>9. Kurz zusammengefasst</w:t>
+        <w:t>ten</w:t>
+      </w:r>
+      <w:bookmarkEnd w:id="10"/>
+    </w:p>
+    <w:p>
+      <w:pPr>
+        <w:keepNext/>
+        <w:spacing w:after="160"/>
+      </w:pPr>
+      <w:r>
+        <w:t>Im Bearbeiten-Modus lassen sich einzelne Anmeldungen direkt in der Tabelle ändern oder löschen.</w:t>
+      </w:r>
+    </w:p>
+    <w:p>
+      <w:pPr>
+        <w:spacing w:after="60"/>
+        <w:jc w:val="center"/>
+      </w:pPr>
+      <w:r>
+        <w:rPr>
+          <w:noProof/>
+        </w:rPr>
+        <w:drawing>
+          <wp:inline distT="0" distB="0" distL="0" distR="0" wp14:anchorId="614DD1C6" wp14:editId="01757B04">
+            <wp:extent cx="4381500" cy="3981450"/>
+            <wp:effectExtent l="0" t="0" r="0" b="0"/>
+            <wp:docPr id="9" name="Grafik 9"/>
+            <wp:cNvGraphicFramePr>
+              <a:graphicFrameLocks xmlns:a="http://schemas.openxmlformats.org/drawingml/2006/main" noChangeAspect="1"/>
+            </wp:cNvGraphicFramePr>
+            <a:graphic xmlns:a="http://schemas.openxmlformats.org/drawingml/2006/main">
+              <a:graphicData uri="http://schemas.openxmlformats.org/drawingml/2006/picture">
+                <pic:pic xmlns:pic="http://schemas.openxmlformats.org/drawingml/2006/picture">
+                  <pic:nvPicPr>
+                    <pic:cNvPr id="0" name=""/>
+                    <pic:cNvPicPr>
+                      <a:picLocks noChangeAspect="1" noChangeArrowheads="1"/>
+                    </pic:cNvPicPr>
+                  </pic:nvPicPr>
+                  <pic:blipFill>
+                    <a:blip r:embed="rId13"/>
+                    <a:srcRect/>
+                    <a:stretch>
+                      <a:fillRect/>
+                    </a:stretch>
+                  </pic:blipFill>
+                  <pic:spPr bwMode="auto">
+                    <a:xfrm>
+                      <a:off x="0" y="0"/>
+                      <a:ext cx="4381500" cy="3981450"/>
+                    </a:xfrm>
+                    <a:prstGeom prst="rect">
+                      <a:avLst/>
+                    </a:prstGeom>
+                  </pic:spPr>
+                </pic:pic>
+              </a:graphicData>
+            </a:graphic>
+          </wp:inline>
+        </w:drawing>
+      </w:r>
+    </w:p>
+    <w:tbl>
+      <w:tblPr>
+        <w:tblW w:w="9300" w:type="dxa"/>
+        <w:tblBorders>
+          <w:top w:val="single" w:sz="4" w:space="0" w:color="auto"/>
+          <w:left w:val="single" w:sz="4" w:space="0" w:color="auto"/>
+          <w:bottom w:val="single" w:sz="4" w:space="0" w:color="auto"/>
+          <w:right w:val="single" w:sz="4" w:space="0" w:color="auto"/>
+          <w:insideH w:val="single" w:sz="4" w:space="0" w:color="auto"/>
+          <w:insideV w:val="single" w:sz="4" w:space="0" w:color="auto"/>
+        </w:tblBorders>
+        <w:tblCellMar>
+          <w:left w:w="10" w:type="dxa"/>
+          <w:right w:w="10" w:type="dxa"/>
+        </w:tblCellMar>
+        <w:tblLook w:val="04A0" w:firstRow="1" w:lastRow="0" w:firstColumn="1" w:lastColumn="0" w:noHBand="0" w:noVBand="1"/>
+      </w:tblPr>
+      <w:tblGrid>
+        <w:gridCol w:w="700"/>
+        <w:gridCol w:w="2600"/>
+        <w:gridCol w:w="6000"/>
+      </w:tblGrid>
+      <w:tr>
+        <w:tblPrEx>
+          <w:tblCellMar>
+            <w:top w:w="0" w:type="dxa"/>
+            <w:bottom w:w="0" w:type="dxa"/>
+          </w:tblCellMar>
+        </w:tblPrEx>
+        <w:trPr>
+          <w:cantSplit/>
+          <w:tblHeader/>
+        </w:trPr>
+        <w:tc>
+          <w:tcPr>
+            <w:tcW w:w="700" w:type="dxa"/>
+            <w:shd w:val="clear" w:color="auto" w:fill="F3E7D8"/>
+            <w:tcMar>
+              <w:top w:w="80" w:type="dxa"/>
+              <w:left w:w="100" w:type="dxa"/>
+              <w:bottom w:w="80" w:type="dxa"/>
+              <w:right w:w="100" w:type="dxa"/>
+            </w:tcMar>
+          </w:tcPr>
+          <w:p>
+            <w:r>
+              <w:rPr>
+                <w:b/>
+                <w:bCs/>
+                <w:color w:val="7E2F28"/>
+              </w:rPr>
+              <w:t>Nr.</w:t>
+            </w:r>
+          </w:p>
+        </w:tc>
+        <w:tc>
+          <w:tcPr>
+            <w:tcW w:w="2600" w:type="dxa"/>
+            <w:shd w:val="clear" w:color="auto" w:fill="F3E7D8"/>
+            <w:tcMar>
+              <w:top w:w="80" w:type="dxa"/>
+              <w:left w:w="100" w:type="dxa"/>
+              <w:bottom w:w="80" w:type="dxa"/>
+              <w:right w:w="100" w:type="dxa"/>
+            </w:tcMar>
+          </w:tcPr>
+          <w:p>
+            <w:r>
+              <w:rPr>
+                <w:b/>
+                <w:bCs/>
+                <w:color w:val="7E2F28"/>
+              </w:rPr>
+              <w:t>Element</w:t>
+            </w:r>
+          </w:p>
+        </w:tc>
+        <w:tc>
+          <w:tcPr>
+            <w:tcW w:w="6000" w:type="dxa"/>
+            <w:shd w:val="clear" w:color="auto" w:fill="F3E7D8"/>
+            <w:tcMar>
+              <w:top w:w="80" w:type="dxa"/>
+              <w:left w:w="100" w:type="dxa"/>
+              <w:bottom w:w="80" w:type="dxa"/>
+              <w:right w:w="100" w:type="dxa"/>
+            </w:tcMar>
+          </w:tcPr>
+          <w:p>
+            <w:r>
+              <w:rPr>
+                <w:b/>
+                <w:bCs/>
+                <w:color w:val="7E2F28"/>
+              </w:rPr>
+              <w:t>Bedeutung</w:t>
+            </w:r>
+          </w:p>
+        </w:tc>
+      </w:tr>
+      <w:tr>
+        <w:tblPrEx>
+          <w:tblCellMar>
+            <w:top w:w="0" w:type="dxa"/>
+            <w:bottom w:w="0" w:type="dxa"/>
+          </w:tblCellMar>
+        </w:tblPrEx>
+        <w:trPr>
+          <w:cantSplit/>
+        </w:trPr>
+        <w:tc>
+          <w:tcPr>
+            <w:tcW w:w="700" w:type="dxa"/>
+            <w:shd w:val="clear" w:color="auto" w:fill="A3423A"/>
+            <w:tcMar>
+              <w:top w:w="80" w:type="dxa"/>
+              <w:left w:w="100" w:type="dxa"/>
+              <w:bottom w:w="80" w:type="dxa"/>
+              <w:right w:w="100" w:type="dxa"/>
+            </w:tcMar>
+          </w:tcPr>
+          <w:p>
+            <w:pPr>
+              <w:jc w:val="center"/>
+            </w:pPr>
+            <w:r>
+              <w:rPr>
+                <w:b/>
+                <w:bCs/>
+                <w:color w:val="FFFFFF"/>
+              </w:rPr>
+              <w:t>1</w:t>
+            </w:r>
+          </w:p>
+        </w:tc>
+        <w:tc>
+          <w:tcPr>
+            <w:tcW w:w="2600" w:type="dxa"/>
+            <w:tcMar>
+              <w:top w:w="80" w:type="dxa"/>
+              <w:left w:w="100" w:type="dxa"/>
+              <w:bottom w:w="80" w:type="dxa"/>
+              <w:right w:w="100" w:type="dxa"/>
+            </w:tcMar>
+          </w:tcPr>
+          <w:p>
+            <w:r>
+              <w:rPr>
+                <w:b/>
+                <w:bCs/>
+              </w:rPr>
+              <w:t>Status-Auswahl</w:t>
+            </w:r>
+          </w:p>
+        </w:tc>
+        <w:tc>
+          <w:tcPr>
+            <w:tcW w:w="6000" w:type="dxa"/>
+            <w:tcMar>
+              <w:top w:w="80" w:type="dxa"/>
+              <w:left w:w="100" w:type="dxa"/>
+              <w:bottom w:w="80" w:type="dxa"/>
+              <w:right w:w="100" w:type="dxa"/>
+            </w:tcMar>
+          </w:tcPr>
+          <w:p>
+            <w:r>
+              <w:t>Umschalten zwischen „Bestätigt“ und „Warteliste“ für die jeweilige Anmeldung.</w:t>
+            </w:r>
+          </w:p>
+        </w:tc>
+      </w:tr>
+      <w:tr>
+        <w:tblPrEx>
+          <w:tblCellMar>
+            <w:top w:w="0" w:type="dxa"/>
+            <w:bottom w:w="0" w:type="dxa"/>
+          </w:tblCellMar>
+        </w:tblPrEx>
+        <w:trPr>
+          <w:cantSplit/>
+        </w:trPr>
+        <w:tc>
+          <w:tcPr>
+            <w:tcW w:w="700" w:type="dxa"/>
+            <w:shd w:val="clear" w:color="auto" w:fill="A3423A"/>
+            <w:tcMar>
+              <w:top w:w="80" w:type="dxa"/>
+              <w:left w:w="100" w:type="dxa"/>
+              <w:bottom w:w="80" w:type="dxa"/>
+              <w:right w:w="100" w:type="dxa"/>
+            </w:tcMar>
+          </w:tcPr>
+          <w:p>
+            <w:pPr>
+              <w:jc w:val="center"/>
+            </w:pPr>
+            <w:r>
+              <w:rPr>
+                <w:b/>
+                <w:bCs/>
+                <w:color w:val="FFFFFF"/>
+              </w:rPr>
+              <w:t>2</w:t>
+            </w:r>
+          </w:p>
+        </w:tc>
+        <w:tc>
+          <w:tcPr>
+            <w:tcW w:w="2600" w:type="dxa"/>
+            <w:tcMar>
+              <w:top w:w="80" w:type="dxa"/>
+              <w:left w:w="100" w:type="dxa"/>
+              <w:bottom w:w="80" w:type="dxa"/>
+              <w:right w:w="100" w:type="dxa"/>
+            </w:tcMar>
+          </w:tcPr>
+          <w:p>
+            <w:r>
+              <w:rPr>
+                <w:b/>
+                <w:bCs/>
+              </w:rPr>
+              <w:t>Editierbare Felder</w:t>
+            </w:r>
+          </w:p>
+        </w:tc>
+        <w:tc>
+          <w:tcPr>
+            <w:tcW w:w="6000" w:type="dxa"/>
+            <w:tcMar>
+              <w:top w:w="80" w:type="dxa"/>
+              <w:left w:w="100" w:type="dxa"/>
+              <w:bottom w:w="80" w:type="dxa"/>
+              <w:right w:w="100" w:type="dxa"/>
+            </w:tcMar>
+          </w:tcPr>
+          <w:p>
+            <w:r>
+              <w:t>Name, E-Mail, Besucherzahl, Optionen und Gesamtpreis lassen sich direkt in der Tabelle anpassen. Nach Änderungen in einer Zeile muss dort auf „Speichern“ geklickt werden, damit sie übernommen werden (Buttons rechts in jeder Zeile, im Bild durch den Tabelle</w:t>
+            </w:r>
+            <w:r>
+              <w:t>nausschnitt nicht mehr sichtbar). Ein „Löschen“-Button entfernt die Anmeldung unwiderruflich – vorher erscheint eine Sicherheitsabfrage.</w:t>
+            </w:r>
+          </w:p>
+        </w:tc>
+      </w:tr>
+      <w:tr>
+        <w:tblPrEx>
+          <w:tblCellMar>
+            <w:top w:w="0" w:type="dxa"/>
+            <w:bottom w:w="0" w:type="dxa"/>
+          </w:tblCellMar>
+        </w:tblPrEx>
+        <w:trPr>
+          <w:cantSplit/>
+        </w:trPr>
+        <w:tc>
+          <w:tcPr>
+            <w:tcW w:w="700" w:type="dxa"/>
+            <w:shd w:val="clear" w:color="auto" w:fill="A3423A"/>
+            <w:tcMar>
+              <w:top w:w="80" w:type="dxa"/>
+              <w:left w:w="100" w:type="dxa"/>
+              <w:bottom w:w="80" w:type="dxa"/>
+              <w:right w:w="100" w:type="dxa"/>
+            </w:tcMar>
+          </w:tcPr>
+          <w:p>
+            <w:pPr>
+              <w:jc w:val="center"/>
+            </w:pPr>
+            <w:r>
+              <w:rPr>
+                <w:b/>
+                <w:bCs/>
+                <w:color w:val="FFFFFF"/>
+              </w:rPr>
+              <w:t>3</w:t>
+            </w:r>
+          </w:p>
+        </w:tc>
+        <w:tc>
+          <w:tcPr>
+            <w:tcW w:w="2600" w:type="dxa"/>
+            <w:tcMar>
+              <w:top w:w="80" w:type="dxa"/>
+              <w:left w:w="100" w:type="dxa"/>
+              <w:bottom w:w="80" w:type="dxa"/>
+              <w:right w:w="100" w:type="dxa"/>
+            </w:tcMar>
+          </w:tcPr>
+          <w:p>
+            <w:r>
+              <w:rPr>
+                <w:b/>
+                <w:bCs/>
+              </w:rPr>
+              <w:t>CSV herunterladen</w:t>
+            </w:r>
+          </w:p>
+        </w:tc>
+        <w:tc>
+          <w:tcPr>
+            <w:tcW w:w="6000" w:type="dxa"/>
+            <w:tcMar>
+              <w:top w:w="80" w:type="dxa"/>
+              <w:left w:w="100" w:type="dxa"/>
+              <w:bottom w:w="80" w:type="dxa"/>
+              <w:right w:w="100" w:type="dxa"/>
+            </w:tcMar>
+          </w:tcPr>
+          <w:p>
+            <w:r>
+              <w:t>Lädt die aktuell geladene Liste als CSV-Datei herunter, z. B. zur Weiterverarbeitung in einer Tabellenkalkulation.</w:t>
+            </w:r>
+          </w:p>
+        </w:tc>
+      </w:tr>
+    </w:tbl>
+    <w:p>
+      <w:pPr>
+        <w:pStyle w:val="berschrift1"/>
+        <w:keepNext/>
+        <w:keepLines/>
+        <w:spacing w:before="300" w:after="150"/>
+      </w:pPr>
+      <w:bookmarkStart w:id="11" w:name="_Toc240357596"/>
+      <w:r>
+        <w:rPr>
+          <w:b/>
+          <w:bCs/>
+          <w:color w:val="7E2F28"/>
+        </w:rPr>
+        <w:t>10. Use Cases Schritt für Schritt</w:t>
+      </w:r>
+      <w:bookmarkEnd w:id="11"/>
+    </w:p>
+    <w:p>
+      <w:pPr>
+        <w:pStyle w:val="berschrift2"/>
+        <w:keepNext/>
+        <w:keepLines/>
+        <w:spacing w:before="240" w:after="120"/>
+      </w:pPr>
+      <w:bookmarkStart w:id="12" w:name="_Toc240357597"/>
+      <w:r>
+        <w:rPr>
+          <w:b/>
+          <w:bCs/>
+          <w:color w:val="7E2F28"/>
+        </w:rPr>
+        <w:t>10.1 Use Case: Nur Anmeldungen und Inhalte ansehen</w:t>
+      </w:r>
+      <w:bookmarkEnd w:id="12"/>
+    </w:p>
+    <w:p>
+      <w:pPr>
+        <w:keepNext/>
+        <w:spacing w:after="160"/>
+      </w:pPr>
+      <w:r>
+        <w:t>Ziel: Sich einen Überblick verschaffen, ohne versehentl</w:t>
+      </w:r>
+      <w:r>
+        <w:t>ich etwas zu verändern.</w:t>
+      </w:r>
+    </w:p>
+    <w:p>
+      <w:pPr>
+        <w:spacing w:after="80"/>
+      </w:pPr>
+      <w:r>
+        <w:t>1.  admin.html öffnen.</w:t>
+      </w:r>
+    </w:p>
+    <w:p>
+      <w:pPr>
+        <w:spacing w:after="80"/>
+      </w:pPr>
+      <w:r>
+        <w:t>2.  Das Anzeige-Passwort eingeben und auf „Entsperren“ klicken.</w:t>
+      </w:r>
+    </w:p>
+    <w:p>
+      <w:pPr>
+        <w:spacing w:after="80"/>
+      </w:pPr>
+      <w:r>
+        <w:lastRenderedPageBreak/>
+        <w:t xml:space="preserve">3.  </w:t>
+      </w:r>
+      <w:r>
+        <w:t>Inhalte, Logo und Anmeldungen ansehen – alle Felder sind deaktiviert, es kann nichts versehentlich verändert werden.</w:t>
+      </w:r>
+    </w:p>
+    <w:p>
+      <w:pPr>
+        <w:spacing w:after="80"/>
+      </w:pPr>
+      <w:r>
+        <w:t>4.  Optional: Über „CSV herunterladen“ die aktuelle Anmeldungsliste sichern.</w:t>
+      </w:r>
+    </w:p>
+    <w:p>
+      <w:pPr>
+        <w:spacing w:after="160"/>
+      </w:pPr>
+    </w:p>
+    <w:p>
+      <w:pPr>
+        <w:pStyle w:val="berschrift2"/>
+        <w:keepNext/>
+        <w:keepLines/>
+        <w:spacing w:before="240" w:after="120"/>
+      </w:pPr>
+      <w:bookmarkStart w:id="13" w:name="_Toc240357598"/>
+      <w:r>
+        <w:rPr>
+          <w:b/>
+          <w:bCs/>
+          <w:color w:val="7E2F28"/>
+        </w:rPr>
+        <w:t>10.2 Use Case: Inhaltstext ändern und verschachtelte Liste ei</w:t>
+      </w:r>
+      <w:r>
+        <w:rPr>
+          <w:b/>
+          <w:bCs/>
+          <w:color w:val="7E2F28"/>
+        </w:rPr>
+        <w:t>nrücken</w:t>
+      </w:r>
+      <w:bookmarkEnd w:id="13"/>
+    </w:p>
+    <w:p>
+      <w:pPr>
+        <w:keepNext/>
+        <w:spacing w:after="160"/>
+      </w:pPr>
+      <w:r>
+        <w:t>Ziel: Zum Beispiel das Programm mit eingerückten Uhrzeiten unter jedem Tag übersichtlich formatieren.</w:t>
+      </w:r>
+    </w:p>
+    <w:p>
+      <w:pPr>
+        <w:spacing w:after="80"/>
+      </w:pPr>
+      <w:r>
+        <w:t>1.  admin.html öffnen und das Bearbeiten-Passwort eingeben.</w:t>
+      </w:r>
+    </w:p>
+    <w:p>
+      <w:pPr>
+        <w:spacing w:after="80"/>
+      </w:pPr>
+      <w:r>
+        <w:t>2.  Im gewünschten Info-Text-Feld den Text anpassen – dabei die Werkzeugleiste für Fet</w:t>
+      </w:r>
+      <w:r>
+        <w:t>t, Kursiv, Farbe, Listen usw. nutzen.</w:t>
+      </w:r>
+    </w:p>
+    <w:p>
+      <w:pPr>
+        <w:spacing w:after="80"/>
+      </w:pPr>
+      <w:r>
+        <w:t>3.  Cursor in eine Zeile setzen, die unter einer Überschrift eingerückt werden soll (z. B. eine Uhrzeit unter einem Wochentag), und auf „Einrückung erhöhen“ klicken. Mehrfaches Klicken rückt weiter ein.</w:t>
+      </w:r>
+    </w:p>
+    <w:p>
+      <w:pPr>
+        <w:spacing w:after="80"/>
+      </w:pPr>
+      <w:r>
+        <w:t xml:space="preserve">4.  Ganz unten </w:t>
+      </w:r>
+      <w:r>
+        <w:t>im Formular auf „Speichern“ klicken.</w:t>
+      </w:r>
+    </w:p>
+    <w:p>
+      <w:pPr>
+        <w:spacing w:after="80"/>
+      </w:pPr>
+      <w:r>
+        <w:t>5.  Die Bestätigung „Gespeichert – die Änderungen sind live“ abwarten. Die neue Formatierung erscheint direkt auf der öffentlichen Seite und bleibt auch bei künftigen Bearbeitungen erhalten.</w:t>
+      </w:r>
+    </w:p>
+    <w:p>
+      <w:pPr>
+        <w:spacing w:after="160"/>
+      </w:pPr>
+    </w:p>
+    <w:p>
+      <w:pPr>
+        <w:pStyle w:val="berschrift2"/>
+        <w:keepNext/>
+        <w:keepLines/>
+        <w:spacing w:before="240" w:after="120"/>
+      </w:pPr>
+      <w:bookmarkStart w:id="14" w:name="_Toc240357599"/>
+      <w:r>
+        <w:rPr>
+          <w:b/>
+          <w:bCs/>
+          <w:color w:val="7E2F28"/>
+        </w:rPr>
+        <w:t>10.3 Use Case: Link oder Go</w:t>
+      </w:r>
+      <w:r>
+        <w:rPr>
+          <w:b/>
+          <w:bCs/>
+          <w:color w:val="7E2F28"/>
+        </w:rPr>
+        <w:t>ogle-Maps-Adresse einfügen</w:t>
+      </w:r>
+      <w:bookmarkEnd w:id="14"/>
+    </w:p>
+    <w:p>
+      <w:pPr>
+        <w:keepNext/>
+        <w:spacing w:after="160"/>
+      </w:pPr>
+      <w:r>
+        <w:t>Ziel: Z. B. einen Anfahrtslink zu Google Maps im Zusatztext hinterlegen.</w:t>
+      </w:r>
+    </w:p>
+    <w:p>
+      <w:pPr>
+        <w:spacing w:after="80"/>
+      </w:pPr>
+      <w:r>
+        <w:t>1.  Im Bearbeiten-Modus zum gewünschten Textfeld scrollen (z. B. Zusatztext 2) und den Text bzw. die Adresse eintippen.</w:t>
+      </w:r>
+    </w:p>
+    <w:p>
+      <w:pPr>
+        <w:spacing w:after="80"/>
+      </w:pPr>
+      <w:r>
+        <w:t>2.  Den Text markieren, der zum Link</w:t>
+      </w:r>
+      <w:r>
+        <w:t xml:space="preserve"> werden soll, und in der Werkzeugleiste auf das Kettensymbol klicken.</w:t>
+      </w:r>
+    </w:p>
+    <w:p>
+      <w:pPr>
+        <w:spacing w:after="80"/>
+      </w:pPr>
+      <w:r>
+        <w:t>3.  Die vollständige Adresse eintragen – https://… für einen normalen Link, mailto:… für einen Mail-Link – und bestätigen.</w:t>
+      </w:r>
+    </w:p>
+    <w:p>
+      <w:pPr>
+        <w:spacing w:after="80"/>
+      </w:pPr>
+      <w:r>
+        <w:t>4.  Auf „Speichern“ klicken. Der Link ist danach klickbar und ö</w:t>
+      </w:r>
+      <w:r>
+        <w:t>ffnet sich in einem neuen Tab (bei mailto: im Mailprogramm).</w:t>
+      </w:r>
+    </w:p>
+    <w:p>
+      <w:pPr>
+        <w:spacing w:after="160"/>
+      </w:pPr>
+    </w:p>
+    <w:p>
+      <w:pPr>
+        <w:pStyle w:val="berschrift2"/>
+        <w:keepNext/>
+        <w:keepLines/>
+        <w:spacing w:before="240" w:after="120"/>
+      </w:pPr>
+      <w:bookmarkStart w:id="15" w:name="_Toc240357600"/>
+      <w:r>
+        <w:rPr>
+          <w:b/>
+          <w:bCs/>
+          <w:color w:val="7E2F28"/>
+        </w:rPr>
+        <w:t>10.4 Use Case: Logo austauschen</w:t>
+      </w:r>
+      <w:bookmarkEnd w:id="15"/>
+    </w:p>
+    <w:p>
+      <w:pPr>
+        <w:keepNext/>
+        <w:spacing w:after="160"/>
+      </w:pPr>
+      <w:r>
+        <w:t>Ziel: Ein neues Bild als Logo, Favicon und Vorschaubild festlegen.</w:t>
+      </w:r>
+    </w:p>
+    <w:p>
+      <w:pPr>
+        <w:spacing w:after="80"/>
+      </w:pPr>
+      <w:r>
+        <w:t>1.  Im Bearbeiten-Modus im Bereich „Logo / Icon“ auf „Datei auswählen“ klicken.</w:t>
+      </w:r>
+    </w:p>
+    <w:p>
+      <w:pPr>
+        <w:spacing w:after="80"/>
+      </w:pPr>
+      <w:r>
+        <w:t>2.  Eine PNG-Da</w:t>
+      </w:r>
+      <w:r>
+        <w:t>tei wählen (möglichst quadratisch, max. 2 MB). Die Vorschau aktualisiert sich sofort – dies ist aber noch nicht gespeichert.</w:t>
+      </w:r>
+    </w:p>
+    <w:p>
+      <w:pPr>
+        <w:spacing w:after="80"/>
+      </w:pPr>
+      <w:r>
+        <w:t>3.  Auf „Logo hochladen“ klicken. Erst danach ist das neue Bild live sichtbar – im Header, als Favicon und als Vorschaubild beim Te</w:t>
+      </w:r>
+      <w:r>
+        <w:t>ilen des Links.</w:t>
+      </w:r>
+    </w:p>
+    <w:p>
+      <w:pPr>
+        <w:spacing w:after="160"/>
+      </w:pPr>
+    </w:p>
+    <w:p>
+      <w:pPr>
+        <w:pStyle w:val="berschrift2"/>
+        <w:keepNext/>
+        <w:keepLines/>
+        <w:spacing w:before="240" w:after="120"/>
+      </w:pPr>
+      <w:bookmarkStart w:id="16" w:name="_Toc240357601"/>
+      <w:r>
+        <w:rPr>
+          <w:b/>
+          <w:bCs/>
+          <w:color w:val="7E2F28"/>
+        </w:rPr>
+        <w:t>10.5 Use Case: Neue Option (Programmpunkt) hinzufügen</w:t>
       </w:r>
       <w:bookmarkEnd w:id="16"/>
+    </w:p>
+    <w:p>
+      <w:pPr>
+        <w:keepNext/>
+        <w:spacing w:after="160"/>
+      </w:pPr>
+      <w:r>
+        <w:t>Ziel: Einen zusätzlichen buchbaren Programmpunkt mit Preis anlegen.</w:t>
+      </w:r>
+    </w:p>
+    <w:p>
+      <w:pPr>
+        <w:spacing w:after="80"/>
+      </w:pPr>
+      <w:r>
+        <w:t xml:space="preserve">1.  </w:t>
+      </w:r>
+      <w:r>
+        <w:t>Im Bearbeiten-Modus zum Bereich „Optionen“ scrollen und auf „+ Option hinzufügen“ klicken.</w:t>
+      </w:r>
+    </w:p>
+    <w:p>
+      <w:pPr>
+        <w:spacing w:after="80"/>
+      </w:pPr>
+      <w:r>
+        <w:lastRenderedPageBreak/>
+        <w:t>2.  In der neuen, leeren Zeile Bezeichnung und Preis eintragen.</w:t>
+      </w:r>
+    </w:p>
+    <w:p>
+      <w:pPr>
+        <w:spacing w:after="80"/>
+      </w:pPr>
+      <w:r>
+        <w:t>3.  Auf „Speichern“ klicken. Die neue Option erscheint danach auf der Anmeldeseite zur Auswahl.</w:t>
+      </w:r>
+    </w:p>
+    <w:p>
+      <w:pPr>
+        <w:spacing w:after="160"/>
+      </w:pPr>
+    </w:p>
+    <w:p>
+      <w:pPr>
+        <w:pStyle w:val="berschrift2"/>
+        <w:keepNext/>
+        <w:keepLines/>
+        <w:spacing w:before="240" w:after="120"/>
+      </w:pPr>
+      <w:bookmarkStart w:id="17" w:name="_Toc240357602"/>
+      <w:r>
+        <w:rPr>
+          <w:b/>
+          <w:bCs/>
+          <w:color w:val="7E2F28"/>
+        </w:rPr>
+        <w:t>10.6</w:t>
+      </w:r>
+      <w:r>
+        <w:rPr>
+          <w:b/>
+          <w:bCs/>
+          <w:color w:val="7E2F28"/>
+        </w:rPr>
+        <w:t xml:space="preserve"> Use Case: Impressum oder Datenschutz aktualisieren</w:t>
+      </w:r>
+      <w:bookmarkEnd w:id="17"/>
+    </w:p>
+    <w:p>
+      <w:pPr>
+        <w:keepNext/>
+        <w:spacing w:after="160"/>
+      </w:pPr>
+      <w:r>
+        <w:t>Ziel: Den anfänglichen Platzhaltertext durch die echten rechtlichen Angaben ersetzen.</w:t>
+      </w:r>
+    </w:p>
+    <w:p>
+      <w:pPr>
+        <w:spacing w:after="80"/>
+      </w:pPr>
+      <w:r>
+        <w:t>1.  Im Bearbeiten-Modus zum Bereich „Rechtliches“ scrollen.</w:t>
+      </w:r>
+    </w:p>
+    <w:p>
+      <w:pPr>
+        <w:spacing w:after="80"/>
+      </w:pPr>
+      <w:r>
+        <w:t>2.  Im Impressum- bzw. Datenschutz-Editor den kompletten P</w:t>
+      </w:r>
+      <w:r>
+        <w:t>latzhaltertext markieren und durch den echten Text ersetzen.</w:t>
+      </w:r>
+    </w:p>
+    <w:p>
+      <w:pPr>
+        <w:spacing w:after="80"/>
+      </w:pPr>
+      <w:r>
+        <w:t>3.  Auf „Speichern“ klicken. Die Änderungen erscheinen sofort auf impressum.html bzw. datenschutz.html.</w:t>
+      </w:r>
+    </w:p>
+    <w:p>
+      <w:pPr>
+        <w:spacing w:after="160"/>
+      </w:pPr>
+    </w:p>
+    <w:p>
+      <w:pPr>
+        <w:pStyle w:val="berschrift2"/>
+        <w:keepNext/>
+        <w:keepLines/>
+        <w:spacing w:before="240" w:after="120"/>
+      </w:pPr>
+      <w:bookmarkStart w:id="18" w:name="_Toc240357603"/>
+      <w:r>
+        <w:rPr>
+          <w:b/>
+          <w:bCs/>
+          <w:color w:val="7E2F28"/>
+        </w:rPr>
+        <w:t>10.7 Use Case: Passwörter ändern</w:t>
+      </w:r>
+      <w:bookmarkEnd w:id="18"/>
+    </w:p>
+    <w:p>
+      <w:pPr>
+        <w:keepNext/>
+        <w:spacing w:after="160"/>
+      </w:pPr>
+      <w:r>
+        <w:t>Ziel: Aus Sicherheitsgründen regelmäßig neue Passwörter v</w:t>
+      </w:r>
+      <w:r>
+        <w:t>ergeben.</w:t>
+      </w:r>
+    </w:p>
+    <w:p>
+      <w:pPr>
+        <w:spacing w:after="80"/>
+      </w:pPr>
+      <w:r>
+        <w:t>1.  Im Bearbeiten-Modus zum Bereich „Passwörter ändern“ scrollen.</w:t>
+      </w:r>
+    </w:p>
+    <w:p>
+      <w:pPr>
+        <w:spacing w:after="80"/>
+      </w:pPr>
+      <w:r>
+        <w:t>2.  Nur das gewünschte neue Passwort eintragen (Anzeige-, Bearbeiten- oder beide) – nicht benötigte Felder leer lassen.</w:t>
+      </w:r>
+    </w:p>
+    <w:p>
+      <w:pPr>
+        <w:spacing w:after="80"/>
+      </w:pPr>
+      <w:r>
+        <w:t>3.  Auf „Passwörter speichern“ klicken und die Bestätigung ab</w:t>
+      </w:r>
+      <w:r>
+        <w:t>warten. Neue Passwörter an einem sicheren Ort notieren, bevor der Admin-Bereich verlassen wird.</w:t>
+      </w:r>
+    </w:p>
+    <w:p>
+      <w:pPr>
+        <w:spacing w:after="160"/>
+      </w:pPr>
+    </w:p>
+    <w:p>
+      <w:pPr>
+        <w:pStyle w:val="berschrift2"/>
+        <w:keepNext/>
+        <w:keepLines/>
+        <w:spacing w:before="240" w:after="120"/>
+      </w:pPr>
+      <w:bookmarkStart w:id="19" w:name="_Toc240357604"/>
+      <w:r>
+        <w:rPr>
+          <w:b/>
+          <w:bCs/>
+          <w:color w:val="7E2F28"/>
+        </w:rPr>
+        <w:t>10.8 Use Case: Eine Anmeldung bearbeiten oder löschen</w:t>
+      </w:r>
+      <w:bookmarkEnd w:id="19"/>
+    </w:p>
+    <w:p>
+      <w:pPr>
+        <w:keepNext/>
+        <w:spacing w:after="160"/>
+      </w:pPr>
+      <w:r>
+        <w:t>Ziel: Z. B. eine Anmeldung von der Warteliste auf „Bestätigt“ setzen oder eine fehlerhafte Anmeldung entf</w:t>
+      </w:r>
+      <w:r>
+        <w:t>ernen.</w:t>
+      </w:r>
+    </w:p>
+    <w:p>
+      <w:pPr>
+        <w:spacing w:after="80"/>
+      </w:pPr>
+      <w:r>
+        <w:t>1.  Im Bearbeiten-Modus zum Bereich „Anmeldungen“ scrollen und die passende Zeile suchen.</w:t>
+      </w:r>
+    </w:p>
+    <w:p>
+      <w:pPr>
+        <w:spacing w:after="80"/>
+      </w:pPr>
+      <w:r>
+        <w:t>2.  Zum Ändern: Status, Name, E-Mail, Besucherzahl, Optionen oder Gesamtpreis direkt in der Zeile anpassen und in dieser Zeile auf „Speichern“ klicken.</w:t>
+      </w:r>
+    </w:p>
+    <w:p>
+      <w:pPr>
+        <w:spacing w:after="80"/>
+      </w:pPr>
+      <w:r>
+        <w:t>3.  Zum</w:t>
+      </w:r>
+      <w:r>
+        <w:t xml:space="preserve"> Löschen: In derselben Zeile auf „Löschen“ klicken und die Sicherheitsabfrage bestätigen. Dieser Schritt kann nicht rückgängig gemacht werden.</w:t>
+      </w:r>
+    </w:p>
+    <w:p>
+      <w:pPr>
+        <w:pStyle w:val="berschrift1"/>
+        <w:keepNext/>
+        <w:keepLines/>
+        <w:spacing w:before="300" w:after="150"/>
+      </w:pPr>
+      <w:bookmarkStart w:id="20" w:name="_Toc240357605"/>
+      <w:r>
+        <w:rPr>
+          <w:b/>
+          <w:bCs/>
+          <w:color w:val="7E2F28"/>
+        </w:rPr>
+        <w:t>11. Kurz zusammengefasst</w:t>
+      </w:r>
+      <w:bookmarkEnd w:id="20"/>
     </w:p>
     <w:p>
       <w:pPr>
@@ -5123,17 +6107,28 @@
           <w:b/>
           <w:bCs/>
         </w:rPr>
-        <w:t>•  Ändern und Speic</w:t>
-      </w:r>
+        <w:t xml:space="preserve">•  Ändern und Speichern: </w:t>
+      </w:r>
+      <w:r>
+        <w:t>Bearbeiten-Passwort verwenden – Inhalte, Logo, Optionen, Zusatztexte, Rechtliches und Anmeldungen lassen sich bearbeiten; jede Änderung muss über den jeweiligen „Speichern“-Button bestätigt werden.</w:t>
+      </w:r>
+    </w:p>
+    <w:p>
+      <w:pPr>
+        <w:spacing w:after="80"/>
+      </w:pPr>
       <w:r>
         <w:rPr>
           <w:b/>
           <w:bCs/>
         </w:rPr>
-        <w:t xml:space="preserve">hern: </w:t>
-      </w:r>
-      <w:r>
-        <w:t>Bearbeiten-Passwort verwenden – Inhalte, Logo, Optionen und Anmeldungen lassen sich bearbeiten; jede Änderung muss über den jeweiligen „Speichern“-Button bestätigt werden.</w:t>
+        <w:t xml:space="preserve">•  Formatierung: </w:t>
+      </w:r>
+      <w:r>
+        <w:t>Fett, Kursiv, Fa</w:t>
+      </w:r>
+      <w:r>
+        <w:t>rbe, Listen, Einrückung und Links stehen in allen Rich-Text-Feldern zur Verfügung; die Einrückung übersteht dank fester Formatierung beliebig viele weitere Bearbeitungen.</w:t>
       </w:r>
     </w:p>
     <w:p>
@@ -5148,10 +6143,7 @@
         <w:t xml:space="preserve">•  Sicherheit: </w:t>
       </w:r>
       <w:r>
-        <w:t>Rich-Text-Inhalte werden beim Speichern serverseitig auf erlaub</w:t>
-      </w:r>
-      <w:r>
-        <w:t>te Formatierungen geprüft; zum Ändern der Passwörter ist stets das aktuelle Bearbeiten-Passwort nötig.</w:t>
+        <w:t>Rich-Text-Inhalte werden beim Speichern serverseitig auf erlaubte Formatierungen geprüft (nur https:// und mailto:-Links); zum Ändern der Passwörter ist stets das aktuelle Bearbeiten-Passwort nötig.</w:t>
       </w:r>
     </w:p>
     <w:sectPr>
@@ -5167,10 +6159,10 @@
 <file path=word/numbering.xml><?xml version="1.0" encoding="utf-8"?>
 <w:numbering xmlns:wpc="http://schemas.microsoft.com/office/word/2010/wordprocessingCanvas" xmlns:cx="http://schemas.microsoft.com/office/drawing/2014/chartex" xmlns:cx1="http://schemas.microsoft.com/office/drawing/2015/9/8/chartex" xmlns:cx2="http://schemas.microsoft.com/office/drawing/2015/10/21/chartex" xmlns:cx3="http://schemas.microsoft.com/office/drawing/2016/5/9/chartex" xmlns:cx4="http://schemas.microsoft.com/office/drawing/2016/5/10/chartex" xmlns:cx5="http://schemas.microsoft.com/office/drawing/2016/5/11/chartex" xmlns:cx6="http://schemas.microsoft.com/office/drawing/2016/5/12/chartex" xmlns:cx7="http://schemas.microsoft.com/office/drawing/2016/5/13/chartex" xmlns:cx8="http://schemas.microsoft.com/office/drawing/2016/5/14/chartex" xmlns:mc="http://schemas.openxmlformats.org/markup-compatibility/2006" xmlns:aink="http://schemas.microsoft.com/office/drawing/2016/ink" xmlns:am3d="http://schemas.microsoft.com/office/drawing/2017/model3d" xmlns:o="urn:schemas-microsoft-com:office:office" xmlns:r="http://schemas.openxmlformats.org/officeDocument/2006/relationships" xmlns:m="http://schemas.openxmlformats.org/officeDocument/2006/math" xmlns:v="urn:schemas-microsoft-com:vml" xmlns:wp14="http://schemas.microsoft.com/office/word/2010/wordprocessingDrawing" xmlns:wp="http://schemas.openxmlformats.org/drawingml/2006/wordprocessingDrawing" xmlns:w10="urn:schemas-microsoft-com:office:word" xmlns:w="http://schemas.openxmlformats.org/wordprocessingml/2006/main" xmlns:w14="http://schemas.microsoft.com/office/word/2010/wordml" xmlns:w15="http://schemas.microsoft.com/office/word/2012/wordml" xmlns:w16cex="http://schemas.microsoft.com/office/word/2018/wordml/cex" xmlns:w16cid="http://schemas.microsoft.com/office/word/2016/wordml/cid" xmlns:w16="http://schemas.microsoft.com/office/word/2018/wordml" xmlns:w16sdtdh="http://schemas.microsoft.com/office/word/2020/wordml/sdtdatahash" xmlns:w16se="http://schemas.microsoft.com/office/word/2015/wordml/symex" xmlns:wpg="http://schemas.microsoft.com/office/word/2010/wordprocessingGroup" xmlns:wpi="http://schemas.microsoft.com/office/word/2010/wordprocessingInk" xmlns:wne="http://schemas.microsoft.com/office/word/2006/wordml" xmlns:wps="http://schemas.microsoft.com/office/word/2010/wordprocessingShape" mc:Ignorable="w14 w15 w16se w16cid w16 w16cex w16sdtdh wp14">
   <w:abstractNum w:abstractNumId="0" w15:restartNumberingAfterBreak="0">
-    <w:nsid w:val="0FC403A8"/>
+    <w:nsid w:val="78983D89"/>
     <w:multiLevelType w:val="hybridMultilevel"/>
-    <w:tmpl w:val="E71CA850"/>
-    <w:lvl w:ilvl="0" w:tplc="A54865A0">
+    <w:tmpl w:val="CC9AB53E"/>
+    <w:lvl w:ilvl="0" w:tplc="92DEBDF4">
       <w:start w:val="1"/>
       <w:numFmt w:val="bullet"/>
       <w:lvlText w:val="●"/>
@@ -5179,7 +6171,7 @@
         <w:ind w:left="720" w:hanging="360"/>
       </w:pPr>
     </w:lvl>
-    <w:lvl w:ilvl="1" w:tplc="31D412DE">
+    <w:lvl w:ilvl="1" w:tplc="CBDAE77C">
       <w:start w:val="1"/>
       <w:numFmt w:val="bullet"/>
       <w:lvlText w:val="○"/>
@@ -5188,7 +6180,7 @@
         <w:ind w:left="1440" w:hanging="360"/>
       </w:pPr>
     </w:lvl>
-    <w:lvl w:ilvl="2" w:tplc="4502B7D0">
+    <w:lvl w:ilvl="2" w:tplc="3E70DD34">
       <w:start w:val="1"/>
       <w:numFmt w:val="bullet"/>
       <w:lvlText w:val="■"/>
@@ -5197,7 +6189,7 @@
         <w:ind w:left="2160" w:hanging="360"/>
       </w:pPr>
     </w:lvl>
-    <w:lvl w:ilvl="3" w:tplc="3BEE9566">
+    <w:lvl w:ilvl="3" w:tplc="C77C7244">
       <w:start w:val="1"/>
       <w:numFmt w:val="bullet"/>
       <w:lvlText w:val="●"/>
@@ -5206,7 +6198,7 @@
         <w:ind w:left="2880" w:hanging="360"/>
       </w:pPr>
     </w:lvl>
-    <w:lvl w:ilvl="4" w:tplc="DA10552A">
+    <w:lvl w:ilvl="4" w:tplc="1DC8EB2E">
       <w:start w:val="1"/>
       <w:numFmt w:val="bullet"/>
       <w:lvlText w:val="○"/>
@@ -5215,7 +6207,7 @@
         <w:ind w:left="3600" w:hanging="360"/>
       </w:pPr>
     </w:lvl>
-    <w:lvl w:ilvl="5" w:tplc="9B5C89F2">
+    <w:lvl w:ilvl="5" w:tplc="07ACBB04">
       <w:start w:val="1"/>
       <w:numFmt w:val="bullet"/>
       <w:lvlText w:val="■"/>
@@ -5224,7 +6216,7 @@
         <w:ind w:left="4320" w:hanging="360"/>
       </w:pPr>
     </w:lvl>
-    <w:lvl w:ilvl="6" w:tplc="AB821398">
+    <w:lvl w:ilvl="6" w:tplc="1B38A6E6">
       <w:start w:val="1"/>
       <w:numFmt w:val="bullet"/>
       <w:lvlText w:val="●"/>
@@ -5233,7 +6225,7 @@
         <w:ind w:left="5040" w:hanging="360"/>
       </w:pPr>
     </w:lvl>
-    <w:lvl w:ilvl="7" w:tplc="2D684D16">
+    <w:lvl w:ilvl="7" w:tplc="614C1B8A">
       <w:start w:val="1"/>
       <w:numFmt w:val="bullet"/>
       <w:lvlText w:val="●"/>
@@ -5242,7 +6234,7 @@
         <w:ind w:left="5760" w:hanging="360"/>
       </w:pPr>
     </w:lvl>
-    <w:lvl w:ilvl="8" w:tplc="A328ADF6">
+    <w:lvl w:ilvl="8" w:tplc="EC0889FE">
       <w:start w:val="1"/>
       <w:numFmt w:val="bullet"/>
       <w:lvlText w:val="●"/>
@@ -5865,7 +6857,7 @@
     <w:autoRedefine/>
     <w:uiPriority w:val="39"/>
     <w:unhideWhenUsed/>
-    <w:rsid w:val="00B817D7"/>
+    <w:rsid w:val="00D71D55"/>
     <w:pPr>
       <w:spacing w:after="100"/>
     </w:pPr>
@@ -5877,7 +6869,7 @@
     <w:autoRedefine/>
     <w:uiPriority w:val="39"/>
     <w:unhideWhenUsed/>
-    <w:rsid w:val="00B817D7"/>
+    <w:rsid w:val="00D71D55"/>
     <w:pPr>
       <w:spacing w:after="100"/>
       <w:ind w:left="220"/>

</xml_diff>

<commit_message>
Update both guides for the Anfahrtsplan feature and Navigation reorder
Refreshed screenshots and rewrote the affected sections: new
Anfahrtsplan upload area in the admin guide, and the Navigation/
Kontakt block now documented in its new position before the
registration block in the anmeldeseite guide.

Co-Authored-By: Claude Sonnet 5 <noreply@anthropic.com>
</commit_message>
<xml_diff>
--- a/docs/Anleitung-Admin.docx
+++ b/docs/Anleitung-Admin.docx
@@ -30,7 +30,7 @@
         <w:rPr>
           <w:color w:val="6B5C52"/>
         </w:rPr>
-        <w:t>tztexte, der rechtlichen Seiten (Impressum/Datenschutz) und der Anmeldungen.</w:t>
+        <w:t>tztexte, des Anfahrtsplan-Bilds, der rechtlichen Seiten (Impressum/Datenschutz) und der Anmeldungen.</w:t>
       </w:r>
     </w:p>
     <w:p>
@@ -51,7 +51,7 @@
     <w:sdt>
       <w:sdtPr>
         <w:alias w:val="Inhaltsverzeichnis"/>
-        <w:id w:val="-1696838726"/>
+        <w:id w:val="-1592620157"/>
       </w:sdtPr>
       <w:sdtEndPr/>
       <w:sdtContent>
@@ -75,7 +75,7 @@
           <w:r>
             <w:fldChar w:fldCharType="separate"/>
           </w:r>
-          <w:hyperlink w:anchor="_Toc240357585" w:history="1">
+          <w:hyperlink w:anchor="_Toc240368839" w:history="1">
             <w:r>
               <w:rPr>
                 <w:rStyle w:val="Hyperlink"/>
@@ -101,7 +101,7 @@
               <w:rPr>
                 <w:noProof/>
               </w:rPr>
-              <w:instrText xml:space="preserve"> PAGEREF _Toc240357585 \h </w:instrText>
+              <w:instrText xml:space="preserve"> PAGEREF _Toc240368839 \h </w:instrText>
             </w:r>
             <w:r>
               <w:rPr>
@@ -139,7 +139,7 @@
               <w:noProof/>
             </w:rPr>
           </w:pPr>
-          <w:hyperlink w:anchor="_Toc240357586" w:history="1">
+          <w:hyperlink w:anchor="_Toc240368840" w:history="1">
             <w:r>
               <w:rPr>
                 <w:rStyle w:val="Hyperlink"/>
@@ -165,7 +165,7 @@
               <w:rPr>
                 <w:noProof/>
               </w:rPr>
-              <w:instrText xml:space="preserve"> PAGEREF _Toc240357586 \h </w:instrText>
+              <w:instrText xml:space="preserve"> PAGEREF _Toc240368840 \h </w:instrText>
             </w:r>
             <w:r>
               <w:rPr>
@@ -203,7 +203,7 @@
               <w:noProof/>
             </w:rPr>
           </w:pPr>
-          <w:hyperlink w:anchor="_Toc240357587" w:history="1">
+          <w:hyperlink w:anchor="_Toc240368841" w:history="1">
             <w:r>
               <w:rPr>
                 <w:rStyle w:val="Hyperlink"/>
@@ -229,7 +229,7 @@
               <w:rPr>
                 <w:noProof/>
               </w:rPr>
-              <w:instrText xml:space="preserve"> PAGEREF _Toc240357587 \h </w:instrText>
+              <w:instrText xml:space="preserve"> PAGEREF _Toc240368841 \h </w:instrText>
             </w:r>
             <w:r>
               <w:rPr>
@@ -267,7 +267,7 @@
               <w:noProof/>
             </w:rPr>
           </w:pPr>
-          <w:hyperlink w:anchor="_Toc240357588" w:history="1">
+          <w:hyperlink w:anchor="_Toc240368842" w:history="1">
             <w:r>
               <w:rPr>
                 <w:rStyle w:val="Hyperlink"/>
@@ -293,7 +293,7 @@
               <w:rPr>
                 <w:noProof/>
               </w:rPr>
-              <w:instrText xml:space="preserve"> PAGEREF _Toc240357588 \h </w:instrText>
+              <w:instrText xml:space="preserve"> PAGEREF _Toc240368842 \h </w:instrText>
             </w:r>
             <w:r>
               <w:rPr>
@@ -331,7 +331,7 @@
               <w:noProof/>
             </w:rPr>
           </w:pPr>
-          <w:hyperlink w:anchor="_Toc240357589" w:history="1">
+          <w:hyperlink w:anchor="_Toc240368843" w:history="1">
             <w:r>
               <w:rPr>
                 <w:rStyle w:val="Hyperlink"/>
@@ -357,7 +357,7 @@
               <w:rPr>
                 <w:noProof/>
               </w:rPr>
-              <w:instrText xml:space="preserve"> PAGEREF _Toc240357589 \h </w:instrText>
+              <w:instrText xml:space="preserve"> PAGEREF _Toc240368843 \h </w:instrText>
             </w:r>
             <w:r>
               <w:rPr>
@@ -395,7 +395,7 @@
               <w:noProof/>
             </w:rPr>
           </w:pPr>
-          <w:hyperlink w:anchor="_Toc240357590" w:history="1">
+          <w:hyperlink w:anchor="_Toc240368844" w:history="1">
             <w:r>
               <w:rPr>
                 <w:rStyle w:val="Hyperlink"/>
@@ -421,7 +421,7 @@
               <w:rPr>
                 <w:noProof/>
               </w:rPr>
-              <w:instrText xml:space="preserve"> PAGEREF _Toc240357590 \h </w:instrText>
+              <w:instrText xml:space="preserve"> PAGEREF _Toc240368844 \h </w:instrText>
             </w:r>
             <w:r>
               <w:rPr>
@@ -459,7 +459,7 @@
               <w:noProof/>
             </w:rPr>
           </w:pPr>
-          <w:hyperlink w:anchor="_Toc240357591" w:history="1">
+          <w:hyperlink w:anchor="_Toc240368845" w:history="1">
             <w:r>
               <w:rPr>
                 <w:rStyle w:val="Hyperlink"/>
@@ -485,7 +485,7 @@
               <w:rPr>
                 <w:noProof/>
               </w:rPr>
-              <w:instrText xml:space="preserve"> PAGEREF _Toc240357591 \h </w:instrText>
+              <w:instrText xml:space="preserve"> PAGEREF _Toc240368845 \h </w:instrText>
             </w:r>
             <w:r>
               <w:rPr>
@@ -523,7 +523,7 @@
               <w:noProof/>
             </w:rPr>
           </w:pPr>
-          <w:hyperlink w:anchor="_Toc240357592" w:history="1">
+          <w:hyperlink w:anchor="_Toc240368846" w:history="1">
             <w:r>
               <w:rPr>
                 <w:rStyle w:val="Hyperlink"/>
@@ -549,7 +549,7 @@
               <w:rPr>
                 <w:noProof/>
               </w:rPr>
-              <w:instrText xml:space="preserve"> PAGEREF _Toc240357592 \h </w:instrText>
+              <w:instrText xml:space="preserve"> PAGEREF _Toc240368846 \h </w:instrText>
             </w:r>
             <w:r>
               <w:rPr>
@@ -587,7 +587,7 @@
               <w:noProof/>
             </w:rPr>
           </w:pPr>
-          <w:hyperlink w:anchor="_Toc240357593" w:history="1">
+          <w:hyperlink w:anchor="_Toc240368847" w:history="1">
             <w:r>
               <w:rPr>
                 <w:rStyle w:val="Hyperlink"/>
@@ -595,7 +595,7 @@
                 <w:bCs/>
                 <w:noProof/>
               </w:rPr>
-              <w:t>7. Bearbeiten-Modus: Zusatztexte und Rechtliches</w:t>
+              <w:t>7. Bearbeiten-Modus: Zusatztexte und Anfahrtsplan</w:t>
             </w:r>
             <w:r>
               <w:rPr>
@@ -613,7 +613,7 @@
               <w:rPr>
                 <w:noProof/>
               </w:rPr>
-              <w:instrText xml:space="preserve"> PAGEREF _Toc240357593 \h </w:instrText>
+              <w:instrText xml:space="preserve"> PAGEREF _Toc240368847 \h </w:instrText>
             </w:r>
             <w:r>
               <w:rPr>
@@ -651,7 +651,7 @@
               <w:noProof/>
             </w:rPr>
           </w:pPr>
-          <w:hyperlink w:anchor="_Toc240357594" w:history="1">
+          <w:hyperlink w:anchor="_Toc240368848" w:history="1">
             <w:r>
               <w:rPr>
                 <w:rStyle w:val="Hyperlink"/>
@@ -659,7 +659,7 @@
                 <w:bCs/>
                 <w:noProof/>
               </w:rPr>
-              <w:t>8. Bearbeiten-Modus: Datenschutz speichern und Passwörter ändern</w:t>
+              <w:t>8. Bearbeiten-Modus: Rechtliches (Impressum und Datenschutz)</w:t>
             </w:r>
             <w:r>
               <w:rPr>
@@ -677,7 +677,7 @@
               <w:rPr>
                 <w:noProof/>
               </w:rPr>
-              <w:instrText xml:space="preserve"> PAGEREF _Toc240357594 \h </w:instrText>
+              <w:instrText xml:space="preserve"> PAGEREF _Toc240368848 \h </w:instrText>
             </w:r>
             <w:r>
               <w:rPr>
@@ -715,7 +715,7 @@
               <w:noProof/>
             </w:rPr>
           </w:pPr>
-          <w:hyperlink w:anchor="_Toc240357595" w:history="1">
+          <w:hyperlink w:anchor="_Toc240368849" w:history="1">
             <w:r>
               <w:rPr>
                 <w:rStyle w:val="Hyperlink"/>
@@ -723,7 +723,7 @@
                 <w:bCs/>
                 <w:noProof/>
               </w:rPr>
-              <w:t>9. Bearbeiten-Modus: Anmeldungen verwalten</w:t>
+              <w:t>9. Bearbeiten-Modus: Passwörter ändern</w:t>
             </w:r>
             <w:r>
               <w:rPr>
@@ -741,7 +741,7 @@
               <w:rPr>
                 <w:noProof/>
               </w:rPr>
-              <w:instrText xml:space="preserve"> PAGEREF _Toc240357595 \h </w:instrText>
+              <w:instrText xml:space="preserve"> PAGEREF _Toc240368849 \h </w:instrText>
             </w:r>
             <w:r>
               <w:rPr>
@@ -779,7 +779,7 @@
               <w:noProof/>
             </w:rPr>
           </w:pPr>
-          <w:hyperlink w:anchor="_Toc240357596" w:history="1">
+          <w:hyperlink w:anchor="_Toc240368850" w:history="1">
             <w:r>
               <w:rPr>
                 <w:rStyle w:val="Hyperlink"/>
@@ -787,7 +787,7 @@
                 <w:bCs/>
                 <w:noProof/>
               </w:rPr>
-              <w:t>10. Use Cases Schritt für Schritt</w:t>
+              <w:t>10. Bearbeiten-Modus: Anmeldungen verwalten</w:t>
             </w:r>
             <w:r>
               <w:rPr>
@@ -805,7 +805,7 @@
               <w:rPr>
                 <w:noProof/>
               </w:rPr>
-              <w:instrText xml:space="preserve"> PAGEREF _Toc240357596 \h </w:instrText>
+              <w:instrText xml:space="preserve"> PAGEREF _Toc240368850 \h </w:instrText>
             </w:r>
             <w:r>
               <w:rPr>
@@ -822,7 +822,71 @@
               <w:rPr>
                 <w:noProof/>
               </w:rPr>
-              <w:t>10</w:t>
+              <w:t>11</w:t>
+            </w:r>
+            <w:r>
+              <w:rPr>
+                <w:noProof/>
+              </w:rPr>
+              <w:fldChar w:fldCharType="end"/>
+            </w:r>
+          </w:hyperlink>
+        </w:p>
+        <w:p>
+          <w:pPr>
+            <w:pStyle w:val="Verzeichnis1"/>
+            <w:tabs>
+              <w:tab w:val="right" w:leader="dot" w:pos="9016"/>
+            </w:tabs>
+            <w:rPr>
+              <w:rFonts w:asciiTheme="minorHAnsi" w:eastAsiaTheme="minorEastAsia" w:hAnsiTheme="minorHAnsi" w:cstheme="minorBidi"/>
+              <w:noProof/>
+            </w:rPr>
+          </w:pPr>
+          <w:hyperlink w:anchor="_Toc240368851" w:history="1">
+            <w:r>
+              <w:rPr>
+                <w:rStyle w:val="Hyperlink"/>
+                <w:b/>
+                <w:bCs/>
+                <w:noProof/>
+              </w:rPr>
+              <w:t>11. Use Cases Schritt für Schritt</w:t>
+            </w:r>
+            <w:r>
+              <w:rPr>
+                <w:noProof/>
+              </w:rPr>
+              <w:tab/>
+            </w:r>
+            <w:r>
+              <w:rPr>
+                <w:noProof/>
+              </w:rPr>
+              <w:fldChar w:fldCharType="begin"/>
+            </w:r>
+            <w:r>
+              <w:rPr>
+                <w:noProof/>
+              </w:rPr>
+              <w:instrText xml:space="preserve"> PAGEREF _Toc240368851 \h </w:instrText>
+            </w:r>
+            <w:r>
+              <w:rPr>
+                <w:noProof/>
+              </w:rPr>
+            </w:r>
+            <w:r>
+              <w:rPr>
+                <w:noProof/>
+              </w:rPr>
+              <w:fldChar w:fldCharType="separate"/>
+            </w:r>
+            <w:r>
+              <w:rPr>
+                <w:noProof/>
+              </w:rPr>
+              <w:t>11</w:t>
             </w:r>
             <w:r>
               <w:rPr>
@@ -843,7 +907,7 @@
               <w:noProof/>
             </w:rPr>
           </w:pPr>
-          <w:hyperlink w:anchor="_Toc240357597" w:history="1">
+          <w:hyperlink w:anchor="_Toc240368852" w:history="1">
             <w:r>
               <w:rPr>
                 <w:rStyle w:val="Hyperlink"/>
@@ -851,7 +915,7 @@
                 <w:bCs/>
                 <w:noProof/>
               </w:rPr>
-              <w:t>10.1 Use Case: Nur Anmeldungen und Inhalte ansehen</w:t>
+              <w:t>11.1 Use Case: Nur Anmeldungen und Inhalte ansehen</w:t>
             </w:r>
             <w:r>
               <w:rPr>
@@ -869,7 +933,7 @@
               <w:rPr>
                 <w:noProof/>
               </w:rPr>
-              <w:instrText xml:space="preserve"> PAGEREF _Toc240357597 \h </w:instrText>
+              <w:instrText xml:space="preserve"> PAGEREF _Toc240368852 \h </w:instrText>
             </w:r>
             <w:r>
               <w:rPr>
@@ -886,7 +950,7 @@
               <w:rPr>
                 <w:noProof/>
               </w:rPr>
-              <w:t>10</w:t>
+              <w:t>11</w:t>
             </w:r>
             <w:r>
               <w:rPr>
@@ -907,7 +971,7 @@
               <w:noProof/>
             </w:rPr>
           </w:pPr>
-          <w:hyperlink w:anchor="_Toc240357598" w:history="1">
+          <w:hyperlink w:anchor="_Toc240368853" w:history="1">
             <w:r>
               <w:rPr>
                 <w:rStyle w:val="Hyperlink"/>
@@ -915,7 +979,7 @@
                 <w:bCs/>
                 <w:noProof/>
               </w:rPr>
-              <w:t>10.2 Use Case: Inhaltstext ändern und verschachtelte Liste einrücken</w:t>
+              <w:t>11.2 Use Case: Inhaltstext ändern und verschachtelte Liste einrücken</w:t>
             </w:r>
             <w:r>
               <w:rPr>
@@ -933,7 +997,7 @@
               <w:rPr>
                 <w:noProof/>
               </w:rPr>
-              <w:instrText xml:space="preserve"> PAGEREF _Toc240357598 \h </w:instrText>
+              <w:instrText xml:space="preserve"> PAGEREF _Toc240368853 \h </w:instrText>
             </w:r>
             <w:r>
               <w:rPr>
@@ -950,7 +1014,7 @@
               <w:rPr>
                 <w:noProof/>
               </w:rPr>
-              <w:t>11</w:t>
+              <w:t>12</w:t>
             </w:r>
             <w:r>
               <w:rPr>
@@ -971,7 +1035,7 @@
               <w:noProof/>
             </w:rPr>
           </w:pPr>
-          <w:hyperlink w:anchor="_Toc240357599" w:history="1">
+          <w:hyperlink w:anchor="_Toc240368854" w:history="1">
             <w:r>
               <w:rPr>
                 <w:rStyle w:val="Hyperlink"/>
@@ -979,7 +1043,7 @@
                 <w:bCs/>
                 <w:noProof/>
               </w:rPr>
-              <w:t>10.3 Use Case: Link oder Google-Maps-Adresse einfügen</w:t>
+              <w:t>11.3 Use Case: Link oder Google-Maps-Adresse einfügen</w:t>
             </w:r>
             <w:r>
               <w:rPr>
@@ -997,7 +1061,7 @@
               <w:rPr>
                 <w:noProof/>
               </w:rPr>
-              <w:instrText xml:space="preserve"> PAGEREF _Toc240357599 \h </w:instrText>
+              <w:instrText xml:space="preserve"> PAGEREF _Toc240368854 \h </w:instrText>
             </w:r>
             <w:r>
               <w:rPr>
@@ -1014,7 +1078,7 @@
               <w:rPr>
                 <w:noProof/>
               </w:rPr>
-              <w:t>11</w:t>
+              <w:t>12</w:t>
             </w:r>
             <w:r>
               <w:rPr>
@@ -1035,7 +1099,7 @@
               <w:noProof/>
             </w:rPr>
           </w:pPr>
-          <w:hyperlink w:anchor="_Toc240357600" w:history="1">
+          <w:hyperlink w:anchor="_Toc240368855" w:history="1">
             <w:r>
               <w:rPr>
                 <w:rStyle w:val="Hyperlink"/>
@@ -1043,7 +1107,7 @@
                 <w:bCs/>
                 <w:noProof/>
               </w:rPr>
-              <w:t>10.4 Use Case: Logo austauschen</w:t>
+              <w:t>11.4 Use Case: Logo austauschen</w:t>
             </w:r>
             <w:r>
               <w:rPr>
@@ -1061,7 +1125,7 @@
               <w:rPr>
                 <w:noProof/>
               </w:rPr>
-              <w:instrText xml:space="preserve"> PAGEREF _Toc240357600 \h </w:instrText>
+              <w:instrText xml:space="preserve"> PAGEREF _Toc240368855 \h </w:instrText>
             </w:r>
             <w:r>
               <w:rPr>
@@ -1078,7 +1142,7 @@
               <w:rPr>
                 <w:noProof/>
               </w:rPr>
-              <w:t>11</w:t>
+              <w:t>12</w:t>
             </w:r>
             <w:r>
               <w:rPr>
@@ -1099,7 +1163,7 @@
               <w:noProof/>
             </w:rPr>
           </w:pPr>
-          <w:hyperlink w:anchor="_Toc240357601" w:history="1">
+          <w:hyperlink w:anchor="_Toc240368856" w:history="1">
             <w:r>
               <w:rPr>
                 <w:rStyle w:val="Hyperlink"/>
@@ -1107,7 +1171,7 @@
                 <w:bCs/>
                 <w:noProof/>
               </w:rPr>
-              <w:t>10.5 Use Case: Neue Option (Programmpunkt) hinzufügen</w:t>
+              <w:t>11.5 Use Case: Anfahrtsplan austauschen</w:t>
             </w:r>
             <w:r>
               <w:rPr>
@@ -1125,7 +1189,7 @@
               <w:rPr>
                 <w:noProof/>
               </w:rPr>
-              <w:instrText xml:space="preserve"> PAGEREF _Toc240357601 \h </w:instrText>
+              <w:instrText xml:space="preserve"> PAGEREF _Toc240368856 \h </w:instrText>
             </w:r>
             <w:r>
               <w:rPr>
@@ -1142,7 +1206,7 @@
               <w:rPr>
                 <w:noProof/>
               </w:rPr>
-              <w:t>11</w:t>
+              <w:t>13</w:t>
             </w:r>
             <w:r>
               <w:rPr>
@@ -1163,7 +1227,7 @@
               <w:noProof/>
             </w:rPr>
           </w:pPr>
-          <w:hyperlink w:anchor="_Toc240357602" w:history="1">
+          <w:hyperlink w:anchor="_Toc240368857" w:history="1">
             <w:r>
               <w:rPr>
                 <w:rStyle w:val="Hyperlink"/>
@@ -1171,7 +1235,7 @@
                 <w:bCs/>
                 <w:noProof/>
               </w:rPr>
-              <w:t>10.6 Use Case: Impressum oder Datenschutz aktualisieren</w:t>
+              <w:t>11.6 Use Case: Neue Option (Programmpunkt) hinzufügen</w:t>
             </w:r>
             <w:r>
               <w:rPr>
@@ -1189,7 +1253,7 @@
               <w:rPr>
                 <w:noProof/>
               </w:rPr>
-              <w:instrText xml:space="preserve"> PAGEREF _Toc240357602 \h </w:instrText>
+              <w:instrText xml:space="preserve"> PAGEREF _Toc240368857 \h </w:instrText>
             </w:r>
             <w:r>
               <w:rPr>
@@ -1206,7 +1270,7 @@
               <w:rPr>
                 <w:noProof/>
               </w:rPr>
-              <w:t>12</w:t>
+              <w:t>13</w:t>
             </w:r>
             <w:r>
               <w:rPr>
@@ -1227,7 +1291,7 @@
               <w:noProof/>
             </w:rPr>
           </w:pPr>
-          <w:hyperlink w:anchor="_Toc240357603" w:history="1">
+          <w:hyperlink w:anchor="_Toc240368858" w:history="1">
             <w:r>
               <w:rPr>
                 <w:rStyle w:val="Hyperlink"/>
@@ -1235,7 +1299,7 @@
                 <w:bCs/>
                 <w:noProof/>
               </w:rPr>
-              <w:t>10.7 Use Case: Passwörter ändern</w:t>
+              <w:t>11.7 Use Case: Impressum oder Datenschutz aktualisieren</w:t>
             </w:r>
             <w:r>
               <w:rPr>
@@ -1253,7 +1317,7 @@
               <w:rPr>
                 <w:noProof/>
               </w:rPr>
-              <w:instrText xml:space="preserve"> PAGEREF _Toc240357603 \h </w:instrText>
+              <w:instrText xml:space="preserve"> PAGEREF _Toc240368858 \h </w:instrText>
             </w:r>
             <w:r>
               <w:rPr>
@@ -1270,7 +1334,7 @@
               <w:rPr>
                 <w:noProof/>
               </w:rPr>
-              <w:t>12</w:t>
+              <w:t>13</w:t>
             </w:r>
             <w:r>
               <w:rPr>
@@ -1291,7 +1355,7 @@
               <w:noProof/>
             </w:rPr>
           </w:pPr>
-          <w:hyperlink w:anchor="_Toc240357604" w:history="1">
+          <w:hyperlink w:anchor="_Toc240368859" w:history="1">
             <w:r>
               <w:rPr>
                 <w:rStyle w:val="Hyperlink"/>
@@ -1299,7 +1363,7 @@
                 <w:bCs/>
                 <w:noProof/>
               </w:rPr>
-              <w:t>10.8 Use Case: Eine Anmeldung bearbeiten oder löschen</w:t>
+              <w:t>11.8 Use Case: Passwörter ändern</w:t>
             </w:r>
             <w:r>
               <w:rPr>
@@ -1317,7 +1381,7 @@
               <w:rPr>
                 <w:noProof/>
               </w:rPr>
-              <w:instrText xml:space="preserve"> PAGEREF _Toc240357604 \h </w:instrText>
+              <w:instrText xml:space="preserve"> PAGEREF _Toc240368859 \h </w:instrText>
             </w:r>
             <w:r>
               <w:rPr>
@@ -1334,7 +1398,71 @@
               <w:rPr>
                 <w:noProof/>
               </w:rPr>
-              <w:t>12</w:t>
+              <w:t>13</w:t>
+            </w:r>
+            <w:r>
+              <w:rPr>
+                <w:noProof/>
+              </w:rPr>
+              <w:fldChar w:fldCharType="end"/>
+            </w:r>
+          </w:hyperlink>
+        </w:p>
+        <w:p>
+          <w:pPr>
+            <w:pStyle w:val="Verzeichnis2"/>
+            <w:tabs>
+              <w:tab w:val="right" w:leader="dot" w:pos="9016"/>
+            </w:tabs>
+            <w:rPr>
+              <w:rFonts w:asciiTheme="minorHAnsi" w:eastAsiaTheme="minorEastAsia" w:hAnsiTheme="minorHAnsi" w:cstheme="minorBidi"/>
+              <w:noProof/>
+            </w:rPr>
+          </w:pPr>
+          <w:hyperlink w:anchor="_Toc240368860" w:history="1">
+            <w:r>
+              <w:rPr>
+                <w:rStyle w:val="Hyperlink"/>
+                <w:b/>
+                <w:bCs/>
+                <w:noProof/>
+              </w:rPr>
+              <w:t>11.9 Use Case: Eine Anmeldung bearbeiten oder löschen</w:t>
+            </w:r>
+            <w:r>
+              <w:rPr>
+                <w:noProof/>
+              </w:rPr>
+              <w:tab/>
+            </w:r>
+            <w:r>
+              <w:rPr>
+                <w:noProof/>
+              </w:rPr>
+              <w:fldChar w:fldCharType="begin"/>
+            </w:r>
+            <w:r>
+              <w:rPr>
+                <w:noProof/>
+              </w:rPr>
+              <w:instrText xml:space="preserve"> PAGEREF _Toc240368860 \h </w:instrText>
+            </w:r>
+            <w:r>
+              <w:rPr>
+                <w:noProof/>
+              </w:rPr>
+            </w:r>
+            <w:r>
+              <w:rPr>
+                <w:noProof/>
+              </w:rPr>
+              <w:fldChar w:fldCharType="separate"/>
+            </w:r>
+            <w:r>
+              <w:rPr>
+                <w:noProof/>
+              </w:rPr>
+              <w:t>13</w:t>
             </w:r>
             <w:r>
               <w:rPr>
@@ -1355,7 +1483,7 @@
               <w:noProof/>
             </w:rPr>
           </w:pPr>
-          <w:hyperlink w:anchor="_Toc240357605" w:history="1">
+          <w:hyperlink w:anchor="_Toc240368861" w:history="1">
             <w:r>
               <w:rPr>
                 <w:rStyle w:val="Hyperlink"/>
@@ -1363,7 +1491,7 @@
                 <w:bCs/>
                 <w:noProof/>
               </w:rPr>
-              <w:t>11. Kurz zusammengefasst</w:t>
+              <w:t>12. Kurz zusammengefasst</w:t>
             </w:r>
             <w:r>
               <w:rPr>
@@ -1381,7 +1509,7 @@
               <w:rPr>
                 <w:noProof/>
               </w:rPr>
-              <w:instrText xml:space="preserve"> PAGEREF _Toc240357605 \h </w:instrText>
+              <w:instrText xml:space="preserve"> PAGEREF _Toc240368861 \h </w:instrText>
             </w:r>
             <w:r>
               <w:rPr>
@@ -1398,7 +1526,7 @@
               <w:rPr>
                 <w:noProof/>
               </w:rPr>
-              <w:t>12</w:t>
+              <w:t>14</w:t>
             </w:r>
             <w:r>
               <w:rPr>
@@ -1427,7 +1555,7 @@
         <w:keepLines/>
         <w:spacing w:before="300" w:after="150"/>
       </w:pPr>
-      <w:bookmarkStart w:id="0" w:name="_Toc240357585"/>
+      <w:bookmarkStart w:id="0" w:name="_Toc240368839"/>
       <w:r>
         <w:rPr>
           <w:b/>
@@ -1445,10 +1573,10 @@
         <w:spacing w:after="160"/>
       </w:pPr>
       <w:r>
-        <w:t>Der Admin-Bereich ist über die Adresse admin.html erreichbar und durch ein Passwort geschützt. Es gibt</w:t>
-      </w:r>
-      <w:r>
-        <w:t xml:space="preserve"> zwei unterschiedliche Passwörter mit unterschiedlichen Rechten:</w:t>
+        <w:t>Der Admin-Bereich ist über die Adresse admin.html erreichbar und durch ein Pas</w:t>
+      </w:r>
+      <w:r>
+        <w:t>swort geschützt. Es gibt zwei unterschiedliche Passwörter mit unterschiedlichen Rechten:</w:t>
       </w:r>
     </w:p>
     <w:p>
@@ -1475,13 +1603,17 @@
           <w:b/>
           <w:bCs/>
         </w:rPr>
-        <w:t xml:space="preserve">•  Bearbeiten-Passwort: </w:t>
-      </w:r>
-      <w:r>
-        <w:t>Zeigt zusät</w:t>
-      </w:r>
-      <w:r>
-        <w:t>zlich alle Bearbeitungsmöglichkeiten: Inhalte, Logo, Optionen, Zusatztexte und rechtliche Seiten ändern und speichern, Anmeldungen bearbeiten oder löschen, sowie beide Passwörter ändern.</w:t>
+        <w:t>•  Bearbeit</w:t>
+      </w:r>
+      <w:r>
+        <w:rPr>
+          <w:b/>
+          <w:bCs/>
+        </w:rPr>
+        <w:t xml:space="preserve">en-Passwort: </w:t>
+      </w:r>
+      <w:r>
+        <w:t>Zeigt zusätzlich alle Bearbeitungsmöglichkeiten: Inhalte, Logo, Optionen, Zusatztexte und rechtliche Seiten ändern und speichern, Anmeldungen bearbeiten oder löschen, sowie beide Passwörter ändern.</w:t>
       </w:r>
     </w:p>
     <w:p>
@@ -1489,10 +1621,10 @@
         <w:spacing w:after="160"/>
       </w:pPr>
       <w:r>
-        <w:t>Beide Passwörter können jederzeit im Bearbeiten-Modus geändert werden</w:t>
-      </w:r>
-      <w:r>
-        <w:t xml:space="preserve"> (siehe Abschnitt 6).</w:t>
+        <w:t>Beide Passwörter können jederzeit im Bearbeit</w:t>
+      </w:r>
+      <w:r>
+        <w:t>en-Modus geändert werden (siehe Abschnitt 9).</w:t>
       </w:r>
     </w:p>
     <w:p>
@@ -1502,7 +1634,7 @@
         <w:keepLines/>
         <w:spacing w:before="300" w:after="150"/>
       </w:pPr>
-      <w:bookmarkStart w:id="1" w:name="_Toc240357586"/>
+      <w:bookmarkStart w:id="1" w:name="_Toc240368840"/>
       <w:r>
         <w:rPr>
           <w:b/>
@@ -1532,7 +1664,7 @@
           <w:noProof/>
         </w:rPr>
         <w:drawing>
-          <wp:inline distT="0" distB="0" distL="0" distR="0" wp14:anchorId="28571CDC" wp14:editId="30FADE71">
+          <wp:inline distT="0" distB="0" distL="0" distR="0" wp14:anchorId="4FF2BB52" wp14:editId="2E0912A1">
             <wp:extent cx="4381500" cy="3981450"/>
             <wp:effectExtent l="0" t="0" r="0" b="0"/>
             <wp:docPr id="1" name="Grafik 1"/>
@@ -1586,7 +1718,7 @@
           <w:left w:w="10" w:type="dxa"/>
           <w:right w:w="10" w:type="dxa"/>
         </w:tblCellMar>
-        <w:tblLook w:val="04A0" w:firstRow="1" w:lastRow="0" w:firstColumn="1" w:lastColumn="0" w:noHBand="0" w:noVBand="1"/>
+        <w:tblLook w:val="0000" w:firstRow="0" w:lastRow="0" w:firstColumn="0" w:lastColumn="0" w:noHBand="0" w:noVBand="0"/>
       </w:tblPr>
       <w:tblGrid>
         <w:gridCol w:w="700"/>
@@ -1823,7 +1955,7 @@
         <w:keepLines/>
         <w:spacing w:before="300" w:after="150"/>
       </w:pPr>
-      <w:bookmarkStart w:id="2" w:name="_Toc240357587"/>
+      <w:bookmarkStart w:id="2" w:name="_Toc240368841"/>
       <w:r>
         <w:rPr>
           <w:b/>
@@ -1854,7 +1986,7 @@
         <w:keepLines/>
         <w:spacing w:before="240" w:after="120"/>
       </w:pPr>
-      <w:bookmarkStart w:id="3" w:name="_Toc240357588"/>
+      <w:bookmarkStart w:id="3" w:name="_Toc240368842"/>
       <w:r>
         <w:rPr>
           <w:b/>
@@ -1875,7 +2007,7 @@
           <w:noProof/>
         </w:rPr>
         <w:drawing>
-          <wp:inline distT="0" distB="0" distL="0" distR="0" wp14:anchorId="23346992" wp14:editId="2CC2DBAF">
+          <wp:inline distT="0" distB="0" distL="0" distR="0" wp14:anchorId="2D1C7C29" wp14:editId="38D40A49">
             <wp:extent cx="4381500" cy="3981450"/>
             <wp:effectExtent l="0" t="0" r="0" b="0"/>
             <wp:docPr id="2" name="Grafik 2"/>
@@ -1929,7 +2061,7 @@
           <w:left w:w="10" w:type="dxa"/>
           <w:right w:w="10" w:type="dxa"/>
         </w:tblCellMar>
-        <w:tblLook w:val="04A0" w:firstRow="1" w:lastRow="0" w:firstColumn="1" w:lastColumn="0" w:noHBand="0" w:noVBand="1"/>
+        <w:tblLook w:val="0000" w:firstRow="0" w:lastRow="0" w:firstColumn="0" w:lastColumn="0" w:noHBand="0" w:noVBand="0"/>
       </w:tblPr>
       <w:tblGrid>
         <w:gridCol w:w="700"/>
@@ -2382,7 +2514,7 @@
         <w:keepLines/>
         <w:spacing w:before="240" w:after="120"/>
       </w:pPr>
-      <w:bookmarkStart w:id="4" w:name="_Toc240357589"/>
+      <w:bookmarkStart w:id="4" w:name="_Toc240368843"/>
       <w:r>
         <w:rPr>
           <w:b/>
@@ -2416,7 +2548,7 @@
           <w:noProof/>
         </w:rPr>
         <w:drawing>
-          <wp:inline distT="0" distB="0" distL="0" distR="0" wp14:anchorId="4A7293A7" wp14:editId="289747A9">
+          <wp:inline distT="0" distB="0" distL="0" distR="0" wp14:anchorId="399B60BF" wp14:editId="18DB4B24">
             <wp:extent cx="4381500" cy="3981450"/>
             <wp:effectExtent l="0" t="0" r="0" b="0"/>
             <wp:docPr id="3" name="Grafik 3"/>
@@ -2470,7 +2602,7 @@
           <w:left w:w="10" w:type="dxa"/>
           <w:right w:w="10" w:type="dxa"/>
         </w:tblCellMar>
-        <w:tblLook w:val="04A0" w:firstRow="1" w:lastRow="0" w:firstColumn="1" w:lastColumn="0" w:noHBand="0" w:noVBand="1"/>
+        <w:tblLook w:val="0000" w:firstRow="0" w:lastRow="0" w:firstColumn="0" w:lastColumn="0" w:noHBand="0" w:noVBand="0"/>
       </w:tblPr>
       <w:tblGrid>
         <w:gridCol w:w="700"/>
@@ -2859,7 +2991,7 @@
         <w:keepLines/>
         <w:spacing w:before="300" w:after="150"/>
       </w:pPr>
-      <w:bookmarkStart w:id="5" w:name="_Toc240357590"/>
+      <w:bookmarkStart w:id="5" w:name="_Toc240368844"/>
       <w:r>
         <w:rPr>
           <w:b/>
@@ -2890,7 +3022,7 @@
           <w:noProof/>
         </w:rPr>
         <w:drawing>
-          <wp:inline distT="0" distB="0" distL="0" distR="0" wp14:anchorId="4EA4D7A4" wp14:editId="24F17FBA">
+          <wp:inline distT="0" distB="0" distL="0" distR="0" wp14:anchorId="2FDE700F" wp14:editId="037DA9F9">
             <wp:extent cx="4381500" cy="3981450"/>
             <wp:effectExtent l="0" t="0" r="0" b="0"/>
             <wp:docPr id="4" name="Grafik 4"/>
@@ -2944,7 +3076,7 @@
           <w:left w:w="10" w:type="dxa"/>
           <w:right w:w="10" w:type="dxa"/>
         </w:tblCellMar>
-        <w:tblLook w:val="04A0" w:firstRow="1" w:lastRow="0" w:firstColumn="1" w:lastColumn="0" w:noHBand="0" w:noVBand="1"/>
+        <w:tblLook w:val="0000" w:firstRow="0" w:lastRow="0" w:firstColumn="0" w:lastColumn="0" w:noHBand="0" w:noVBand="0"/>
       </w:tblPr>
       <w:tblGrid>
         <w:gridCol w:w="700"/>
@@ -3475,7 +3607,7 @@
         <w:keepLines/>
         <w:spacing w:before="300" w:after="150"/>
       </w:pPr>
-      <w:bookmarkStart w:id="6" w:name="_Toc240357591"/>
+      <w:bookmarkStart w:id="6" w:name="_Toc240368845"/>
       <w:r>
         <w:rPr>
           <w:b/>
@@ -3509,7 +3641,7 @@
           <w:noProof/>
         </w:rPr>
         <w:drawing>
-          <wp:inline distT="0" distB="0" distL="0" distR="0" wp14:anchorId="5FBDD18B" wp14:editId="101CAC92">
+          <wp:inline distT="0" distB="0" distL="0" distR="0" wp14:anchorId="06EE639E" wp14:editId="027053AF">
             <wp:extent cx="4381500" cy="3981450"/>
             <wp:effectExtent l="0" t="0" r="0" b="0"/>
             <wp:docPr id="5" name="Grafik 5"/>
@@ -3563,7 +3695,7 @@
           <w:left w:w="10" w:type="dxa"/>
           <w:right w:w="10" w:type="dxa"/>
         </w:tblCellMar>
-        <w:tblLook w:val="04A0" w:firstRow="1" w:lastRow="0" w:firstColumn="1" w:lastColumn="0" w:noHBand="0" w:noVBand="1"/>
+        <w:tblLook w:val="0000" w:firstRow="0" w:lastRow="0" w:firstColumn="0" w:lastColumn="0" w:noHBand="0" w:noVBand="0"/>
       </w:tblPr>
       <w:tblGrid>
         <w:gridCol w:w="700"/>
@@ -3871,7 +4003,7 @@
         <w:keepLines/>
         <w:spacing w:before="300" w:after="150"/>
       </w:pPr>
-      <w:bookmarkStart w:id="7" w:name="_Toc240357592"/>
+      <w:bookmarkStart w:id="7" w:name="_Toc240368846"/>
       <w:r>
         <w:rPr>
           <w:b/>
@@ -3902,7 +4034,7 @@
           <w:noProof/>
         </w:rPr>
         <w:drawing>
-          <wp:inline distT="0" distB="0" distL="0" distR="0" wp14:anchorId="3715262C" wp14:editId="41662440">
+          <wp:inline distT="0" distB="0" distL="0" distR="0" wp14:anchorId="2A47054A" wp14:editId="01A2C1E1">
             <wp:extent cx="4381500" cy="3981450"/>
             <wp:effectExtent l="0" t="0" r="0" b="0"/>
             <wp:docPr id="6" name="Grafik 6"/>
@@ -3956,7 +4088,7 @@
           <w:left w:w="10" w:type="dxa"/>
           <w:right w:w="10" w:type="dxa"/>
         </w:tblCellMar>
-        <w:tblLook w:val="04A0" w:firstRow="1" w:lastRow="0" w:firstColumn="1" w:lastColumn="0" w:noHBand="0" w:noVBand="1"/>
+        <w:tblLook w:val="0000" w:firstRow="0" w:lastRow="0" w:firstColumn="0" w:lastColumn="0" w:noHBand="0" w:noVBand="0"/>
       </w:tblPr>
       <w:tblGrid>
         <w:gridCol w:w="700"/>
@@ -4340,7 +4472,7 @@
         <w:keepLines/>
         <w:spacing w:before="300" w:after="150"/>
       </w:pPr>
-      <w:bookmarkStart w:id="8" w:name="_Toc240357593"/>
+      <w:bookmarkStart w:id="8" w:name="_Toc240368847"/>
       <w:r>
         <w:rPr>
           <w:b/>
@@ -4348,7 +4480,7 @@
           <w:color w:val="7E2F28"/>
         </w:rPr>
         <w:lastRenderedPageBreak/>
-        <w:t>7. Bearbeiten-Modus: Zusatztexte und Rechtliches</w:t>
+        <w:t>7. Bearbeiten-Modus: Zusatztexte und Anfahrtsplan</w:t>
       </w:r>
       <w:bookmarkEnd w:id="8"/>
     </w:p>
@@ -4358,7 +4490,7 @@
         <w:spacing w:after="160"/>
       </w:pPr>
       <w:r>
-        <w:t>Nach den Optionen folgen zwei frei nutzbare Textfelder sowie die Inhalte für Impressum und Datenschutz.</w:t>
+        <w:t>Nach den Optionen folgen zwei frei nutzbare Textfelder sowie der Anfahrtsplan – ein eigenes, admin-editierbares Bild, das auf der Anmeldeseite bei der Wegbeschreibung erscheint.</w:t>
       </w:r>
     </w:p>
     <w:p>
@@ -4371,7 +4503,7 @@
           <w:noProof/>
         </w:rPr>
         <w:drawing>
-          <wp:inline distT="0" distB="0" distL="0" distR="0" wp14:anchorId="068982EC" wp14:editId="647038C7">
+          <wp:inline distT="0" distB="0" distL="0" distR="0" wp14:anchorId="5BF47E9F" wp14:editId="4DAA8835">
             <wp:extent cx="4381500" cy="3981450"/>
             <wp:effectExtent l="0" t="0" r="0" b="0"/>
             <wp:docPr id="7" name="Grafik 7"/>
@@ -4425,7 +4557,7 @@
           <w:left w:w="10" w:type="dxa"/>
           <w:right w:w="10" w:type="dxa"/>
         </w:tblCellMar>
-        <w:tblLook w:val="04A0" w:firstRow="1" w:lastRow="0" w:firstColumn="1" w:lastColumn="0" w:noHBand="0" w:noVBand="1"/>
+        <w:tblLook w:val="0000" w:firstRow="0" w:lastRow="0" w:firstColumn="0" w:lastColumn="0" w:noHBand="0" w:noVBand="0"/>
       </w:tblPr>
       <w:tblGrid>
         <w:gridCol w:w="700"/>
@@ -4577,7 +4709,10 @@
           </w:tcPr>
           <w:p>
             <w:r>
-              <w:t>Wie Zusatztext 1 ein frei nutzbares Rich-Text-Feld, das auf der Anmeldeseite direkt nach der Optionsliste erscheint. Eignet sich z. B. für Anfahrtshinweise, einen Google-Maps-Link oder zusätzliche Kontaktangaben.</w:t>
+              <w:t>Wie Zusatztext 1 ein frei nutzbares Rich-Text-Feld. Erscheint zusammen mit dem Anfahrtsplan-Bild im „Navigation“-Bereich der Anmeldeseite, direkt nach den allgemeinen Infotexten und noch vor dem eigentlichen Anmeldeblock. Eignet sich z. B. für Anfahrtshinw</w:t>
+            </w:r>
+            <w:r>
+              <w:t>eise, einen Google-Maps-Link oder zusätzliche Kontaktangaben.</w:t>
             </w:r>
           </w:p>
         </w:tc>
@@ -4633,7 +4768,7 @@
                 <w:b/>
                 <w:bCs/>
               </w:rPr>
-              <w:t>„Rechtliches“</w:t>
+              <w:t>„Anfahrtsplan (Bild)“</w:t>
             </w:r>
           </w:p>
         </w:tc>
@@ -4649,7 +4784,7 @@
           </w:tcPr>
           <w:p>
             <w:r>
-              <w:t>Ab hier folgen die Inhalte für zwei eigenständige Unterseiten: Impressum und Datenschutz.</w:t>
+              <w:t>Eigener Bereich für ein Bild, das auf der Anmeldeseite rechts neben der Wegbeschreibung erscheint (z. B. eine stilisierte Karte mit Bahnhof, Bushaltestellen und Zielpunkt). Nur PNG, max. 2 MB.</w:t>
             </w:r>
           </w:p>
         </w:tc>
@@ -4705,7 +4840,7 @@
                 <w:b/>
                 <w:bCs/>
               </w:rPr>
-              <w:t>Impressum-Editor</w:t>
+              <w:t>Anfahrtsplan-Vorschau</w:t>
             </w:r>
           </w:p>
         </w:tc>
@@ -4721,7 +4856,151 @@
           </w:tcPr>
           <w:p>
             <w:r>
-              <w:t>Inhalt der Seite impressum.html. Wird im Footer jeder Seite verlinkt.</w:t>
+              <w:t>Zeigt das aktuell hinterlegte Bild.</w:t>
+            </w:r>
+          </w:p>
+        </w:tc>
+      </w:tr>
+      <w:tr>
+        <w:tblPrEx>
+          <w:tblCellMar>
+            <w:top w:w="0" w:type="dxa"/>
+            <w:bottom w:w="0" w:type="dxa"/>
+          </w:tblCellMar>
+        </w:tblPrEx>
+        <w:trPr>
+          <w:cantSplit/>
+        </w:trPr>
+        <w:tc>
+          <w:tcPr>
+            <w:tcW w:w="700" w:type="dxa"/>
+            <w:shd w:val="clear" w:color="auto" w:fill="A3423A"/>
+            <w:tcMar>
+              <w:top w:w="80" w:type="dxa"/>
+              <w:left w:w="100" w:type="dxa"/>
+              <w:bottom w:w="80" w:type="dxa"/>
+              <w:right w:w="100" w:type="dxa"/>
+            </w:tcMar>
+          </w:tcPr>
+          <w:p>
+            <w:pPr>
+              <w:jc w:val="center"/>
+            </w:pPr>
+            <w:r>
+              <w:rPr>
+                <w:b/>
+                <w:bCs/>
+                <w:color w:val="FFFFFF"/>
+              </w:rPr>
+              <w:t>4</w:t>
+            </w:r>
+          </w:p>
+        </w:tc>
+        <w:tc>
+          <w:tcPr>
+            <w:tcW w:w="2600" w:type="dxa"/>
+            <w:tcMar>
+              <w:top w:w="80" w:type="dxa"/>
+              <w:left w:w="100" w:type="dxa"/>
+              <w:bottom w:w="80" w:type="dxa"/>
+              <w:right w:w="100" w:type="dxa"/>
+            </w:tcMar>
+          </w:tcPr>
+          <w:p>
+            <w:r>
+              <w:rPr>
+                <w:b/>
+                <w:bCs/>
+              </w:rPr>
+              <w:t>Datei auswählen</w:t>
+            </w:r>
+          </w:p>
+        </w:tc>
+        <w:tc>
+          <w:tcPr>
+            <w:tcW w:w="6000" w:type="dxa"/>
+            <w:tcMar>
+              <w:top w:w="80" w:type="dxa"/>
+              <w:left w:w="100" w:type="dxa"/>
+              <w:bottom w:w="80" w:type="dxa"/>
+              <w:right w:w="100" w:type="dxa"/>
+            </w:tcMar>
+          </w:tcPr>
+          <w:p>
+            <w:r>
+              <w:t>Öffnet die Dateiauswahl des Betriebssystems. Nach der Auswahl aktualisiert sich die Vorschau (3) sofort, es ist aber noch nichts gespeichert.</w:t>
+            </w:r>
+          </w:p>
+        </w:tc>
+      </w:tr>
+      <w:tr>
+        <w:tblPrEx>
+          <w:tblCellMar>
+            <w:top w:w="0" w:type="dxa"/>
+            <w:bottom w:w="0" w:type="dxa"/>
+          </w:tblCellMar>
+        </w:tblPrEx>
+        <w:trPr>
+          <w:cantSplit/>
+        </w:trPr>
+        <w:tc>
+          <w:tcPr>
+            <w:tcW w:w="700" w:type="dxa"/>
+            <w:shd w:val="clear" w:color="auto" w:fill="A3423A"/>
+            <w:tcMar>
+              <w:top w:w="80" w:type="dxa"/>
+              <w:left w:w="100" w:type="dxa"/>
+              <w:bottom w:w="80" w:type="dxa"/>
+              <w:right w:w="100" w:type="dxa"/>
+            </w:tcMar>
+          </w:tcPr>
+          <w:p>
+            <w:pPr>
+              <w:jc w:val="center"/>
+            </w:pPr>
+            <w:r>
+              <w:rPr>
+                <w:b/>
+                <w:bCs/>
+                <w:color w:val="FFFFFF"/>
+              </w:rPr>
+              <w:t>5</w:t>
+            </w:r>
+          </w:p>
+        </w:tc>
+        <w:tc>
+          <w:tcPr>
+            <w:tcW w:w="2600" w:type="dxa"/>
+            <w:tcMar>
+              <w:top w:w="80" w:type="dxa"/>
+              <w:left w:w="100" w:type="dxa"/>
+              <w:bottom w:w="80" w:type="dxa"/>
+              <w:right w:w="100" w:type="dxa"/>
+            </w:tcMar>
+          </w:tcPr>
+          <w:p>
+            <w:r>
+              <w:rPr>
+                <w:b/>
+                <w:bCs/>
+              </w:rPr>
+              <w:t>Anfahrtsplan hochladen</w:t>
+            </w:r>
+          </w:p>
+        </w:tc>
+        <w:tc>
+          <w:tcPr>
+            <w:tcW w:w="6000" w:type="dxa"/>
+            <w:tcMar>
+              <w:top w:w="80" w:type="dxa"/>
+              <w:left w:w="100" w:type="dxa"/>
+              <w:bottom w:w="80" w:type="dxa"/>
+              <w:right w:w="100" w:type="dxa"/>
+            </w:tcMar>
+          </w:tcPr>
+          <w:p>
+            <w:r>
+              <w:t>Überträgt die ausgewählte Datei tatsächlich und macht sie live sichtbar. Ohne diesen Klick bleibt eine neue Auswahl wirkungslos.</w:t>
             </w:r>
           </w:p>
         </w:tc>
@@ -4737,7 +5016,8 @@
           <w:iCs/>
           <w:color w:val="6B5C52"/>
         </w:rPr>
-        <w:t>Zusatztext 1 (im Bild nicht zu sehen, direkt oberhalb von Zusatztext 2) fun</w:t>
+        <w:lastRenderedPageBreak/>
+        <w:t xml:space="preserve">Zusatztext 1 (im Bild nicht zu sehen, direkt oberhalb von Zusatztext 2) funktioniert genauso wie Zusatztext 2, erscheint aber </w:t>
       </w:r>
       <w:r>
         <w:rPr>
@@ -4745,7 +5025,7 @@
           <w:iCs/>
           <w:color w:val="6B5C52"/>
         </w:rPr>
-        <w:t>ktioniert genauso wie Zusatztext 2 und erscheint davor auf der Anmeldeseite – beide zusammen ergeben den frei gestaltbaren Bereich direkt nach der Optionsliste.</w:t>
+        <w:t>weiterhin direkt nach der Optionsliste innerhalb des Anmeldeblocks – nur Zusatztext 2 und der Anfahrtsplan wurden vor den Anmeldeblock verschoben.</w:t>
       </w:r>
     </w:p>
     <w:p>
@@ -4755,15 +5035,14 @@
         <w:keepLines/>
         <w:spacing w:before="300" w:after="150"/>
       </w:pPr>
-      <w:bookmarkStart w:id="9" w:name="_Toc240357594"/>
+      <w:bookmarkStart w:id="9" w:name="_Toc240368848"/>
       <w:r>
         <w:rPr>
           <w:b/>
           <w:bCs/>
           <w:color w:val="7E2F28"/>
         </w:rPr>
-        <w:lastRenderedPageBreak/>
-        <w:t>8. Bearbeiten-Modus: Datenschutz speichern und Passwörter ändern</w:t>
+        <w:t>8. Bearbeiten-Modus: Rechtliches (Impressum und Datenschutz)</w:t>
       </w:r>
       <w:bookmarkEnd w:id="9"/>
     </w:p>
@@ -4773,10 +5052,10 @@
         <w:spacing w:after="160"/>
       </w:pPr>
       <w:r>
-        <w:t>Am Ende des Formulars folgen d</w:t>
-      </w:r>
-      <w:r>
-        <w:t>er Datenschutz-Editor, der Speichern-Button für alle Inhalte sowie ein eigener Bereich zum Ändern der beiden Passwörter.</w:t>
+        <w:t>Danach folgen die Inhalte für zwei eigenständige</w:t>
+      </w:r>
+      <w:r>
+        <w:t xml:space="preserve"> Unterseiten sowie der Speichern-Button für das gesamte Formular.</w:t>
       </w:r>
     </w:p>
     <w:p>
@@ -4789,7 +5068,7 @@
           <w:noProof/>
         </w:rPr>
         <w:drawing>
-          <wp:inline distT="0" distB="0" distL="0" distR="0" wp14:anchorId="403F081A" wp14:editId="4D26B72B">
+          <wp:inline distT="0" distB="0" distL="0" distR="0" wp14:anchorId="22383485" wp14:editId="61438EEF">
             <wp:extent cx="4381500" cy="3981450"/>
             <wp:effectExtent l="0" t="0" r="0" b="0"/>
             <wp:docPr id="8" name="Grafik 8"/>
@@ -4843,7 +5122,7 @@
           <w:left w:w="10" w:type="dxa"/>
           <w:right w:w="10" w:type="dxa"/>
         </w:tblCellMar>
-        <w:tblLook w:val="04A0" w:firstRow="1" w:lastRow="0" w:firstColumn="1" w:lastColumn="0" w:noHBand="0" w:noVBand="1"/>
+        <w:tblLook w:val="0000" w:firstRow="0" w:lastRow="0" w:firstColumn="0" w:lastColumn="0" w:noHBand="0" w:noVBand="0"/>
       </w:tblPr>
       <w:tblGrid>
         <w:gridCol w:w="700"/>
@@ -4979,7 +5258,7 @@
                 <w:b/>
                 <w:bCs/>
               </w:rPr>
-              <w:t>Datenschutz-Editor</w:t>
+              <w:t>Impressum-Editor</w:t>
             </w:r>
           </w:p>
         </w:tc>
@@ -4995,7 +5274,7 @@
           </w:tcPr>
           <w:p>
             <w:r>
-              <w:t>Inhalt der Seite datenschutz.html. Wird im Footer jeder Seite verlinkt.</w:t>
+              <w:t>Inhalt der Seite impressum.html. Wird im Footer jeder Seite verlinkt.</w:t>
             </w:r>
           </w:p>
         </w:tc>
@@ -5051,6 +5330,78 @@
                 <w:b/>
                 <w:bCs/>
               </w:rPr>
+              <w:t>Datenschutz-Editor</w:t>
+            </w:r>
+          </w:p>
+        </w:tc>
+        <w:tc>
+          <w:tcPr>
+            <w:tcW w:w="6000" w:type="dxa"/>
+            <w:tcMar>
+              <w:top w:w="80" w:type="dxa"/>
+              <w:left w:w="100" w:type="dxa"/>
+              <w:bottom w:w="80" w:type="dxa"/>
+              <w:right w:w="100" w:type="dxa"/>
+            </w:tcMar>
+          </w:tcPr>
+          <w:p>
+            <w:r>
+              <w:t>Inhalt der Seite datenschutz.html. Wird im Footer jeder Seite verlinkt.</w:t>
+            </w:r>
+          </w:p>
+        </w:tc>
+      </w:tr>
+      <w:tr>
+        <w:tblPrEx>
+          <w:tblCellMar>
+            <w:top w:w="0" w:type="dxa"/>
+            <w:bottom w:w="0" w:type="dxa"/>
+          </w:tblCellMar>
+        </w:tblPrEx>
+        <w:trPr>
+          <w:cantSplit/>
+        </w:trPr>
+        <w:tc>
+          <w:tcPr>
+            <w:tcW w:w="700" w:type="dxa"/>
+            <w:shd w:val="clear" w:color="auto" w:fill="A3423A"/>
+            <w:tcMar>
+              <w:top w:w="80" w:type="dxa"/>
+              <w:left w:w="100" w:type="dxa"/>
+              <w:bottom w:w="80" w:type="dxa"/>
+              <w:right w:w="100" w:type="dxa"/>
+            </w:tcMar>
+          </w:tcPr>
+          <w:p>
+            <w:pPr>
+              <w:jc w:val="center"/>
+            </w:pPr>
+            <w:r>
+              <w:rPr>
+                <w:b/>
+                <w:bCs/>
+                <w:color w:val="FFFFFF"/>
+              </w:rPr>
+              <w:t>3</w:t>
+            </w:r>
+          </w:p>
+        </w:tc>
+        <w:tc>
+          <w:tcPr>
+            <w:tcW w:w="2600" w:type="dxa"/>
+            <w:tcMar>
+              <w:top w:w="80" w:type="dxa"/>
+              <w:left w:w="100" w:type="dxa"/>
+              <w:bottom w:w="80" w:type="dxa"/>
+              <w:right w:w="100" w:type="dxa"/>
+            </w:tcMar>
+          </w:tcPr>
+          <w:p>
+            <w:r>
+              <w:rPr>
+                <w:b/>
+                <w:bCs/>
+              </w:rPr>
               <w:t>Speichern</w:t>
             </w:r>
           </w:p>
@@ -5067,7 +5418,10 @@
           </w:tcPr>
           <w:p>
             <w:r>
-              <w:t>Speichert Überschrift, Subtext, beide Info-Texte, beide Zusatztexte, Impressum, Datenschutz, Ziel-E-Mail-Adresse, Worker-URL, maximale Besucherzahl und alle Optionen dauerhaft – die Änderungen sind danach sofort live auf der Webseite sichtbar.</w:t>
+              <w:t>Speichert Überschrift, Subtext, beide Info-Texte, beide Zusatztexte, Impressum, Datenschutz, Ziel-E-Mail-Adresse, Worker-URL, maximale Besucherzahl und alle Optionen dauer</w:t>
+            </w:r>
+            <w:r>
+              <w:t>haft – die Änderungen sind danach sofort live auf der Webseite sichtbar.</w:t>
             </w:r>
           </w:p>
         </w:tc>
@@ -5083,7 +5437,7 @@
           <w:iCs/>
           <w:color w:val="6B5C52"/>
         </w:rPr>
-        <w:t>Wichtig: Im</w:t>
+        <w:t>Wichtig: Impressum und Datenschutz enthalten nach der Ersteinrichtung Platzhaltertext (deutlich mit „[Platzhalter]“ bzw. einem Hinweissatz markiert). Bitte vor der offiziellen Bewerb</w:t>
       </w:r>
       <w:r>
         <w:rPr>
@@ -5091,12 +5445,7 @@
           <w:iCs/>
           <w:color w:val="6B5C52"/>
         </w:rPr>
-        <w:t>pressum und Datenschutz enthalten nach der Ersteinrichtung Platzhaltertext (deutlich mit „[Platzhalter]“ bzw. einem Hinweissatz markiert). Bitte vor der offiziellen Bewerbung der Seite durch echte Angaben ersetzen.</w:t>
-      </w:r>
-    </w:p>
-    <w:p>
-      <w:r>
-        <w:br w:type="page"/>
+        <w:t>ung der Seite durch echte Angaben ersetzen.</w:t>
       </w:r>
     </w:p>
     <w:p>
@@ -5106,7 +5455,7 @@
         <w:keepLines/>
         <w:spacing w:before="300" w:after="150"/>
       </w:pPr>
-      <w:bookmarkStart w:id="10" w:name="_Toc240357595"/>
+      <w:bookmarkStart w:id="10" w:name="_Toc240368849"/>
       <w:r>
         <w:rPr>
           <w:b/>
@@ -5114,15 +5463,7 @@
           <w:color w:val="7E2F28"/>
         </w:rPr>
         <w:lastRenderedPageBreak/>
-        <w:t>9. Bearbeiten-Modus: Anmeldungen verwal</w:t>
-      </w:r>
-      <w:r>
-        <w:rPr>
-          <w:b/>
-          <w:bCs/>
-          <w:color w:val="7E2F28"/>
-        </w:rPr>
-        <w:t>ten</w:t>
+        <w:t>9. Bearbeiten-Modus: Passwörter ändern</w:t>
       </w:r>
       <w:bookmarkEnd w:id="10"/>
     </w:p>
@@ -5132,7 +5473,7 @@
         <w:spacing w:after="160"/>
       </w:pPr>
       <w:r>
-        <w:t>Im Bearbeiten-Modus lassen sich einzelne Anmeldungen direkt in der Tabelle ändern oder löschen.</w:t>
+        <w:t>Direkt unter dem Speichern-Button für die Inhalte folgt ein eigener Bereich zum Ändern der beiden Passwörter.</w:t>
       </w:r>
     </w:p>
     <w:p>
@@ -5145,7 +5486,7 @@
           <w:noProof/>
         </w:rPr>
         <w:drawing>
-          <wp:inline distT="0" distB="0" distL="0" distR="0" wp14:anchorId="614DD1C6" wp14:editId="01757B04">
+          <wp:inline distT="0" distB="0" distL="0" distR="0" wp14:anchorId="77CF3EA3" wp14:editId="64A2EEEB">
             <wp:extent cx="4381500" cy="3981450"/>
             <wp:effectExtent l="0" t="0" r="0" b="0"/>
             <wp:docPr id="9" name="Grafik 9"/>
@@ -5199,7 +5540,7 @@
           <w:left w:w="10" w:type="dxa"/>
           <w:right w:w="10" w:type="dxa"/>
         </w:tblCellMar>
-        <w:tblLook w:val="04A0" w:firstRow="1" w:lastRow="0" w:firstColumn="1" w:lastColumn="0" w:noHBand="0" w:noVBand="1"/>
+        <w:tblLook w:val="0000" w:firstRow="0" w:lastRow="0" w:firstColumn="0" w:lastColumn="0" w:noHBand="0" w:noVBand="0"/>
       </w:tblPr>
       <w:tblGrid>
         <w:gridCol w:w="700"/>
@@ -5335,7 +5676,7 @@
                 <w:b/>
                 <w:bCs/>
               </w:rPr>
-              <w:t>Status-Auswahl</w:t>
+              <w:t>Neues Anzeige-Passwort</w:t>
             </w:r>
           </w:p>
         </w:tc>
@@ -5351,7 +5692,7 @@
           </w:tcPr>
           <w:p>
             <w:r>
-              <w:t>Umschalten zwischen „Bestätigt“ und „Warteliste“ für die jeweilige Anmeldung.</w:t>
+              <w:t>Optional. Leer lassen, um das bisherige Anzeige-Passwort unverändert zu lassen.</w:t>
             </w:r>
           </w:p>
         </w:tc>
@@ -5407,7 +5748,7 @@
                 <w:b/>
                 <w:bCs/>
               </w:rPr>
-              <w:t>Editierbare Felder</w:t>
+              <w:t>Neues Bearbeiten-Passwort</w:t>
             </w:r>
           </w:p>
         </w:tc>
@@ -5423,10 +5764,7 @@
           </w:tcPr>
           <w:p>
             <w:r>
-              <w:t>Name, E-Mail, Besucherzahl, Optionen und Gesamtpreis lassen sich direkt in der Tabelle anpassen. Nach Änderungen in einer Zeile muss dort auf „Speichern“ geklickt werden, damit sie übernommen werden (Buttons rechts in jeder Zeile, im Bild durch den Tabelle</w:t>
-            </w:r>
-            <w:r>
-              <w:t>nausschnitt nicht mehr sichtbar). Ein „Löschen“-Button entfernt die Anmeldung unwiderruflich – vorher erscheint eine Sicherheitsabfrage.</w:t>
+              <w:t>Optional. Leer lassen, um das bisherige Bearbeiten-Passwort unverändert zu lassen.</w:t>
             </w:r>
           </w:p>
         </w:tc>
@@ -5482,7 +5820,7 @@
                 <w:b/>
                 <w:bCs/>
               </w:rPr>
-              <w:t>CSV herunterladen</w:t>
+              <w:t>Passwörter speichern</w:t>
             </w:r>
           </w:p>
         </w:tc>
@@ -5498,12 +5836,20 @@
           </w:tcPr>
           <w:p>
             <w:r>
-              <w:t>Lädt die aktuell geladene Liste als CSV-Datei herunter, z. B. zur Weiterverarbeitung in einer Tabellenkalkulation.</w:t>
+              <w:t xml:space="preserve">Speichert die neuen Passwörter. Dafür ist im Hintergrund das aktuell eingegebene Bearbeiten-Passwort nötig – aus Sicherheitsgründen lässt sich diese </w:t>
+            </w:r>
+            <w:r>
+              <w:t>Aktion nicht ohne gültiges aktuelles Passwort durchführen.</w:t>
             </w:r>
           </w:p>
         </w:tc>
       </w:tr>
     </w:tbl>
+    <w:p>
+      <w:r>
+        <w:br w:type="page"/>
+      </w:r>
+    </w:p>
     <w:p>
       <w:pPr>
         <w:pStyle w:val="berschrift1"/>
@@ -5511,87 +5857,416 @@
         <w:keepLines/>
         <w:spacing w:before="300" w:after="150"/>
       </w:pPr>
-      <w:bookmarkStart w:id="11" w:name="_Toc240357596"/>
+      <w:bookmarkStart w:id="11" w:name="_Toc240368850"/>
       <w:r>
         <w:rPr>
           <w:b/>
           <w:bCs/>
           <w:color w:val="7E2F28"/>
         </w:rPr>
-        <w:t>10. Use Cases Schritt für Schritt</w:t>
+        <w:lastRenderedPageBreak/>
+        <w:t>10. Bearbeiten-Modus: Anmeldungen verwalten</w:t>
       </w:r>
       <w:bookmarkEnd w:id="11"/>
     </w:p>
     <w:p>
       <w:pPr>
-        <w:pStyle w:val="berschrift2"/>
+        <w:keepNext/>
+        <w:spacing w:after="160"/>
+      </w:pPr>
+      <w:r>
+        <w:t>Im Bearbeiten-Modus lassen sich einzelne Anmeldungen direkt in der Tabelle ändern oder löschen.</w:t>
+      </w:r>
+    </w:p>
+    <w:p>
+      <w:pPr>
+        <w:spacing w:after="60"/>
+        <w:jc w:val="center"/>
+      </w:pPr>
+      <w:r>
+        <w:rPr>
+          <w:noProof/>
+        </w:rPr>
+        <w:drawing>
+          <wp:inline distT="0" distB="0" distL="0" distR="0" wp14:anchorId="59B4A960" wp14:editId="02D2B952">
+            <wp:extent cx="4381500" cy="3981450"/>
+            <wp:effectExtent l="0" t="0" r="0" b="0"/>
+            <wp:docPr id="10" name="Grafik 10"/>
+            <wp:cNvGraphicFramePr>
+              <a:graphicFrameLocks xmlns:a="http://schemas.openxmlformats.org/drawingml/2006/main" noChangeAspect="1"/>
+            </wp:cNvGraphicFramePr>
+            <a:graphic xmlns:a="http://schemas.openxmlformats.org/drawingml/2006/main">
+              <a:graphicData uri="http://schemas.openxmlformats.org/drawingml/2006/picture">
+                <pic:pic xmlns:pic="http://schemas.openxmlformats.org/drawingml/2006/picture">
+                  <pic:nvPicPr>
+                    <pic:cNvPr id="0" name=""/>
+                    <pic:cNvPicPr>
+                      <a:picLocks noChangeAspect="1" noChangeArrowheads="1"/>
+                    </pic:cNvPicPr>
+                  </pic:nvPicPr>
+                  <pic:blipFill>
+                    <a:blip r:embed="rId14"/>
+                    <a:srcRect/>
+                    <a:stretch>
+                      <a:fillRect/>
+                    </a:stretch>
+                  </pic:blipFill>
+                  <pic:spPr bwMode="auto">
+                    <a:xfrm>
+                      <a:off x="0" y="0"/>
+                      <a:ext cx="4381500" cy="3981450"/>
+                    </a:xfrm>
+                    <a:prstGeom prst="rect">
+                      <a:avLst/>
+                    </a:prstGeom>
+                  </pic:spPr>
+                </pic:pic>
+              </a:graphicData>
+            </a:graphic>
+          </wp:inline>
+        </w:drawing>
+      </w:r>
+    </w:p>
+    <w:tbl>
+      <w:tblPr>
+        <w:tblW w:w="9300" w:type="dxa"/>
+        <w:tblBorders>
+          <w:top w:val="single" w:sz="4" w:space="0" w:color="auto"/>
+          <w:left w:val="single" w:sz="4" w:space="0" w:color="auto"/>
+          <w:bottom w:val="single" w:sz="4" w:space="0" w:color="auto"/>
+          <w:right w:val="single" w:sz="4" w:space="0" w:color="auto"/>
+          <w:insideH w:val="single" w:sz="4" w:space="0" w:color="auto"/>
+          <w:insideV w:val="single" w:sz="4" w:space="0" w:color="auto"/>
+        </w:tblBorders>
+        <w:tblCellMar>
+          <w:left w:w="10" w:type="dxa"/>
+          <w:right w:w="10" w:type="dxa"/>
+        </w:tblCellMar>
+        <w:tblLook w:val="0000" w:firstRow="0" w:lastRow="0" w:firstColumn="0" w:lastColumn="0" w:noHBand="0" w:noVBand="0"/>
+      </w:tblPr>
+      <w:tblGrid>
+        <w:gridCol w:w="700"/>
+        <w:gridCol w:w="2600"/>
+        <w:gridCol w:w="6000"/>
+      </w:tblGrid>
+      <w:tr>
+        <w:tblPrEx>
+          <w:tblCellMar>
+            <w:top w:w="0" w:type="dxa"/>
+            <w:bottom w:w="0" w:type="dxa"/>
+          </w:tblCellMar>
+        </w:tblPrEx>
+        <w:trPr>
+          <w:cantSplit/>
+          <w:tblHeader/>
+        </w:trPr>
+        <w:tc>
+          <w:tcPr>
+            <w:tcW w:w="700" w:type="dxa"/>
+            <w:shd w:val="clear" w:color="auto" w:fill="F3E7D8"/>
+            <w:tcMar>
+              <w:top w:w="80" w:type="dxa"/>
+              <w:left w:w="100" w:type="dxa"/>
+              <w:bottom w:w="80" w:type="dxa"/>
+              <w:right w:w="100" w:type="dxa"/>
+            </w:tcMar>
+          </w:tcPr>
+          <w:p>
+            <w:r>
+              <w:rPr>
+                <w:b/>
+                <w:bCs/>
+                <w:color w:val="7E2F28"/>
+              </w:rPr>
+              <w:t>Nr.</w:t>
+            </w:r>
+          </w:p>
+        </w:tc>
+        <w:tc>
+          <w:tcPr>
+            <w:tcW w:w="2600" w:type="dxa"/>
+            <w:shd w:val="clear" w:color="auto" w:fill="F3E7D8"/>
+            <w:tcMar>
+              <w:top w:w="80" w:type="dxa"/>
+              <w:left w:w="100" w:type="dxa"/>
+              <w:bottom w:w="80" w:type="dxa"/>
+              <w:right w:w="100" w:type="dxa"/>
+            </w:tcMar>
+          </w:tcPr>
+          <w:p>
+            <w:r>
+              <w:rPr>
+                <w:b/>
+                <w:bCs/>
+                <w:color w:val="7E2F28"/>
+              </w:rPr>
+              <w:t>Element</w:t>
+            </w:r>
+          </w:p>
+        </w:tc>
+        <w:tc>
+          <w:tcPr>
+            <w:tcW w:w="6000" w:type="dxa"/>
+            <w:shd w:val="clear" w:color="auto" w:fill="F3E7D8"/>
+            <w:tcMar>
+              <w:top w:w="80" w:type="dxa"/>
+              <w:left w:w="100" w:type="dxa"/>
+              <w:bottom w:w="80" w:type="dxa"/>
+              <w:right w:w="100" w:type="dxa"/>
+            </w:tcMar>
+          </w:tcPr>
+          <w:p>
+            <w:r>
+              <w:rPr>
+                <w:b/>
+                <w:bCs/>
+                <w:color w:val="7E2F28"/>
+              </w:rPr>
+              <w:t>Bedeutung</w:t>
+            </w:r>
+          </w:p>
+        </w:tc>
+      </w:tr>
+      <w:tr>
+        <w:tblPrEx>
+          <w:tblCellMar>
+            <w:top w:w="0" w:type="dxa"/>
+            <w:bottom w:w="0" w:type="dxa"/>
+          </w:tblCellMar>
+        </w:tblPrEx>
+        <w:trPr>
+          <w:cantSplit/>
+        </w:trPr>
+        <w:tc>
+          <w:tcPr>
+            <w:tcW w:w="700" w:type="dxa"/>
+            <w:shd w:val="clear" w:color="auto" w:fill="A3423A"/>
+            <w:tcMar>
+              <w:top w:w="80" w:type="dxa"/>
+              <w:left w:w="100" w:type="dxa"/>
+              <w:bottom w:w="80" w:type="dxa"/>
+              <w:right w:w="100" w:type="dxa"/>
+            </w:tcMar>
+          </w:tcPr>
+          <w:p>
+            <w:pPr>
+              <w:jc w:val="center"/>
+            </w:pPr>
+            <w:r>
+              <w:rPr>
+                <w:b/>
+                <w:bCs/>
+                <w:color w:val="FFFFFF"/>
+              </w:rPr>
+              <w:t>1</w:t>
+            </w:r>
+          </w:p>
+        </w:tc>
+        <w:tc>
+          <w:tcPr>
+            <w:tcW w:w="2600" w:type="dxa"/>
+            <w:tcMar>
+              <w:top w:w="80" w:type="dxa"/>
+              <w:left w:w="100" w:type="dxa"/>
+              <w:bottom w:w="80" w:type="dxa"/>
+              <w:right w:w="100" w:type="dxa"/>
+            </w:tcMar>
+          </w:tcPr>
+          <w:p>
+            <w:r>
+              <w:rPr>
+                <w:b/>
+                <w:bCs/>
+              </w:rPr>
+              <w:t>Status-Auswahl</w:t>
+            </w:r>
+          </w:p>
+        </w:tc>
+        <w:tc>
+          <w:tcPr>
+            <w:tcW w:w="6000" w:type="dxa"/>
+            <w:tcMar>
+              <w:top w:w="80" w:type="dxa"/>
+              <w:left w:w="100" w:type="dxa"/>
+              <w:bottom w:w="80" w:type="dxa"/>
+              <w:right w:w="100" w:type="dxa"/>
+            </w:tcMar>
+          </w:tcPr>
+          <w:p>
+            <w:r>
+              <w:t>Umschalten zwischen „Bestätigt“ und „Warteliste“ für die jeweilige Anmeldung.</w:t>
+            </w:r>
+          </w:p>
+        </w:tc>
+      </w:tr>
+      <w:tr>
+        <w:tblPrEx>
+          <w:tblCellMar>
+            <w:top w:w="0" w:type="dxa"/>
+            <w:bottom w:w="0" w:type="dxa"/>
+          </w:tblCellMar>
+        </w:tblPrEx>
+        <w:trPr>
+          <w:cantSplit/>
+        </w:trPr>
+        <w:tc>
+          <w:tcPr>
+            <w:tcW w:w="700" w:type="dxa"/>
+            <w:shd w:val="clear" w:color="auto" w:fill="A3423A"/>
+            <w:tcMar>
+              <w:top w:w="80" w:type="dxa"/>
+              <w:left w:w="100" w:type="dxa"/>
+              <w:bottom w:w="80" w:type="dxa"/>
+              <w:right w:w="100" w:type="dxa"/>
+            </w:tcMar>
+          </w:tcPr>
+          <w:p>
+            <w:pPr>
+              <w:jc w:val="center"/>
+            </w:pPr>
+            <w:r>
+              <w:rPr>
+                <w:b/>
+                <w:bCs/>
+                <w:color w:val="FFFFFF"/>
+              </w:rPr>
+              <w:t>2</w:t>
+            </w:r>
+          </w:p>
+        </w:tc>
+        <w:tc>
+          <w:tcPr>
+            <w:tcW w:w="2600" w:type="dxa"/>
+            <w:tcMar>
+              <w:top w:w="80" w:type="dxa"/>
+              <w:left w:w="100" w:type="dxa"/>
+              <w:bottom w:w="80" w:type="dxa"/>
+              <w:right w:w="100" w:type="dxa"/>
+            </w:tcMar>
+          </w:tcPr>
+          <w:p>
+            <w:r>
+              <w:rPr>
+                <w:b/>
+                <w:bCs/>
+              </w:rPr>
+              <w:t>Editierbare Felder</w:t>
+            </w:r>
+          </w:p>
+        </w:tc>
+        <w:tc>
+          <w:tcPr>
+            <w:tcW w:w="6000" w:type="dxa"/>
+            <w:tcMar>
+              <w:top w:w="80" w:type="dxa"/>
+              <w:left w:w="100" w:type="dxa"/>
+              <w:bottom w:w="80" w:type="dxa"/>
+              <w:right w:w="100" w:type="dxa"/>
+            </w:tcMar>
+          </w:tcPr>
+          <w:p>
+            <w:r>
+              <w:t>Name, E-Mail, Besucherzahl, Optionen und Gesamtpreis lassen sich direkt in der Tabelle anpassen. Nach Änderungen in einer Zeile muss dort auf „Speichern“ geklickt werden, damit sie übernommen werden (Buttons rechts in jeder Zeile, im Bild durch den Tabelle</w:t>
+            </w:r>
+            <w:r>
+              <w:t>nausschnitt nicht mehr sichtbar). Ein „Löschen“-Button entfernt die Anmeldung unwiderruflich – vorher erscheint eine Sicherheitsabfrage.</w:t>
+            </w:r>
+          </w:p>
+        </w:tc>
+      </w:tr>
+      <w:tr>
+        <w:tblPrEx>
+          <w:tblCellMar>
+            <w:top w:w="0" w:type="dxa"/>
+            <w:bottom w:w="0" w:type="dxa"/>
+          </w:tblCellMar>
+        </w:tblPrEx>
+        <w:trPr>
+          <w:cantSplit/>
+        </w:trPr>
+        <w:tc>
+          <w:tcPr>
+            <w:tcW w:w="700" w:type="dxa"/>
+            <w:shd w:val="clear" w:color="auto" w:fill="A3423A"/>
+            <w:tcMar>
+              <w:top w:w="80" w:type="dxa"/>
+              <w:left w:w="100" w:type="dxa"/>
+              <w:bottom w:w="80" w:type="dxa"/>
+              <w:right w:w="100" w:type="dxa"/>
+            </w:tcMar>
+          </w:tcPr>
+          <w:p>
+            <w:pPr>
+              <w:jc w:val="center"/>
+            </w:pPr>
+            <w:r>
+              <w:rPr>
+                <w:b/>
+                <w:bCs/>
+                <w:color w:val="FFFFFF"/>
+              </w:rPr>
+              <w:t>3</w:t>
+            </w:r>
+          </w:p>
+        </w:tc>
+        <w:tc>
+          <w:tcPr>
+            <w:tcW w:w="2600" w:type="dxa"/>
+            <w:tcMar>
+              <w:top w:w="80" w:type="dxa"/>
+              <w:left w:w="100" w:type="dxa"/>
+              <w:bottom w:w="80" w:type="dxa"/>
+              <w:right w:w="100" w:type="dxa"/>
+            </w:tcMar>
+          </w:tcPr>
+          <w:p>
+            <w:r>
+              <w:rPr>
+                <w:b/>
+                <w:bCs/>
+              </w:rPr>
+              <w:t>CSV herunterladen</w:t>
+            </w:r>
+          </w:p>
+        </w:tc>
+        <w:tc>
+          <w:tcPr>
+            <w:tcW w:w="6000" w:type="dxa"/>
+            <w:tcMar>
+              <w:top w:w="80" w:type="dxa"/>
+              <w:left w:w="100" w:type="dxa"/>
+              <w:bottom w:w="80" w:type="dxa"/>
+              <w:right w:w="100" w:type="dxa"/>
+            </w:tcMar>
+          </w:tcPr>
+          <w:p>
+            <w:r>
+              <w:t>Lädt die aktuell geladene Liste als CSV-Datei herunter, z. B. zur Weiterverarbeitung in einer Tabe</w:t>
+            </w:r>
+            <w:r>
+              <w:t>llenkalkulation.</w:t>
+            </w:r>
+          </w:p>
+        </w:tc>
+      </w:tr>
+    </w:tbl>
+    <w:p>
+      <w:pPr>
+        <w:pStyle w:val="berschrift1"/>
         <w:keepNext/>
         <w:keepLines/>
-        <w:spacing w:before="240" w:after="120"/>
-      </w:pPr>
-      <w:bookmarkStart w:id="12" w:name="_Toc240357597"/>
+        <w:spacing w:before="300" w:after="150"/>
+      </w:pPr>
+      <w:bookmarkStart w:id="12" w:name="_Toc240368851"/>
       <w:r>
         <w:rPr>
           <w:b/>
           <w:bCs/>
           <w:color w:val="7E2F28"/>
         </w:rPr>
-        <w:t>10.1 Use Case: Nur Anmeldungen und Inhalte ansehen</w:t>
+        <w:t>11. Use Cases Schritt für Schritt</w:t>
       </w:r>
       <w:bookmarkEnd w:id="12"/>
-    </w:p>
-    <w:p>
-      <w:pPr>
-        <w:keepNext/>
-        <w:spacing w:after="160"/>
-      </w:pPr>
-      <w:r>
-        <w:t>Ziel: Sich einen Überblick verschaffen, ohne versehentl</w:t>
-      </w:r>
-      <w:r>
-        <w:t>ich etwas zu verändern.</w:t>
-      </w:r>
-    </w:p>
-    <w:p>
-      <w:pPr>
-        <w:spacing w:after="80"/>
-      </w:pPr>
-      <w:r>
-        <w:t>1.  admin.html öffnen.</w:t>
-      </w:r>
-    </w:p>
-    <w:p>
-      <w:pPr>
-        <w:spacing w:after="80"/>
-      </w:pPr>
-      <w:r>
-        <w:t>2.  Das Anzeige-Passwort eingeben und auf „Entsperren“ klicken.</w:t>
-      </w:r>
-    </w:p>
-    <w:p>
-      <w:pPr>
-        <w:spacing w:after="80"/>
-      </w:pPr>
-      <w:r>
-        <w:lastRenderedPageBreak/>
-        <w:t xml:space="preserve">3.  </w:t>
-      </w:r>
-      <w:r>
-        <w:t>Inhalte, Logo und Anmeldungen ansehen – alle Felder sind deaktiviert, es kann nichts versehentlich verändert werden.</w:t>
-      </w:r>
-    </w:p>
-    <w:p>
-      <w:pPr>
-        <w:spacing w:after="80"/>
-      </w:pPr>
-      <w:r>
-        <w:t>4.  Optional: Über „CSV herunterladen“ die aktuelle Anmeldungsliste sichern.</w:t>
-      </w:r>
-    </w:p>
-    <w:p>
-      <w:pPr>
-        <w:spacing w:after="160"/>
-      </w:pPr>
     </w:p>
     <w:p>
       <w:pPr>
@@ -5600,24 +6275,87 @@
         <w:keepLines/>
         <w:spacing w:before="240" w:after="120"/>
       </w:pPr>
-      <w:bookmarkStart w:id="13" w:name="_Toc240357598"/>
+      <w:bookmarkStart w:id="13" w:name="_Toc240368852"/>
       <w:r>
         <w:rPr>
           <w:b/>
           <w:bCs/>
           <w:color w:val="7E2F28"/>
         </w:rPr>
-        <w:t>10.2 Use Case: Inhaltstext ändern und verschachtelte Liste ei</w:t>
-      </w:r>
+        <w:t>11.1 Use Case: Nur Anmeldungen und Inhalte ansehen</w:t>
+      </w:r>
+      <w:bookmarkEnd w:id="13"/>
+    </w:p>
+    <w:p>
+      <w:pPr>
+        <w:keepNext/>
+        <w:spacing w:after="160"/>
+      </w:pPr>
+      <w:r>
+        <w:t>Ziel: Sich einen Überblick verschaffen, ohne versehentlich etwas zu verändern.</w:t>
+      </w:r>
+    </w:p>
+    <w:p>
+      <w:pPr>
+        <w:spacing w:after="80"/>
+      </w:pPr>
+      <w:r>
+        <w:t>1.  admin.html öffnen.</w:t>
+      </w:r>
+    </w:p>
+    <w:p>
+      <w:pPr>
+        <w:spacing w:after="80"/>
+      </w:pPr>
+      <w:r>
+        <w:t xml:space="preserve">2.  </w:t>
+      </w:r>
+      <w:r>
+        <w:t>Das Anzeige-Passwort eingeben und auf „Entsperren“ klicken.</w:t>
+      </w:r>
+    </w:p>
+    <w:p>
+      <w:pPr>
+        <w:spacing w:after="80"/>
+      </w:pPr>
+      <w:r>
+        <w:lastRenderedPageBreak/>
+        <w:t>3.  Inhalte, Logo und Anmeldungen ansehen – alle Felder sind deaktiviert, es kann nichts versehentlich verändert werden.</w:t>
+      </w:r>
+    </w:p>
+    <w:p>
+      <w:pPr>
+        <w:spacing w:after="80"/>
+      </w:pPr>
+      <w:r>
+        <w:t>4.  Optional: Über „CSV herunterladen“ die aktuelle Anmeldungsliste sichern</w:t>
+      </w:r>
+      <w:r>
+        <w:t>.</w:t>
+      </w:r>
+    </w:p>
+    <w:p>
+      <w:pPr>
+        <w:spacing w:after="160"/>
+      </w:pPr>
+    </w:p>
+    <w:p>
+      <w:pPr>
+        <w:pStyle w:val="berschrift2"/>
+        <w:keepNext/>
+        <w:keepLines/>
+        <w:spacing w:before="240" w:after="120"/>
+      </w:pPr>
+      <w:bookmarkStart w:id="14" w:name="_Toc240368853"/>
       <w:r>
         <w:rPr>
           <w:b/>
           <w:bCs/>
           <w:color w:val="7E2F28"/>
         </w:rPr>
-        <w:t>nrücken</w:t>
-      </w:r>
-      <w:bookmarkEnd w:id="13"/>
+        <w:t>11.2 Use Case: Inhaltstext ändern und verschachtelte Liste einrücken</w:t>
+      </w:r>
+      <w:bookmarkEnd w:id="14"/>
     </w:p>
     <w:p>
       <w:pPr>
@@ -5641,10 +6379,10 @@
         <w:spacing w:after="80"/>
       </w:pPr>
       <w:r>
-        <w:t>2.  Im gewünschten Info-Text-Feld den Text anpassen – dabei die Werkzeugleiste für Fet</w:t>
-      </w:r>
-      <w:r>
-        <w:t>t, Kursiv, Farbe, Listen usw. nutzen.</w:t>
+        <w:t>2.  Im gewünschten Inf</w:t>
+      </w:r>
+      <w:r>
+        <w:t>o-Text-Feld den Text anpassen – dabei die Werkzeugleiste für Fett, Kursiv, Farbe, Listen usw. nutzen.</w:t>
       </w:r>
     </w:p>
     <w:p>
@@ -5652,7 +6390,10 @@
         <w:spacing w:after="80"/>
       </w:pPr>
       <w:r>
-        <w:t>3.  Cursor in eine Zeile setzen, die unter einer Überschrift eingerückt werden soll (z. B. eine Uhrzeit unter einem Wochentag), und auf „Einrückung erhöhen“ klicken. Mehrfaches Klicken rückt weiter ein.</w:t>
+        <w:t>3.  Cursor in eine Zeile setzen, die unter einer Überschrift eingerückt werden soll (z. B. eine Uhrzeit unter einem Wochentag), und auf „Einrückung erhöhe</w:t>
+      </w:r>
+      <w:r>
+        <w:t>n“ klicken. Mehrfaches Klicken rückt weiter ein.</w:t>
       </w:r>
     </w:p>
     <w:p>
@@ -5660,10 +6401,7 @@
         <w:spacing w:after="80"/>
       </w:pPr>
       <w:r>
-        <w:t xml:space="preserve">4.  Ganz unten </w:t>
-      </w:r>
-      <w:r>
-        <w:t>im Formular auf „Speichern“ klicken.</w:t>
+        <w:t>4.  Ganz unten im Formular auf „Speichern“ klicken.</w:t>
       </w:r>
     </w:p>
     <w:p>
@@ -5671,7 +6409,10 @@
         <w:spacing w:after="80"/>
       </w:pPr>
       <w:r>
-        <w:t>5.  Die Bestätigung „Gespeichert – die Änderungen sind live“ abwarten. Die neue Formatierung erscheint direkt auf der öffentlichen Seite und bleibt auch bei künftigen Bearbeitungen erhalten.</w:t>
+        <w:t>5.  Die Bestätigung „Gespeichert – die Änderungen sind live“ abwarten. Die neue Formatierung erscheint direkt auf der öffentlichen Seite und bleibt auch be</w:t>
+      </w:r>
+      <w:r>
+        <w:t>i künftigen Bearbeitungen erhalten.</w:t>
       </w:r>
     </w:p>
     <w:p>
@@ -5686,24 +6427,83 @@
         <w:keepLines/>
         <w:spacing w:before="240" w:after="120"/>
       </w:pPr>
-      <w:bookmarkStart w:id="14" w:name="_Toc240357599"/>
+      <w:bookmarkStart w:id="15" w:name="_Toc240368854"/>
       <w:r>
         <w:rPr>
           <w:b/>
           <w:bCs/>
           <w:color w:val="7E2F28"/>
         </w:rPr>
-        <w:t>10.3 Use Case: Link oder Go</w:t>
-      </w:r>
+        <w:t>11.3 Use Case: Link oder Google-Maps-Adresse einfügen</w:t>
+      </w:r>
+      <w:bookmarkEnd w:id="15"/>
+    </w:p>
+    <w:p>
+      <w:pPr>
+        <w:keepNext/>
+        <w:spacing w:after="160"/>
+      </w:pPr>
+      <w:r>
+        <w:t>Ziel: Z. B. einen Anfahrtslink zu Google Maps im Zusatztext hinterlegen.</w:t>
+      </w:r>
+    </w:p>
+    <w:p>
+      <w:pPr>
+        <w:spacing w:after="80"/>
+      </w:pPr>
+      <w:r>
+        <w:t xml:space="preserve">1.  Im Bearbeiten-Modus zum gewünschten Textfeld scrollen (z. B. Zusatztext 2) und den Text </w:t>
+      </w:r>
+      <w:r>
+        <w:t>bzw. die Adresse eintippen.</w:t>
+      </w:r>
+    </w:p>
+    <w:p>
+      <w:pPr>
+        <w:spacing w:after="80"/>
+      </w:pPr>
+      <w:r>
+        <w:t>2.  Den Text markieren, der zum Link werden soll, und in der Werkzeugleiste auf das Kettensymbol klicken.</w:t>
+      </w:r>
+    </w:p>
+    <w:p>
+      <w:pPr>
+        <w:spacing w:after="80"/>
+      </w:pPr>
+      <w:r>
+        <w:t>3.  Die vollständige Adresse eintragen – https://… für einen normalen Link, mailto:… für einen Mail-Link – und bestätigen.</w:t>
+      </w:r>
+    </w:p>
+    <w:p>
+      <w:pPr>
+        <w:spacing w:after="80"/>
+      </w:pPr>
+      <w:r>
+        <w:t>4.  Auf „Speichern“ klicken. Der Link ist danach klickbar und öffnet sich in einem neuen Tab (bei mailto: im Mailprogramm).</w:t>
+      </w:r>
+    </w:p>
+    <w:p>
+      <w:pPr>
+        <w:spacing w:after="160"/>
+      </w:pPr>
+    </w:p>
+    <w:p>
+      <w:pPr>
+        <w:pStyle w:val="berschrift2"/>
+        <w:keepNext/>
+        <w:keepLines/>
+        <w:spacing w:before="240" w:after="120"/>
+      </w:pPr>
+      <w:bookmarkStart w:id="16" w:name="_Toc240368855"/>
       <w:r>
         <w:rPr>
           <w:b/>
           <w:bCs/>
           <w:color w:val="7E2F28"/>
         </w:rPr>
-        <w:t>ogle-Maps-Adresse einfügen</w:t>
-      </w:r>
-      <w:bookmarkEnd w:id="14"/>
+        <w:t>11.4 Use Case: Logo austauschen</w:t>
+      </w:r>
+      <w:bookmarkEnd w:id="16"/>
     </w:p>
     <w:p>
       <w:pPr>
@@ -5711,7 +6511,7 @@
         <w:spacing w:after="160"/>
       </w:pPr>
       <w:r>
-        <w:t>Ziel: Z. B. einen Anfahrtslink zu Google Maps im Zusatztext hinterlegen.</w:t>
+        <w:t>Ziel: Ein neues Bild als Logo, Favicon und Vorschaubild festlegen.</w:t>
       </w:r>
     </w:p>
     <w:p>
@@ -5719,7 +6519,10 @@
         <w:spacing w:after="80"/>
       </w:pPr>
       <w:r>
-        <w:t>1.  Im Bearbeiten-Modus zum gewünschten Textfeld scrollen (z. B. Zusatztext 2) und den Text bzw. die Adresse eintippen.</w:t>
+        <w:t>1.  Im Bearbeiten-Modus im Bere</w:t>
+      </w:r>
+      <w:r>
+        <w:t>ich „Logo / Icon“ auf „Datei auswählen“ klicken.</w:t>
       </w:r>
     </w:p>
     <w:p>
@@ -5727,10 +6530,7 @@
         <w:spacing w:after="80"/>
       </w:pPr>
       <w:r>
-        <w:t>2.  Den Text markieren, der zum Link</w:t>
-      </w:r>
-      <w:r>
-        <w:t xml:space="preserve"> werden soll, und in der Werkzeugleiste auf das Kettensymbol klicken.</w:t>
+        <w:t>2.  Eine PNG-Datei wählen (möglichst quadratisch, max. 2 MB). Die Vorschau aktualisiert sich sofort – dies ist aber noch nicht gespeichert.</w:t>
       </w:r>
     </w:p>
     <w:p>
@@ -5738,18 +6538,10 @@
         <w:spacing w:after="80"/>
       </w:pPr>
       <w:r>
-        <w:t>3.  Die vollständige Adresse eintragen – https://… für einen normalen Link, mailto:… für einen Mail-Link – und bestätigen.</w:t>
-      </w:r>
-    </w:p>
-    <w:p>
-      <w:pPr>
-        <w:spacing w:after="80"/>
-      </w:pPr>
-      <w:r>
-        <w:t>4.  Auf „Speichern“ klicken. Der Link ist danach klickbar und ö</w:t>
-      </w:r>
-      <w:r>
-        <w:t>ffnet sich in einem neuen Tab (bei mailto: im Mailprogramm).</w:t>
+        <w:t>3.  Auf „Logo hochladen“ klicken. Erst danach ist das neue Bild liv</w:t>
+      </w:r>
+      <w:r>
+        <w:t>e sichtbar – im Header, als Favicon und als Vorschaubild beim Teilen des Links.</w:t>
       </w:r>
     </w:p>
     <w:p>
@@ -5764,16 +6556,17 @@
         <w:keepLines/>
         <w:spacing w:before="240" w:after="120"/>
       </w:pPr>
-      <w:bookmarkStart w:id="15" w:name="_Toc240357600"/>
+      <w:bookmarkStart w:id="17" w:name="_Toc240368856"/>
       <w:r>
         <w:rPr>
           <w:b/>
           <w:bCs/>
           <w:color w:val="7E2F28"/>
         </w:rPr>
-        <w:t>10.4 Use Case: Logo austauschen</w:t>
-      </w:r>
-      <w:bookmarkEnd w:id="15"/>
+        <w:lastRenderedPageBreak/>
+        <w:t>11.5 Use Case: Anfahrtsplan austauschen</w:t>
+      </w:r>
+      <w:bookmarkEnd w:id="17"/>
     </w:p>
     <w:p>
       <w:pPr>
@@ -5781,7 +6574,7 @@
         <w:spacing w:after="160"/>
       </w:pPr>
       <w:r>
-        <w:t>Ziel: Ein neues Bild als Logo, Favicon und Vorschaubild festlegen.</w:t>
+        <w:t>Ziel: Ein neues Bild bei der Wegbeschreibung auf der Anmeldeseite hinterlegen.</w:t>
       </w:r>
     </w:p>
     <w:p>
@@ -5789,7 +6582,7 @@
         <w:spacing w:after="80"/>
       </w:pPr>
       <w:r>
-        <w:t>1.  Im Bearbeiten-Modus im Bereich „Logo / Icon“ auf „Datei auswählen“ klicken.</w:t>
+        <w:t>1.  Im Bearbeiten-Modus im Bereich „Anfahrtsplan (Bild)“ (nach den Zusatztexten) auf „Datei auswählen“ klicken.</w:t>
       </w:r>
     </w:p>
     <w:p>
@@ -5797,10 +6590,10 @@
         <w:spacing w:after="80"/>
       </w:pPr>
       <w:r>
-        <w:t>2.  Eine PNG-Da</w:t>
-      </w:r>
-      <w:r>
-        <w:t>tei wählen (möglichst quadratisch, max. 2 MB). Die Vorschau aktualisiert sich sofort – dies ist aber noch nicht gespeichert.</w:t>
+        <w:t xml:space="preserve">2.  Eine PNG-Datei wählen (max. 2 MB). Die Vorschau aktualisiert </w:t>
+      </w:r>
+      <w:r>
+        <w:t>sich sofort – dies ist aber noch nicht gespeichert.</w:t>
       </w:r>
     </w:p>
     <w:p>
@@ -5808,10 +6601,7 @@
         <w:spacing w:after="80"/>
       </w:pPr>
       <w:r>
-        <w:t>3.  Auf „Logo hochladen“ klicken. Erst danach ist das neue Bild live sichtbar – im Header, als Favicon und als Vorschaubild beim Te</w:t>
-      </w:r>
-      <w:r>
-        <w:t>ilen des Links.</w:t>
+        <w:t>3.  Auf „Anfahrtsplan hochladen“ klicken. Erst danach ist das neue Bild live auf der Anmeldeseite sichtbar.</w:t>
       </w:r>
     </w:p>
     <w:p>
@@ -5826,16 +6616,16 @@
         <w:keepLines/>
         <w:spacing w:before="240" w:after="120"/>
       </w:pPr>
-      <w:bookmarkStart w:id="16" w:name="_Toc240357601"/>
+      <w:bookmarkStart w:id="18" w:name="_Toc240368857"/>
       <w:r>
         <w:rPr>
           <w:b/>
           <w:bCs/>
           <w:color w:val="7E2F28"/>
         </w:rPr>
-        <w:t>10.5 Use Case: Neue Option (Programmpunkt) hinzufügen</w:t>
-      </w:r>
-      <w:bookmarkEnd w:id="16"/>
+        <w:t>11.6 Use Case: Neue Option (Programmpunkt) hinzufügen</w:t>
+      </w:r>
+      <w:bookmarkEnd w:id="18"/>
     </w:p>
     <w:p>
       <w:pPr>
@@ -5843,7 +6633,10 @@
         <w:spacing w:after="160"/>
       </w:pPr>
       <w:r>
-        <w:t>Ziel: Einen zusätzlichen buchbaren Programmpunkt mit Preis anlegen.</w:t>
+        <w:t>Ziel: Einen zusätzlichen buchbaren Progra</w:t>
+      </w:r>
+      <w:r>
+        <w:t>mmpunkt mit Preis anlegen.</w:t>
       </w:r>
     </w:p>
     <w:p>
@@ -5851,10 +6644,7 @@
         <w:spacing w:after="80"/>
       </w:pPr>
       <w:r>
-        <w:t xml:space="preserve">1.  </w:t>
-      </w:r>
-      <w:r>
-        <w:t>Im Bearbeiten-Modus zum Bereich „Optionen“ scrollen und auf „+ Option hinzufügen“ klicken.</w:t>
+        <w:t>1.  Im Bearbeiten-Modus zum Bereich „Optionen“ scrollen und auf „+ Option hinzufügen“ klicken.</w:t>
       </w:r>
     </w:p>
     <w:p>
@@ -5862,7 +6652,6 @@
         <w:spacing w:after="80"/>
       </w:pPr>
       <w:r>
-        <w:lastRenderedPageBreak/>
         <w:t>2.  In der neuen, leeren Zeile Bezeichnung und Preis eintragen.</w:t>
       </w:r>
     </w:p>
@@ -5871,7 +6660,10 @@
         <w:spacing w:after="80"/>
       </w:pPr>
       <w:r>
-        <w:t>3.  Auf „Speichern“ klicken. Die neue Option erscheint danach auf der Anmeldeseite zur Auswahl.</w:t>
+        <w:t xml:space="preserve">3.  Auf „Speichern“ klicken. Die neue Option erscheint danach auf der </w:t>
+      </w:r>
+      <w:r>
+        <w:t>Anmeldeseite zur Auswahl.</w:t>
       </w:r>
     </w:p>
     <w:p>
@@ -5886,24 +6678,75 @@
         <w:keepLines/>
         <w:spacing w:before="240" w:after="120"/>
       </w:pPr>
-      <w:bookmarkStart w:id="17" w:name="_Toc240357602"/>
+      <w:bookmarkStart w:id="19" w:name="_Toc240368858"/>
       <w:r>
         <w:rPr>
           <w:b/>
           <w:bCs/>
           <w:color w:val="7E2F28"/>
         </w:rPr>
-        <w:t>10.6</w:t>
-      </w:r>
+        <w:t>11.7 Use Case: Impressum oder Datenschutz aktualisieren</w:t>
+      </w:r>
+      <w:bookmarkEnd w:id="19"/>
+    </w:p>
+    <w:p>
+      <w:pPr>
+        <w:keepNext/>
+        <w:spacing w:after="160"/>
+      </w:pPr>
+      <w:r>
+        <w:t>Ziel: Den anfänglichen Platzhaltertext durch die echten rechtlichen Angaben ersetzen.</w:t>
+      </w:r>
+    </w:p>
+    <w:p>
+      <w:pPr>
+        <w:spacing w:after="80"/>
+      </w:pPr>
+      <w:r>
+        <w:t>1.  Im Bearbeiten-Modus zum Bereich „Rechtliches“ scrollen.</w:t>
+      </w:r>
+    </w:p>
+    <w:p>
+      <w:pPr>
+        <w:spacing w:after="80"/>
+      </w:pPr>
+      <w:r>
+        <w:t>2.  Im Impressum- bzw. Date</w:t>
+      </w:r>
+      <w:r>
+        <w:t>nschutz-Editor den kompletten Platzhaltertext markieren und durch den echten Text ersetzen.</w:t>
+      </w:r>
+    </w:p>
+    <w:p>
+      <w:pPr>
+        <w:spacing w:after="80"/>
+      </w:pPr>
+      <w:r>
+        <w:t>3.  Auf „Speichern“ klicken. Die Änderungen erscheinen sofort auf impressum.html bzw. datenschutz.html.</w:t>
+      </w:r>
+    </w:p>
+    <w:p>
+      <w:pPr>
+        <w:spacing w:after="160"/>
+      </w:pPr>
+    </w:p>
+    <w:p>
+      <w:pPr>
+        <w:pStyle w:val="berschrift2"/>
+        <w:keepNext/>
+        <w:keepLines/>
+        <w:spacing w:before="240" w:after="120"/>
+      </w:pPr>
+      <w:bookmarkStart w:id="20" w:name="_Toc240368859"/>
       <w:r>
         <w:rPr>
           <w:b/>
           <w:bCs/>
           <w:color w:val="7E2F28"/>
         </w:rPr>
-        <w:t xml:space="preserve"> Use Case: Impressum oder Datenschutz aktualisieren</w:t>
-      </w:r>
-      <w:bookmarkEnd w:id="17"/>
+        <w:t>11.8 Use Case: Passwörter ändern</w:t>
+      </w:r>
+      <w:bookmarkEnd w:id="20"/>
     </w:p>
     <w:p>
       <w:pPr>
@@ -5911,7 +6754,10 @@
         <w:spacing w:after="160"/>
       </w:pPr>
       <w:r>
-        <w:t>Ziel: Den anfänglichen Platzhaltertext durch die echten rechtlichen Angaben ersetzen.</w:t>
+        <w:t>Ziel: Aus Sicherheitsgründ</w:t>
+      </w:r>
+      <w:r>
+        <w:t>en regelmäßig neue Passwörter vergeben.</w:t>
       </w:r>
     </w:p>
     <w:p>
@@ -5919,7 +6765,7 @@
         <w:spacing w:after="80"/>
       </w:pPr>
       <w:r>
-        <w:t>1.  Im Bearbeiten-Modus zum Bereich „Rechtliches“ scrollen.</w:t>
+        <w:t>1.  Im Bearbeiten-Modus zum Bereich „Passwörter ändern“ scrollen.</w:t>
       </w:r>
     </w:p>
     <w:p>
@@ -5927,10 +6773,7 @@
         <w:spacing w:after="80"/>
       </w:pPr>
       <w:r>
-        <w:t>2.  Im Impressum- bzw. Datenschutz-Editor den kompletten P</w:t>
-      </w:r>
-      <w:r>
-        <w:t>latzhaltertext markieren und durch den echten Text ersetzen.</w:t>
+        <w:t>2.  Nur das gewünschte neue Passwort eintragen (Anzeige-, Bearbeiten- oder beide) – nicht benötigte Felder leer lassen.</w:t>
       </w:r>
     </w:p>
     <w:p>
@@ -5938,7 +6781,10 @@
         <w:spacing w:after="80"/>
       </w:pPr>
       <w:r>
-        <w:t>3.  Auf „Speichern“ klicken. Die Änderungen erscheinen sofort auf impressum.html bzw. datenschutz.html.</w:t>
+        <w:t>3.  Auf „Passwörter speichern“</w:t>
+      </w:r>
+      <w:r>
+        <w:t xml:space="preserve"> klicken und die Bestätigung abwarten. Neue Passwörter an einem sicheren Ort notieren, bevor der Admin-Bereich verlassen wird.</w:t>
       </w:r>
     </w:p>
     <w:p>
@@ -5953,16 +6799,16 @@
         <w:keepLines/>
         <w:spacing w:before="240" w:after="120"/>
       </w:pPr>
-      <w:bookmarkStart w:id="18" w:name="_Toc240357603"/>
+      <w:bookmarkStart w:id="21" w:name="_Toc240368860"/>
       <w:r>
         <w:rPr>
           <w:b/>
           <w:bCs/>
           <w:color w:val="7E2F28"/>
         </w:rPr>
-        <w:t>10.7 Use Case: Passwörter ändern</w:t>
-      </w:r>
-      <w:bookmarkEnd w:id="18"/>
+        <w:t>11.9 Use Case: Eine Anmeldung bearbeiten oder löschen</w:t>
+      </w:r>
+      <w:bookmarkEnd w:id="21"/>
     </w:p>
     <w:p>
       <w:pPr>
@@ -5970,10 +6816,10 @@
         <w:spacing w:after="160"/>
       </w:pPr>
       <w:r>
-        <w:t>Ziel: Aus Sicherheitsgründen regelmäßig neue Passwörter v</w:t>
-      </w:r>
-      <w:r>
-        <w:t>ergeben.</w:t>
+        <w:t xml:space="preserve">Ziel: Z. B. eine Anmeldung von der Warteliste auf „Bestätigt“ setzen oder </w:t>
+      </w:r>
+      <w:r>
+        <w:t>eine fehlerhafte Anmeldung entfernen.</w:t>
       </w:r>
     </w:p>
     <w:p>
@@ -5981,7 +6827,7 @@
         <w:spacing w:after="80"/>
       </w:pPr>
       <w:r>
-        <w:t>1.  Im Bearbeiten-Modus zum Bereich „Passwörter ändern“ scrollen.</w:t>
+        <w:t>1.  Im Bearbeiten-Modus zum Bereich „Anmeldungen“ scrollen und die passende Zeile suchen.</w:t>
       </w:r>
     </w:p>
     <w:p>
@@ -5989,7 +6835,10 @@
         <w:spacing w:after="80"/>
       </w:pPr>
       <w:r>
-        <w:t>2.  Nur das gewünschte neue Passwort eintragen (Anzeige-, Bearbeiten- oder beide) – nicht benötigte Felder leer lassen.</w:t>
+        <w:t>2.  Zum Ändern: Status, Name, E-Mail, Besucherzahl, Optionen oder Gesamtpreis direkt in der Zeile anpassen und in dieser Zeile a</w:t>
+      </w:r>
+      <w:r>
+        <w:t>uf „Speichern“ klicken.</w:t>
       </w:r>
     </w:p>
     <w:p>
@@ -5997,91 +6846,30 @@
         <w:spacing w:after="80"/>
       </w:pPr>
       <w:r>
-        <w:t>3.  Auf „Passwörter speichern“ klicken und die Bestätigung ab</w:t>
-      </w:r>
-      <w:r>
-        <w:t>warten. Neue Passwörter an einem sicheren Ort notieren, bevor der Admin-Bereich verlassen wird.</w:t>
-      </w:r>
-    </w:p>
-    <w:p>
-      <w:pPr>
-        <w:spacing w:after="160"/>
-      </w:pPr>
-    </w:p>
-    <w:p>
-      <w:pPr>
-        <w:pStyle w:val="berschrift2"/>
+        <w:lastRenderedPageBreak/>
+        <w:t xml:space="preserve">3.  </w:t>
+      </w:r>
+      <w:r>
+        <w:t>Zum Löschen: In derselben Zeile auf „Löschen“ klicken und die Sicherheitsabfrage bestätigen. Dieser Schritt kann nicht rückgängig gemacht werden.</w:t>
+      </w:r>
+    </w:p>
+    <w:p>
+      <w:pPr>
+        <w:pStyle w:val="berschrift1"/>
         <w:keepNext/>
         <w:keepLines/>
-        <w:spacing w:before="240" w:after="120"/>
-      </w:pPr>
-      <w:bookmarkStart w:id="19" w:name="_Toc240357604"/>
+        <w:spacing w:before="300" w:after="150"/>
+      </w:pPr>
+      <w:bookmarkStart w:id="22" w:name="_Toc240368861"/>
       <w:r>
         <w:rPr>
           <w:b/>
           <w:bCs/>
           <w:color w:val="7E2F28"/>
         </w:rPr>
-        <w:t>10.8 Use Case: Eine Anmeldung bearbeiten oder löschen</w:t>
-      </w:r>
-      <w:bookmarkEnd w:id="19"/>
-    </w:p>
-    <w:p>
-      <w:pPr>
-        <w:keepNext/>
-        <w:spacing w:after="160"/>
-      </w:pPr>
-      <w:r>
-        <w:t>Ziel: Z. B. eine Anmeldung von der Warteliste auf „Bestätigt“ setzen oder eine fehlerhafte Anmeldung entf</w:t>
-      </w:r>
-      <w:r>
-        <w:t>ernen.</w:t>
-      </w:r>
-    </w:p>
-    <w:p>
-      <w:pPr>
-        <w:spacing w:after="80"/>
-      </w:pPr>
-      <w:r>
-        <w:t>1.  Im Bearbeiten-Modus zum Bereich „Anmeldungen“ scrollen und die passende Zeile suchen.</w:t>
-      </w:r>
-    </w:p>
-    <w:p>
-      <w:pPr>
-        <w:spacing w:after="80"/>
-      </w:pPr>
-      <w:r>
-        <w:t>2.  Zum Ändern: Status, Name, E-Mail, Besucherzahl, Optionen oder Gesamtpreis direkt in der Zeile anpassen und in dieser Zeile auf „Speichern“ klicken.</w:t>
-      </w:r>
-    </w:p>
-    <w:p>
-      <w:pPr>
-        <w:spacing w:after="80"/>
-      </w:pPr>
-      <w:r>
-        <w:t>3.  Zum</w:t>
-      </w:r>
-      <w:r>
-        <w:t xml:space="preserve"> Löschen: In derselben Zeile auf „Löschen“ klicken und die Sicherheitsabfrage bestätigen. Dieser Schritt kann nicht rückgängig gemacht werden.</w:t>
-      </w:r>
-    </w:p>
-    <w:p>
-      <w:pPr>
-        <w:pStyle w:val="berschrift1"/>
-        <w:keepNext/>
-        <w:keepLines/>
-        <w:spacing w:before="300" w:after="150"/>
-      </w:pPr>
-      <w:bookmarkStart w:id="20" w:name="_Toc240357605"/>
-      <w:r>
-        <w:rPr>
-          <w:b/>
-          <w:bCs/>
-          <w:color w:val="7E2F28"/>
-        </w:rPr>
-        <w:t>11. Kurz zusammengefasst</w:t>
-      </w:r>
-      <w:bookmarkEnd w:id="20"/>
+        <w:t>12. Kurz zusammengefasst</w:t>
+      </w:r>
+      <w:bookmarkEnd w:id="22"/>
     </w:p>
     <w:p>
       <w:pPr>
@@ -6107,10 +6895,17 @@
           <w:b/>
           <w:bCs/>
         </w:rPr>
-        <w:t xml:space="preserve">•  Ändern und Speichern: </w:t>
-      </w:r>
-      <w:r>
-        <w:t>Bearbeiten-Passwort verwenden – Inhalte, Logo, Optionen, Zusatztexte, Rechtliches und Anmeldungen lassen sich bearbeiten; jede Änderung muss über den jeweiligen „Speichern“-Button bestätigt werden.</w:t>
+        <w:t>•  Ä</w:t>
+      </w:r>
+      <w:r>
+        <w:rPr>
+          <w:b/>
+          <w:bCs/>
+        </w:rPr>
+        <w:t xml:space="preserve">ndern und Speichern: </w:t>
+      </w:r>
+      <w:r>
+        <w:t>Bearbeiten-Passwort verwenden – Inhalte, Logo, Anfahrtsplan, Optionen, Zusatztexte, Rechtliches und Anmeldungen lassen sich bearbeiten; jede Änderung muss über den jeweiligen „Speichern“-Button bestätigt werden.</w:t>
       </w:r>
     </w:p>
     <w:p>
@@ -6125,10 +6920,10 @@
         <w:t xml:space="preserve">•  Formatierung: </w:t>
       </w:r>
       <w:r>
-        <w:t>Fett, Kursiv, Fa</w:t>
-      </w:r>
-      <w:r>
-        <w:t>rbe, Listen, Einrückung und Links stehen in allen Rich-Text-Feldern zur Verfügung; die Einrückung übersteht dank fester Formatierung beliebig viele weitere Bearbeitungen.</w:t>
+        <w:t xml:space="preserve">Fett, </w:t>
+      </w:r>
+      <w:r>
+        <w:t>Kursiv, Farbe, Listen, Einrückung und Links stehen in allen Rich-Text-Feldern zur Verfügung; die Einrückung übersteht dank fester Formatierung beliebig viele weitere Bearbeitungen.</w:t>
       </w:r>
     </w:p>
     <w:p>
@@ -6143,7 +6938,10 @@
         <w:t xml:space="preserve">•  Sicherheit: </w:t>
       </w:r>
       <w:r>
-        <w:t>Rich-Text-Inhalte werden beim Speichern serverseitig auf erlaubte Formatierungen geprüft (nur https:// und mailto:-Links); zum Ändern der Passwörter ist stets das aktuelle Bearbeiten-Passwort nötig.</w:t>
+        <w:t>Rich-Text-Inhalte werden beim Speichern serverseitig auf erl</w:t>
+      </w:r>
+      <w:r>
+        <w:t>aubte Formatierungen geprüft (nur https:// und mailto:-Links); zum Ändern der Passwörter ist stets das aktuelle Bearbeiten-Passwort nötig.</w:t>
       </w:r>
     </w:p>
     <w:sectPr>
@@ -6159,10 +6957,10 @@
 <file path=word/numbering.xml><?xml version="1.0" encoding="utf-8"?>
 <w:numbering xmlns:wpc="http://schemas.microsoft.com/office/word/2010/wordprocessingCanvas" xmlns:cx="http://schemas.microsoft.com/office/drawing/2014/chartex" xmlns:cx1="http://schemas.microsoft.com/office/drawing/2015/9/8/chartex" xmlns:cx2="http://schemas.microsoft.com/office/drawing/2015/10/21/chartex" xmlns:cx3="http://schemas.microsoft.com/office/drawing/2016/5/9/chartex" xmlns:cx4="http://schemas.microsoft.com/office/drawing/2016/5/10/chartex" xmlns:cx5="http://schemas.microsoft.com/office/drawing/2016/5/11/chartex" xmlns:cx6="http://schemas.microsoft.com/office/drawing/2016/5/12/chartex" xmlns:cx7="http://schemas.microsoft.com/office/drawing/2016/5/13/chartex" xmlns:cx8="http://schemas.microsoft.com/office/drawing/2016/5/14/chartex" xmlns:mc="http://schemas.openxmlformats.org/markup-compatibility/2006" xmlns:aink="http://schemas.microsoft.com/office/drawing/2016/ink" xmlns:am3d="http://schemas.microsoft.com/office/drawing/2017/model3d" xmlns:o="urn:schemas-microsoft-com:office:office" xmlns:r="http://schemas.openxmlformats.org/officeDocument/2006/relationships" xmlns:m="http://schemas.openxmlformats.org/officeDocument/2006/math" xmlns:v="urn:schemas-microsoft-com:vml" xmlns:wp14="http://schemas.microsoft.com/office/word/2010/wordprocessingDrawing" xmlns:wp="http://schemas.openxmlformats.org/drawingml/2006/wordprocessingDrawing" xmlns:w10="urn:schemas-microsoft-com:office:word" xmlns:w="http://schemas.openxmlformats.org/wordprocessingml/2006/main" xmlns:w14="http://schemas.microsoft.com/office/word/2010/wordml" xmlns:w15="http://schemas.microsoft.com/office/word/2012/wordml" xmlns:w16cex="http://schemas.microsoft.com/office/word/2018/wordml/cex" xmlns:w16cid="http://schemas.microsoft.com/office/word/2016/wordml/cid" xmlns:w16="http://schemas.microsoft.com/office/word/2018/wordml" xmlns:w16sdtdh="http://schemas.microsoft.com/office/word/2020/wordml/sdtdatahash" xmlns:w16se="http://schemas.microsoft.com/office/word/2015/wordml/symex" xmlns:wpg="http://schemas.microsoft.com/office/word/2010/wordprocessingGroup" xmlns:wpi="http://schemas.microsoft.com/office/word/2010/wordprocessingInk" xmlns:wne="http://schemas.microsoft.com/office/word/2006/wordml" xmlns:wps="http://schemas.microsoft.com/office/word/2010/wordprocessingShape" mc:Ignorable="w14 w15 w16se w16cid w16 w16cex w16sdtdh wp14">
   <w:abstractNum w:abstractNumId="0" w15:restartNumberingAfterBreak="0">
-    <w:nsid w:val="78983D89"/>
+    <w:nsid w:val="1FE00AC1"/>
     <w:multiLevelType w:val="hybridMultilevel"/>
-    <w:tmpl w:val="CC9AB53E"/>
-    <w:lvl w:ilvl="0" w:tplc="92DEBDF4">
+    <w:tmpl w:val="8448281C"/>
+    <w:lvl w:ilvl="0" w:tplc="07DA9E46">
       <w:start w:val="1"/>
       <w:numFmt w:val="bullet"/>
       <w:lvlText w:val="●"/>
@@ -6171,7 +6969,7 @@
         <w:ind w:left="720" w:hanging="360"/>
       </w:pPr>
     </w:lvl>
-    <w:lvl w:ilvl="1" w:tplc="CBDAE77C">
+    <w:lvl w:ilvl="1" w:tplc="6AD2975A">
       <w:start w:val="1"/>
       <w:numFmt w:val="bullet"/>
       <w:lvlText w:val="○"/>
@@ -6180,7 +6978,7 @@
         <w:ind w:left="1440" w:hanging="360"/>
       </w:pPr>
     </w:lvl>
-    <w:lvl w:ilvl="2" w:tplc="3E70DD34">
+    <w:lvl w:ilvl="2" w:tplc="C2C21188">
       <w:start w:val="1"/>
       <w:numFmt w:val="bullet"/>
       <w:lvlText w:val="■"/>
@@ -6189,7 +6987,7 @@
         <w:ind w:left="2160" w:hanging="360"/>
       </w:pPr>
     </w:lvl>
-    <w:lvl w:ilvl="3" w:tplc="C77C7244">
+    <w:lvl w:ilvl="3" w:tplc="E638842E">
       <w:start w:val="1"/>
       <w:numFmt w:val="bullet"/>
       <w:lvlText w:val="●"/>
@@ -6198,7 +6996,7 @@
         <w:ind w:left="2880" w:hanging="360"/>
       </w:pPr>
     </w:lvl>
-    <w:lvl w:ilvl="4" w:tplc="1DC8EB2E">
+    <w:lvl w:ilvl="4" w:tplc="48B0F1C0">
       <w:start w:val="1"/>
       <w:numFmt w:val="bullet"/>
       <w:lvlText w:val="○"/>
@@ -6207,7 +7005,7 @@
         <w:ind w:left="3600" w:hanging="360"/>
       </w:pPr>
     </w:lvl>
-    <w:lvl w:ilvl="5" w:tplc="07ACBB04">
+    <w:lvl w:ilvl="5" w:tplc="111EF9BC">
       <w:start w:val="1"/>
       <w:numFmt w:val="bullet"/>
       <w:lvlText w:val="■"/>
@@ -6216,7 +7014,7 @@
         <w:ind w:left="4320" w:hanging="360"/>
       </w:pPr>
     </w:lvl>
-    <w:lvl w:ilvl="6" w:tplc="1B38A6E6">
+    <w:lvl w:ilvl="6" w:tplc="4BEADFB4">
       <w:start w:val="1"/>
       <w:numFmt w:val="bullet"/>
       <w:lvlText w:val="●"/>
@@ -6225,7 +7023,7 @@
         <w:ind w:left="5040" w:hanging="360"/>
       </w:pPr>
     </w:lvl>
-    <w:lvl w:ilvl="7" w:tplc="614C1B8A">
+    <w:lvl w:ilvl="7" w:tplc="A3E4D8F2">
       <w:start w:val="1"/>
       <w:numFmt w:val="bullet"/>
       <w:lvlText w:val="●"/>
@@ -6234,7 +7032,7 @@
         <w:ind w:left="5760" w:hanging="360"/>
       </w:pPr>
     </w:lvl>
-    <w:lvl w:ilvl="8" w:tplc="EC0889FE">
+    <w:lvl w:ilvl="8" w:tplc="618A8A68">
       <w:start w:val="1"/>
       <w:numFmt w:val="bullet"/>
       <w:lvlText w:val="●"/>
@@ -6857,7 +7655,7 @@
     <w:autoRedefine/>
     <w:uiPriority w:val="39"/>
     <w:unhideWhenUsed/>
-    <w:rsid w:val="00D71D55"/>
+    <w:rsid w:val="00273912"/>
     <w:pPr>
       <w:spacing w:after="100"/>
     </w:pPr>
@@ -6869,7 +7667,7 @@
     <w:autoRedefine/>
     <w:uiPriority w:val="39"/>
     <w:unhideWhenUsed/>
-    <w:rsid w:val="00D71D55"/>
+    <w:rsid w:val="00273912"/>
     <w:pPr>
       <w:spacing w:after="100"/>
       <w:ind w:left="220"/>

</xml_diff>